<commit_message>
Aula Pratica 04 Linguagem M
</commit_message>
<xml_diff>
--- a/Para saber mais.docx
+++ b/Para saber mais.docx
@@ -298,6 +298,9 @@
     </w:p>
     <w:p>
       <w:r>
+        <w:rPr>
+          <w:noProof/>
+        </w:rPr>
         <w:drawing>
           <wp:inline distT="0" distB="0" distL="0" distR="0" wp14:anchorId="7948EC5E" wp14:editId="32703C4A">
             <wp:extent cx="5400040" cy="4486275"/>
@@ -367,6 +370,9 @@
     </w:p>
     <w:p>
       <w:r>
+        <w:rPr>
+          <w:noProof/>
+        </w:rPr>
         <w:drawing>
           <wp:inline distT="0" distB="0" distL="0" distR="0" wp14:anchorId="7DA0B86C" wp14:editId="157C7F22">
             <wp:extent cx="5400040" cy="2757170"/>
@@ -487,6 +493,9 @@
     </w:p>
     <w:p>
       <w:r>
+        <w:rPr>
+          <w:noProof/>
+        </w:rPr>
         <w:drawing>
           <wp:inline distT="0" distB="0" distL="0" distR="0" wp14:anchorId="19D00531" wp14:editId="02CFEFAC">
             <wp:extent cx="5400040" cy="1053465"/>
@@ -564,6 +573,9 @@
     </w:p>
     <w:p>
       <w:r>
+        <w:rPr>
+          <w:noProof/>
+        </w:rPr>
         <w:lastRenderedPageBreak/>
         <w:drawing>
           <wp:inline distT="0" distB="0" distL="0" distR="0" wp14:anchorId="5C63E950" wp14:editId="34B5659C">
@@ -632,6 +644,9 @@
     </w:p>
     <w:p>
       <w:r>
+        <w:rPr>
+          <w:noProof/>
+        </w:rPr>
         <w:drawing>
           <wp:inline distT="0" distB="0" distL="0" distR="0" wp14:anchorId="7FFA8AF5" wp14:editId="3EEED544">
             <wp:extent cx="4777740" cy="1409700"/>
@@ -776,6 +791,9 @@
     </w:p>
     <w:p>
       <w:r>
+        <w:rPr>
+          <w:noProof/>
+        </w:rPr>
         <w:lastRenderedPageBreak/>
         <w:drawing>
           <wp:inline distT="0" distB="0" distL="0" distR="0" wp14:anchorId="49B1E498" wp14:editId="73CF1F2A">
@@ -854,6 +872,9 @@
     </w:p>
     <w:p>
       <w:r>
+        <w:rPr>
+          <w:noProof/>
+        </w:rPr>
         <w:drawing>
           <wp:inline distT="0" distB="0" distL="0" distR="0" wp14:anchorId="489B8458" wp14:editId="36C2853F">
             <wp:extent cx="5400040" cy="1076325"/>
@@ -906,6 +927,9 @@
     </w:p>
     <w:p>
       <w:r>
+        <w:rPr>
+          <w:noProof/>
+        </w:rPr>
         <w:lastRenderedPageBreak/>
         <w:drawing>
           <wp:inline distT="0" distB="0" distL="0" distR="0" wp14:anchorId="1130F7BE" wp14:editId="5735EB86">
@@ -974,6 +998,9 @@
     </w:p>
     <w:p>
       <w:r>
+        <w:rPr>
+          <w:noProof/>
+        </w:rPr>
         <w:drawing>
           <wp:inline distT="0" distB="0" distL="0" distR="0" wp14:anchorId="1E9CEA59" wp14:editId="1C729370">
             <wp:extent cx="2316480" cy="2179320"/>
@@ -1051,6 +1078,9 @@
     </w:p>
     <w:p>
       <w:r>
+        <w:rPr>
+          <w:noProof/>
+        </w:rPr>
         <w:drawing>
           <wp:inline distT="0" distB="0" distL="0" distR="0" wp14:anchorId="04D72643" wp14:editId="2FBFD873">
             <wp:extent cx="5400040" cy="428625"/>
@@ -1103,6 +1133,9 @@
     </w:p>
     <w:p>
       <w:r>
+        <w:rPr>
+          <w:noProof/>
+        </w:rPr>
         <w:drawing>
           <wp:inline distT="0" distB="0" distL="0" distR="0" wp14:anchorId="4CE38838" wp14:editId="216837B9">
             <wp:extent cx="5400040" cy="563245"/>
@@ -1196,6 +1229,9 @@
     </w:p>
     <w:p>
       <w:r>
+        <w:rPr>
+          <w:noProof/>
+        </w:rPr>
         <w:drawing>
           <wp:inline distT="0" distB="0" distL="0" distR="0" wp14:anchorId="4FEDA8CE" wp14:editId="42F3C6ED">
             <wp:extent cx="4876800" cy="3848100"/>
@@ -1263,6 +1299,9 @@
     </w:p>
     <w:p>
       <w:r>
+        <w:rPr>
+          <w:noProof/>
+        </w:rPr>
         <w:lastRenderedPageBreak/>
         <w:drawing>
           <wp:inline distT="0" distB="0" distL="0" distR="0" wp14:anchorId="6B71C638" wp14:editId="10BCCE0D">
@@ -1384,6 +1423,9 @@
     </w:p>
     <w:p>
       <w:r>
+        <w:rPr>
+          <w:noProof/>
+        </w:rPr>
         <w:lastRenderedPageBreak/>
         <w:drawing>
           <wp:inline distT="0" distB="0" distL="0" distR="0" wp14:anchorId="06CE34F4" wp14:editId="17A7CD94">
@@ -1452,6 +1494,9 @@
     </w:p>
     <w:p>
       <w:r>
+        <w:rPr>
+          <w:noProof/>
+        </w:rPr>
         <w:drawing>
           <wp:inline distT="0" distB="0" distL="0" distR="0" wp14:anchorId="2FD2299E" wp14:editId="1BB3260A">
             <wp:extent cx="4236720" cy="1973580"/>
@@ -1943,7 +1988,15 @@
     </w:p>
     <w:p>
       <w:r>
-        <w:t>Na Linguagem M, um valor de tipo é um valor que classifica outros valores. Quando passamos um tipo a uma espécie de valor, ele obedece as estruturas deste tipo.</w:t>
+        <w:t xml:space="preserve">Na Linguagem M, um valor de tipo é um valor que classifica outros valores. Quando passamos um tipo a uma espécie de valor, ele </w:t>
+      </w:r>
+      <w:proofErr w:type="gramStart"/>
+      <w:r>
+        <w:t>obedece as</w:t>
+      </w:r>
+      <w:proofErr w:type="gramEnd"/>
+      <w:r>
+        <w:t xml:space="preserve"> estruturas deste tipo.</w:t>
       </w:r>
     </w:p>
     <w:p>
@@ -2602,27 +2655,16 @@
       </w:r>
     </w:p>
     <w:p>
-      <w:pPr>
-        <w:rPr>
-          <w:lang w:val="en-US"/>
-        </w:rPr>
-      </w:pPr>
       <w:r>
         <w:lastRenderedPageBreak/>
         <w:t xml:space="preserve">    </w:t>
       </w:r>
       <w:r>
-        <w:rPr>
-          <w:lang w:val="en-US"/>
-        </w:rPr>
         <w:t>Email = {"david@email.com", "maria@email.com", "beatriz@email.com"},</w:t>
       </w:r>
     </w:p>
     <w:p>
       <w:r>
-        <w:rPr>
-          <w:lang w:val="en-US"/>
-        </w:rPr>
         <w:t xml:space="preserve">    </w:t>
       </w:r>
       <w:r>
@@ -2877,6 +2919,9 @@
     </w:p>
     <w:p>
       <w:r>
+        <w:rPr>
+          <w:noProof/>
+        </w:rPr>
         <w:lastRenderedPageBreak/>
         <w:drawing>
           <wp:inline distT="0" distB="0" distL="0" distR="0" wp14:anchorId="605FA921" wp14:editId="1D970367">
@@ -4280,6 +4325,9 @@
     </w:p>
     <w:p>
       <w:r>
+        <w:rPr>
+          <w:noProof/>
+        </w:rPr>
         <w:drawing>
           <wp:inline distT="0" distB="0" distL="0" distR="0" wp14:anchorId="0B5BF020" wp14:editId="348084B4">
             <wp:extent cx="5400040" cy="1765935"/>
@@ -4343,6 +4391,9 @@
     </w:p>
     <w:p>
       <w:r>
+        <w:rPr>
+          <w:noProof/>
+        </w:rPr>
         <w:drawing>
           <wp:inline distT="0" distB="0" distL="0" distR="0" wp14:anchorId="6117B6E4" wp14:editId="7F92874E">
             <wp:extent cx="5400040" cy="1844675"/>
@@ -4406,6 +4457,9 @@
     </w:p>
     <w:p>
       <w:r>
+        <w:rPr>
+          <w:noProof/>
+        </w:rPr>
         <w:drawing>
           <wp:inline distT="0" distB="0" distL="0" distR="0" wp14:anchorId="65D03CAA" wp14:editId="2D14B363">
             <wp:extent cx="5400040" cy="1743075"/>
@@ -4469,6 +4523,9 @@
     </w:p>
     <w:p>
       <w:r>
+        <w:rPr>
+          <w:noProof/>
+        </w:rPr>
         <w:lastRenderedPageBreak/>
         <w:drawing>
           <wp:inline distT="0" distB="0" distL="0" distR="0" wp14:anchorId="00B43EEC" wp14:editId="7E4C6A94">
@@ -6004,6 +6061,9 @@
         <w:ind w:left="720"/>
       </w:pPr>
       <w:r>
+        <w:rPr>
+          <w:noProof/>
+        </w:rPr>
         <w:drawing>
           <wp:inline distT="0" distB="0" distL="0" distR="0" wp14:anchorId="3D1C32CE" wp14:editId="39CFA17B">
             <wp:extent cx="5400040" cy="2985135"/>
@@ -6067,6 +6127,9 @@
         <w:ind w:left="720"/>
       </w:pPr>
       <w:r>
+        <w:rPr>
+          <w:noProof/>
+        </w:rPr>
         <w:drawing>
           <wp:inline distT="0" distB="0" distL="0" distR="0" wp14:anchorId="7DD5E345" wp14:editId="749428B1">
             <wp:extent cx="5400040" cy="1291590"/>
@@ -6638,6 +6701,9 @@
         <w:ind w:left="720"/>
       </w:pPr>
       <w:r>
+        <w:rPr>
+          <w:noProof/>
+        </w:rPr>
         <w:lastRenderedPageBreak/>
         <w:drawing>
           <wp:inline distT="0" distB="0" distL="0" distR="0" wp14:anchorId="69895891" wp14:editId="0DB1C038">
@@ -7532,6 +7598,9 @@
         </w:numPr>
       </w:pPr>
       <w:r>
+        <w:rPr>
+          <w:noProof/>
+        </w:rPr>
         <w:drawing>
           <wp:inline distT="0" distB="0" distL="0" distR="0" wp14:anchorId="0211064F" wp14:editId="46E95284">
             <wp:extent cx="4305300" cy="2316480"/>
@@ -7590,6 +7659,9 @@
         </w:numPr>
       </w:pPr>
       <w:r>
+        <w:rPr>
+          <w:noProof/>
+        </w:rPr>
         <w:drawing>
           <wp:inline distT="0" distB="0" distL="0" distR="0" wp14:anchorId="622BAEA8" wp14:editId="0EAD6AE9">
             <wp:extent cx="4312920" cy="2362200"/>
@@ -7648,6 +7720,9 @@
         </w:numPr>
       </w:pPr>
       <w:r>
+        <w:rPr>
+          <w:noProof/>
+        </w:rPr>
         <w:lastRenderedPageBreak/>
         <w:drawing>
           <wp:inline distT="0" distB="0" distL="0" distR="0" wp14:anchorId="40D85872" wp14:editId="25C1FD15">
@@ -11966,14 +12041,42 @@
         <w:rPr>
           <w:lang w:val="en-US"/>
         </w:rPr>
-        <w:t>Desta forma, vamos usar a configuração </w:t>
-      </w:r>
-      <w:r>
-        <w:rPr>
-          <w:b/>
-          <w:bCs/>
+        <w:t xml:space="preserve">Desta forma, </w:t>
+      </w:r>
+      <w:proofErr w:type="spellStart"/>
+      <w:r>
+        <w:rPr>
           <w:lang w:val="en-US"/>
         </w:rPr>
+        <w:t>vamos</w:t>
+      </w:r>
+      <w:proofErr w:type="spellEnd"/>
+      <w:r>
+        <w:rPr>
+          <w:lang w:val="en-US"/>
+        </w:rPr>
+        <w:t xml:space="preserve"> usar a </w:t>
+      </w:r>
+      <w:proofErr w:type="spellStart"/>
+      <w:r>
+        <w:rPr>
+          <w:lang w:val="en-US"/>
+        </w:rPr>
+        <w:t>configuração</w:t>
+      </w:r>
+      <w:proofErr w:type="spellEnd"/>
+      <w:r>
+        <w:rPr>
+          <w:lang w:val="en-US"/>
+        </w:rPr>
+        <w:t> </w:t>
+      </w:r>
+      <w:r>
+        <w:rPr>
+          <w:b/>
+          <w:bCs/>
+          <w:lang w:val="en-US"/>
+        </w:rPr>
         <w:t>Headers</w:t>
       </w:r>
       <w:r>
@@ -12022,21 +12125,49 @@
         <w:rPr>
           <w:lang w:val="en-US"/>
         </w:rPr>
-        <w:t xml:space="preserve">                         #”Content-Type” = “application/json”</w:t>
-      </w:r>
-    </w:p>
-    <w:p>
-      <w:pPr>
-        <w:ind w:left="720"/>
+        <w:t xml:space="preserve">                         #”Content-Type” = “application/</w:t>
+      </w:r>
+      <w:proofErr w:type="spellStart"/>
+      <w:r>
         <w:rPr>
           <w:lang w:val="en-US"/>
         </w:rPr>
-      </w:pPr>
+        <w:t>json</w:t>
+      </w:r>
+      <w:proofErr w:type="spellEnd"/>
       <w:r>
         <w:rPr>
           <w:lang w:val="en-US"/>
         </w:rPr>
-        <w:t>Authorization =  (Bearer ou Basic) {Token}</w:t>
+        <w:t>”</w:t>
+      </w:r>
+    </w:p>
+    <w:p>
+      <w:pPr>
+        <w:ind w:left="720"/>
+        <w:rPr>
+          <w:lang w:val="en-US"/>
+        </w:rPr>
+      </w:pPr>
+      <w:r>
+        <w:rPr>
+          <w:lang w:val="en-US"/>
+        </w:rPr>
+        <w:t xml:space="preserve">Authorization =  (Bearer </w:t>
+      </w:r>
+      <w:proofErr w:type="spellStart"/>
+      <w:r>
+        <w:rPr>
+          <w:lang w:val="en-US"/>
+        </w:rPr>
+        <w:t>ou</w:t>
+      </w:r>
+      <w:proofErr w:type="spellEnd"/>
+      <w:r>
+        <w:rPr>
+          <w:lang w:val="en-US"/>
+        </w:rPr>
+        <w:t xml:space="preserve"> Basic) {Token}</w:t>
       </w:r>
     </w:p>
     <w:p>
@@ -12092,6 +12223,505 @@
     </w:p>
     <w:p>
       <w:pPr>
+        <w:ind w:left="720"/>
+      </w:pPr>
+      <w:r>
+        <w:t>Você recebeu um projeto referente a uma requisição à API, onde a pessoa do seu time apresentou dificuldades em entender o retorno dos dados.</w:t>
+      </w:r>
+    </w:p>
+    <w:p>
+      <w:pPr>
+        <w:ind w:left="720"/>
+      </w:pPr>
+      <w:proofErr w:type="spellStart"/>
+      <w:r>
+        <w:t>let</w:t>
+      </w:r>
+      <w:proofErr w:type="spellEnd"/>
+    </w:p>
+    <w:p>
+      <w:pPr>
+        <w:ind w:left="720"/>
+      </w:pPr>
+      <w:r>
+        <w:t xml:space="preserve">    #"Requisição" =</w:t>
+      </w:r>
+    </w:p>
+    <w:p>
+      <w:pPr>
+        <w:ind w:left="720"/>
+      </w:pPr>
+      <w:r>
+        <w:t xml:space="preserve">                    (</w:t>
+      </w:r>
+      <w:proofErr w:type="spellStart"/>
+      <w:r>
+        <w:t>numeroPagina</w:t>
+      </w:r>
+      <w:proofErr w:type="spellEnd"/>
+      <w:r>
+        <w:t xml:space="preserve">) =&gt; </w:t>
+      </w:r>
+    </w:p>
+    <w:p>
+      <w:pPr>
+        <w:ind w:left="720"/>
+      </w:pPr>
+      <w:r>
+        <w:t xml:space="preserve">                        </w:t>
+      </w:r>
+      <w:proofErr w:type="spellStart"/>
+      <w:r>
+        <w:t>Json.Document</w:t>
+      </w:r>
+      <w:proofErr w:type="spellEnd"/>
+      <w:r>
+        <w:t>(</w:t>
+      </w:r>
+    </w:p>
+    <w:p>
+      <w:pPr>
+        <w:ind w:left="720"/>
+        <w:rPr>
+          <w:lang w:val="en-US"/>
+        </w:rPr>
+      </w:pPr>
+      <w:r>
+        <w:t xml:space="preserve">                            </w:t>
+      </w:r>
+      <w:proofErr w:type="spellStart"/>
+      <w:r>
+        <w:rPr>
+          <w:lang w:val="en-US"/>
+        </w:rPr>
+        <w:t>Web.Contents</w:t>
+      </w:r>
+      <w:proofErr w:type="spellEnd"/>
+      <w:r>
+        <w:rPr>
+          <w:lang w:val="en-US"/>
+        </w:rPr>
+        <w:t>(</w:t>
+      </w:r>
+    </w:p>
+    <w:p>
+      <w:pPr>
+        <w:ind w:left="720"/>
+        <w:rPr>
+          <w:lang w:val="en-US"/>
+        </w:rPr>
+      </w:pPr>
+      <w:r>
+        <w:rPr>
+          <w:lang w:val="en-US"/>
+        </w:rPr>
+        <w:t xml:space="preserve">                                "http://localhost:8080",</w:t>
+      </w:r>
+    </w:p>
+    <w:p>
+      <w:pPr>
+        <w:ind w:left="720"/>
+        <w:rPr>
+          <w:lang w:val="en-US"/>
+        </w:rPr>
+      </w:pPr>
+      <w:r>
+        <w:rPr>
+          <w:lang w:val="en-US"/>
+        </w:rPr>
+        <w:t xml:space="preserve">                                [</w:t>
+      </w:r>
+    </w:p>
+    <w:p>
+      <w:pPr>
+        <w:ind w:left="720"/>
+        <w:rPr>
+          <w:lang w:val="en-US"/>
+        </w:rPr>
+      </w:pPr>
+      <w:r>
+        <w:rPr>
+          <w:lang w:val="en-US"/>
+        </w:rPr>
+        <w:t xml:space="preserve">                                    </w:t>
+      </w:r>
+      <w:proofErr w:type="spellStart"/>
+      <w:r>
+        <w:rPr>
+          <w:lang w:val="en-US"/>
+        </w:rPr>
+        <w:t>RelativePath</w:t>
+      </w:r>
+      <w:proofErr w:type="spellEnd"/>
+      <w:r>
+        <w:rPr>
+          <w:lang w:val="en-US"/>
+        </w:rPr>
+        <w:t>="/medicos",</w:t>
+      </w:r>
+    </w:p>
+    <w:p>
+      <w:pPr>
+        <w:ind w:left="720"/>
+      </w:pPr>
+      <w:r>
+        <w:rPr>
+          <w:lang w:val="en-US"/>
+        </w:rPr>
+        <w:t xml:space="preserve">                                    </w:t>
+      </w:r>
+      <w:r>
+        <w:rPr>
+          <w:b/>
+          <w:bCs/>
+        </w:rPr>
+        <w:t>Query</w:t>
+      </w:r>
+      <w:r>
+        <w:t xml:space="preserve"> = [</w:t>
+      </w:r>
+    </w:p>
+    <w:p>
+      <w:pPr>
+        <w:ind w:left="720"/>
+      </w:pPr>
+      <w:r>
+        <w:t xml:space="preserve">                                        </w:t>
+      </w:r>
+      <w:proofErr w:type="spellStart"/>
+      <w:r>
+        <w:t>page</w:t>
+      </w:r>
+      <w:proofErr w:type="spellEnd"/>
+      <w:r>
+        <w:t>=</w:t>
+      </w:r>
+      <w:proofErr w:type="spellStart"/>
+      <w:r>
+        <w:t>Number.ToText</w:t>
+      </w:r>
+      <w:proofErr w:type="spellEnd"/>
+      <w:r>
+        <w:t>(</w:t>
+      </w:r>
+      <w:proofErr w:type="spellStart"/>
+      <w:r>
+        <w:t>numeroPagina</w:t>
+      </w:r>
+      <w:proofErr w:type="spellEnd"/>
+      <w:r>
+        <w:t>)</w:t>
+      </w:r>
+    </w:p>
+    <w:p>
+      <w:pPr>
+        <w:ind w:left="720"/>
+      </w:pPr>
+      <w:r>
+        <w:t xml:space="preserve">                                    ]</w:t>
+      </w:r>
+    </w:p>
+    <w:p>
+      <w:pPr>
+        <w:ind w:left="720"/>
+      </w:pPr>
+      <w:r>
+        <w:t xml:space="preserve">                                ]</w:t>
+      </w:r>
+    </w:p>
+    <w:p>
+      <w:pPr>
+        <w:ind w:left="720"/>
+      </w:pPr>
+      <w:r>
+        <w:t xml:space="preserve">                                    )</w:t>
+      </w:r>
+    </w:p>
+    <w:p>
+      <w:pPr>
+        <w:ind w:left="720"/>
+      </w:pPr>
+      <w:r>
+        <w:t xml:space="preserve">                        )[</w:t>
+      </w:r>
+      <w:proofErr w:type="spellStart"/>
+      <w:r>
+        <w:t>content</w:t>
+      </w:r>
+      <w:proofErr w:type="spellEnd"/>
+      <w:r>
+        <w:t>],</w:t>
+      </w:r>
+    </w:p>
+    <w:p>
+      <w:pPr>
+        <w:ind w:left="720"/>
+      </w:pPr>
+    </w:p>
+    <w:p>
+      <w:pPr>
+        <w:ind w:left="720"/>
+      </w:pPr>
+      <w:r>
+        <w:t xml:space="preserve">    #"Total Páginas" = </w:t>
+      </w:r>
+    </w:p>
+    <w:p>
+      <w:pPr>
+        <w:ind w:left="720"/>
+      </w:pPr>
+      <w:r>
+        <w:t xml:space="preserve">                        </w:t>
+      </w:r>
+      <w:proofErr w:type="spellStart"/>
+      <w:r>
+        <w:t>Json.Document</w:t>
+      </w:r>
+      <w:proofErr w:type="spellEnd"/>
+      <w:r>
+        <w:t>(</w:t>
+      </w:r>
+    </w:p>
+    <w:p>
+      <w:pPr>
+        <w:ind w:left="720"/>
+      </w:pPr>
+      <w:r>
+        <w:t xml:space="preserve">                            </w:t>
+      </w:r>
+      <w:proofErr w:type="spellStart"/>
+      <w:r>
+        <w:t>Web.Contents</w:t>
+      </w:r>
+      <w:proofErr w:type="spellEnd"/>
+      <w:r>
+        <w:t>(</w:t>
+      </w:r>
+    </w:p>
+    <w:p>
+      <w:pPr>
+        <w:ind w:left="720"/>
+      </w:pPr>
+      <w:r>
+        <w:t xml:space="preserve">                                "http://localhost:8080",</w:t>
+      </w:r>
+    </w:p>
+    <w:p>
+      <w:pPr>
+        <w:ind w:left="720"/>
+      </w:pPr>
+      <w:r>
+        <w:t xml:space="preserve">                                [</w:t>
+      </w:r>
+    </w:p>
+    <w:p>
+      <w:pPr>
+        <w:ind w:left="720"/>
+      </w:pPr>
+      <w:r>
+        <w:t xml:space="preserve">                                    </w:t>
+      </w:r>
+      <w:proofErr w:type="spellStart"/>
+      <w:r>
+        <w:t>RelativePath</w:t>
+      </w:r>
+      <w:proofErr w:type="spellEnd"/>
+      <w:r>
+        <w:t>="/</w:t>
+      </w:r>
+      <w:proofErr w:type="spellStart"/>
+      <w:r>
+        <w:t>medicos</w:t>
+      </w:r>
+      <w:proofErr w:type="spellEnd"/>
+      <w:r>
+        <w:t>",</w:t>
+      </w:r>
+    </w:p>
+    <w:p>
+      <w:pPr>
+        <w:ind w:left="720"/>
+      </w:pPr>
+      <w:r>
+        <w:t xml:space="preserve">                                    </w:t>
+      </w:r>
+      <w:r>
+        <w:rPr>
+          <w:b/>
+          <w:bCs/>
+        </w:rPr>
+        <w:t>Query</w:t>
+      </w:r>
+      <w:r>
+        <w:t xml:space="preserve"> = [</w:t>
+      </w:r>
+    </w:p>
+    <w:p>
+      <w:pPr>
+        <w:ind w:left="720"/>
+      </w:pPr>
+      <w:r>
+        <w:lastRenderedPageBreak/>
+        <w:t xml:space="preserve">                                        </w:t>
+      </w:r>
+      <w:proofErr w:type="spellStart"/>
+      <w:r>
+        <w:t>page</w:t>
+      </w:r>
+      <w:proofErr w:type="spellEnd"/>
+      <w:r>
+        <w:t>="1"</w:t>
+      </w:r>
+    </w:p>
+    <w:p>
+      <w:pPr>
+        <w:ind w:left="720"/>
+      </w:pPr>
+      <w:r>
+        <w:t xml:space="preserve">                                    ]</w:t>
+      </w:r>
+    </w:p>
+    <w:p>
+      <w:pPr>
+        <w:ind w:left="720"/>
+      </w:pPr>
+      <w:r>
+        <w:t xml:space="preserve">                                ]</w:t>
+      </w:r>
+    </w:p>
+    <w:p>
+      <w:pPr>
+        <w:ind w:left="720"/>
+      </w:pPr>
+      <w:r>
+        <w:t xml:space="preserve">                                    )</w:t>
+      </w:r>
+    </w:p>
+    <w:p>
+      <w:pPr>
+        <w:ind w:left="720"/>
+      </w:pPr>
+      <w:r>
+        <w:t xml:space="preserve">                        )[</w:t>
+      </w:r>
+      <w:proofErr w:type="spellStart"/>
+      <w:r>
+        <w:t>totalPages</w:t>
+      </w:r>
+      <w:proofErr w:type="spellEnd"/>
+      <w:r>
+        <w:t>],</w:t>
+      </w:r>
+    </w:p>
+    <w:p>
+      <w:pPr>
+        <w:ind w:left="720"/>
+      </w:pPr>
+    </w:p>
+    <w:p>
+      <w:pPr>
+        <w:ind w:left="720"/>
+      </w:pPr>
+      <w:r>
+        <w:t xml:space="preserve">    #"Lista Páginas" = {0 .. #"Total Páginas"},</w:t>
+      </w:r>
+    </w:p>
+    <w:p>
+      <w:pPr>
+        <w:ind w:left="720"/>
+      </w:pPr>
+    </w:p>
+    <w:p>
+      <w:pPr>
+        <w:ind w:left="720"/>
+      </w:pPr>
+      <w:r>
+        <w:t xml:space="preserve">    #"Lista Dados" = </w:t>
+      </w:r>
+    </w:p>
+    <w:p>
+      <w:pPr>
+        <w:ind w:left="720"/>
+      </w:pPr>
+      <w:r>
+        <w:t xml:space="preserve">                    </w:t>
+      </w:r>
+      <w:proofErr w:type="spellStart"/>
+      <w:r>
+        <w:t>List.Transform</w:t>
+      </w:r>
+      <w:proofErr w:type="spellEnd"/>
+      <w:r>
+        <w:t>(</w:t>
+      </w:r>
+    </w:p>
+    <w:p>
+      <w:pPr>
+        <w:ind w:left="720"/>
+      </w:pPr>
+      <w:r>
+        <w:t xml:space="preserve">                        #"Lista Páginas", </w:t>
+      </w:r>
+    </w:p>
+    <w:p>
+      <w:pPr>
+        <w:ind w:left="720"/>
+      </w:pPr>
+      <w:r>
+        <w:t xml:space="preserve">                        </w:t>
+      </w:r>
+      <w:proofErr w:type="spellStart"/>
+      <w:r>
+        <w:t>each</w:t>
+      </w:r>
+      <w:proofErr w:type="spellEnd"/>
+      <w:r>
+        <w:t xml:space="preserve"> { _ , #"Requisição"( _ )}</w:t>
+      </w:r>
+    </w:p>
+    <w:p>
+      <w:pPr>
+        <w:ind w:left="720"/>
+      </w:pPr>
+      <w:r>
+        <w:t xml:space="preserve">                    )</w:t>
+      </w:r>
+    </w:p>
+    <w:p>
+      <w:pPr>
+        <w:ind w:left="720"/>
+      </w:pPr>
+      <w:r>
+        <w:t>in</w:t>
+      </w:r>
+    </w:p>
+    <w:p>
+      <w:pPr>
+        <w:ind w:left="720"/>
+      </w:pPr>
+      <w:r>
+        <w:t xml:space="preserve">    #"Lista </w:t>
+      </w:r>
+      <w:proofErr w:type="spellStart"/>
+      <w:r>
+        <w:t>Dados"Copiar</w:t>
+      </w:r>
+      <w:proofErr w:type="spellEnd"/>
+      <w:r>
+        <w:t xml:space="preserve"> código</w:t>
+      </w:r>
+    </w:p>
+    <w:p>
+      <w:pPr>
+        <w:ind w:left="720"/>
+      </w:pPr>
+      <w:r>
+        <w:t>Sabendo que é necessário analisar o código e retornar uma lista dos dados das 3 últimas páginas da API, qual ajuste precisa ser feito?</w:t>
+      </w:r>
+    </w:p>
+    <w:p>
+      <w:pPr>
+        <w:ind w:left="720"/>
         <w:rPr>
           <w:vanish/>
         </w:rPr>
@@ -12100,11 +12730,1453 @@
         <w:rPr>
           <w:vanish/>
         </w:rPr>
+        <w:t>Parte superior do formulário</w:t>
+      </w:r>
+    </w:p>
+    <w:p>
+      <w:pPr>
+        <w:numPr>
+          <w:ilvl w:val="0"/>
+          <w:numId w:val="38"/>
+        </w:numPr>
+      </w:pPr>
+      <w:r>
+        <w:t>Alternativa correta</w:t>
+      </w:r>
+    </w:p>
+    <w:p>
+      <w:pPr>
+        <w:ind w:left="720"/>
+      </w:pPr>
+      <w:r>
+        <w:t>#"Lista Páginas" = {#"Total Páginas"-3 .. #"Total Páginas"}</w:t>
+      </w:r>
+    </w:p>
+    <w:p>
+      <w:pPr>
+        <w:numPr>
+          <w:ilvl w:val="0"/>
+          <w:numId w:val="38"/>
+        </w:numPr>
+      </w:pPr>
+      <w:r>
+        <w:t>Alternativa correta</w:t>
+      </w:r>
+    </w:p>
+    <w:p>
+      <w:pPr>
+        <w:numPr>
+          <w:ilvl w:val="0"/>
+          <w:numId w:val="38"/>
+        </w:numPr>
+        <w:tabs>
+          <w:tab w:val="clear" w:pos="720"/>
+        </w:tabs>
+      </w:pPr>
+      <w:r>
+        <w:t xml:space="preserve">#"Lista Dados" = </w:t>
+      </w:r>
+    </w:p>
+    <w:p>
+      <w:pPr>
+        <w:numPr>
+          <w:ilvl w:val="0"/>
+          <w:numId w:val="38"/>
+        </w:numPr>
+        <w:tabs>
+          <w:tab w:val="clear" w:pos="720"/>
+        </w:tabs>
+      </w:pPr>
+      <w:r>
+        <w:t xml:space="preserve">                    </w:t>
+      </w:r>
+      <w:proofErr w:type="spellStart"/>
+      <w:r>
+        <w:t>List.Transform</w:t>
+      </w:r>
+      <w:proofErr w:type="spellEnd"/>
+      <w:r>
+        <w:t>(</w:t>
+      </w:r>
+    </w:p>
+    <w:p>
+      <w:pPr>
+        <w:numPr>
+          <w:ilvl w:val="0"/>
+          <w:numId w:val="38"/>
+        </w:numPr>
+        <w:tabs>
+          <w:tab w:val="clear" w:pos="720"/>
+        </w:tabs>
+      </w:pPr>
+      <w:r>
+        <w:t xml:space="preserve">                        #"Lista Páginas", </w:t>
+      </w:r>
+    </w:p>
+    <w:p>
+      <w:pPr>
+        <w:numPr>
+          <w:ilvl w:val="0"/>
+          <w:numId w:val="38"/>
+        </w:numPr>
+        <w:tabs>
+          <w:tab w:val="clear" w:pos="720"/>
+        </w:tabs>
+      </w:pPr>
+      <w:r>
+        <w:t xml:space="preserve">                        </w:t>
+      </w:r>
+      <w:proofErr w:type="spellStart"/>
+      <w:r>
+        <w:t>each</w:t>
+      </w:r>
+      <w:proofErr w:type="spellEnd"/>
+      <w:r>
+        <w:t xml:space="preserve"> { _ , #"Requisição"( #"Total Páginas" - 3)}</w:t>
+      </w:r>
+    </w:p>
+    <w:p>
+      <w:pPr>
+        <w:ind w:left="720"/>
+      </w:pPr>
+      <w:r>
+        <w:t xml:space="preserve">                    )</w:t>
+      </w:r>
+    </w:p>
+    <w:p>
+      <w:pPr>
+        <w:numPr>
+          <w:ilvl w:val="0"/>
+          <w:numId w:val="38"/>
+        </w:numPr>
+      </w:pPr>
+      <w:r>
+        <w:t>Alternativa correta</w:t>
+      </w:r>
+    </w:p>
+    <w:p>
+      <w:pPr>
+        <w:ind w:left="720"/>
+      </w:pPr>
+      <w:r>
+        <w:t>#"Lista Páginas" = {#"Total Páginas"-3 .. #"Total Páginas"-1}</w:t>
+      </w:r>
+    </w:p>
+    <w:p>
+      <w:pPr>
+        <w:ind w:left="720"/>
+      </w:pPr>
+      <w:r>
+        <w:t>Dessa maneira teremos o intervalo requisitado de forma dinâmica, assim evitando futuras manutenções do código.</w:t>
+      </w:r>
+    </w:p>
+    <w:p>
+      <w:pPr>
+        <w:ind w:left="720"/>
+      </w:pPr>
+      <w:r>
+        <w:lastRenderedPageBreak/>
+        <w:t>Dado que a coluna nome apresenta inconsistências de codificação, se faz necessário uma transformação na coluna da tabela que anteriormente estruturamos.</w:t>
+      </w:r>
+    </w:p>
+    <w:p>
+      <w:pPr>
+        <w:ind w:left="720"/>
+      </w:pPr>
+      <w:r>
+        <w:t>Para isso, utilizaremos a função de tabela chamada </w:t>
+      </w:r>
+      <w:proofErr w:type="spellStart"/>
+      <w:r>
+        <w:t>Table.TransformColumns</w:t>
+      </w:r>
+      <w:proofErr w:type="spellEnd"/>
+      <w:r>
+        <w:t>(), que segue a seguinte estrutura:</w:t>
+      </w:r>
+    </w:p>
+    <w:p>
+      <w:pPr>
+        <w:ind w:left="720"/>
+      </w:pPr>
+      <w:proofErr w:type="spellStart"/>
+      <w:r>
+        <w:t>Table.TransformColumns</w:t>
+      </w:r>
+      <w:proofErr w:type="spellEnd"/>
+      <w:r>
+        <w:t xml:space="preserve">({Tabela}, {Lista que possui </w:t>
+      </w:r>
+      <w:r>
+        <w:rPr>
+          <w:b/>
+          <w:bCs/>
+        </w:rPr>
+        <w:t>as</w:t>
+      </w:r>
+      <w:r>
+        <w:t xml:space="preserve"> transformações})Copiar código</w:t>
+      </w:r>
+    </w:p>
+    <w:p>
+      <w:pPr>
+        <w:ind w:left="720"/>
+      </w:pPr>
+      <w:r>
+        <w:t>Agora, podemos ajustar a nossa variável tabela, incluindo essa transformação onde vamos colocar:</w:t>
+      </w:r>
+    </w:p>
+    <w:p>
+      <w:pPr>
+        <w:numPr>
+          <w:ilvl w:val="0"/>
+          <w:numId w:val="39"/>
+        </w:numPr>
+      </w:pPr>
+      <w:r>
+        <w:t>no primeiro parâmetro da função: todo o código que já construímos;</w:t>
+      </w:r>
+    </w:p>
+    <w:p>
+      <w:pPr>
+        <w:numPr>
+          <w:ilvl w:val="0"/>
+          <w:numId w:val="39"/>
+        </w:numPr>
+      </w:pPr>
+      <w:r>
+        <w:t>no segundo parâmetro da função: uma lista onde vamos transformar cada linha da coluna nome de </w:t>
+      </w:r>
+      <w:r>
+        <w:rPr>
+          <w:b/>
+          <w:bCs/>
+        </w:rPr>
+        <w:t>texto para binário</w:t>
+      </w:r>
+      <w:r>
+        <w:t>, usando a codificação do </w:t>
+      </w:r>
+      <w:r>
+        <w:rPr>
+          <w:i/>
+          <w:iCs/>
+        </w:rPr>
+        <w:t>Windows (1252)</w:t>
+      </w:r>
+      <w:r>
+        <w:t>, e depois passaremos de </w:t>
+      </w:r>
+      <w:r>
+        <w:rPr>
+          <w:b/>
+          <w:bCs/>
+        </w:rPr>
+        <w:t>binário para texto</w:t>
+      </w:r>
+      <w:r>
+        <w:t>, com a </w:t>
+      </w:r>
+      <w:r>
+        <w:rPr>
+          <w:i/>
+          <w:iCs/>
+        </w:rPr>
+        <w:t>codificação UTF-8</w:t>
+      </w:r>
+      <w:r>
+        <w:t>, possibilitando a resolução dos problemas de acentuação.</w:t>
+      </w:r>
+    </w:p>
+    <w:p>
+      <w:pPr>
+        <w:ind w:left="720"/>
+      </w:pPr>
+      <w:r>
+        <w:t>Vejamos a seguir:</w:t>
+      </w:r>
+    </w:p>
+    <w:p>
+      <w:pPr>
+        <w:ind w:left="720"/>
+      </w:pPr>
+      <w:r>
+        <w:t>#"Tabela" =</w:t>
+      </w:r>
+    </w:p>
+    <w:p>
+      <w:pPr>
+        <w:ind w:left="720"/>
+      </w:pPr>
+      <w:r>
+        <w:t xml:space="preserve">                </w:t>
+      </w:r>
+      <w:proofErr w:type="spellStart"/>
+      <w:r>
+        <w:t>Table.TransformColumns</w:t>
+      </w:r>
+      <w:proofErr w:type="spellEnd"/>
+      <w:r>
+        <w:t>( //Inclusão desta linha para a transformação</w:t>
+      </w:r>
+    </w:p>
+    <w:p>
+      <w:pPr>
+        <w:ind w:left="720"/>
+        <w:rPr>
+          <w:lang w:val="en-US"/>
+        </w:rPr>
+      </w:pPr>
+      <w:r>
+        <w:t xml:space="preserve">                        </w:t>
+      </w:r>
+      <w:proofErr w:type="spellStart"/>
+      <w:r>
+        <w:rPr>
+          <w:lang w:val="en-US"/>
+        </w:rPr>
+        <w:t>Table.ExpandRecordColumn</w:t>
+      </w:r>
+      <w:proofErr w:type="spellEnd"/>
+      <w:r>
+        <w:rPr>
+          <w:lang w:val="en-US"/>
+        </w:rPr>
+        <w:t xml:space="preserve">(    </w:t>
+      </w:r>
+    </w:p>
+    <w:p>
+      <w:pPr>
+        <w:ind w:left="720"/>
+        <w:rPr>
+          <w:lang w:val="en-US"/>
+        </w:rPr>
+      </w:pPr>
+      <w:r>
+        <w:rPr>
+          <w:lang w:val="en-US"/>
+        </w:rPr>
+        <w:t xml:space="preserve">                            </w:t>
+      </w:r>
+      <w:proofErr w:type="spellStart"/>
+      <w:r>
+        <w:rPr>
+          <w:lang w:val="en-US"/>
+        </w:rPr>
+        <w:t>Table.ExpandListColumn</w:t>
+      </w:r>
+      <w:proofErr w:type="spellEnd"/>
+      <w:r>
+        <w:rPr>
+          <w:lang w:val="en-US"/>
+        </w:rPr>
+        <w:t>(</w:t>
+      </w:r>
+    </w:p>
+    <w:p>
+      <w:pPr>
+        <w:ind w:left="720"/>
+        <w:rPr>
+          <w:lang w:val="en-US"/>
+        </w:rPr>
+      </w:pPr>
+      <w:r>
+        <w:rPr>
+          <w:lang w:val="en-US"/>
+        </w:rPr>
+        <w:t xml:space="preserve">                                #table(</w:t>
+      </w:r>
+    </w:p>
+    <w:p>
+      <w:pPr>
+        <w:ind w:left="720"/>
+      </w:pPr>
+      <w:r>
+        <w:rPr>
+          <w:lang w:val="en-US"/>
+        </w:rPr>
+        <w:t xml:space="preserve">                                        </w:t>
+      </w:r>
+      <w:proofErr w:type="spellStart"/>
+      <w:r>
+        <w:t>type</w:t>
+      </w:r>
+      <w:proofErr w:type="spellEnd"/>
+      <w:r>
+        <w:t xml:space="preserve"> </w:t>
+      </w:r>
+      <w:proofErr w:type="spellStart"/>
+      <w:r>
+        <w:t>table</w:t>
+      </w:r>
+      <w:proofErr w:type="spellEnd"/>
+      <w:r>
+        <w:t>[ Página=</w:t>
+      </w:r>
+      <w:proofErr w:type="spellStart"/>
+      <w:r>
+        <w:t>text</w:t>
+      </w:r>
+      <w:proofErr w:type="spellEnd"/>
+      <w:r>
+        <w:t>, Dados=</w:t>
+      </w:r>
+      <w:proofErr w:type="spellStart"/>
+      <w:r>
+        <w:t>list</w:t>
+      </w:r>
+      <w:proofErr w:type="spellEnd"/>
+      <w:r>
+        <w:t xml:space="preserve"> ],</w:t>
+      </w:r>
+    </w:p>
+    <w:p>
+      <w:pPr>
+        <w:ind w:left="720"/>
+      </w:pPr>
+      <w:r>
+        <w:t xml:space="preserve">                                        #"Lista Dados"</w:t>
+      </w:r>
+    </w:p>
+    <w:p>
+      <w:pPr>
+        <w:ind w:left="720"/>
+      </w:pPr>
+      <w:r>
+        <w:t xml:space="preserve">                                ), </w:t>
+      </w:r>
+    </w:p>
+    <w:p>
+      <w:pPr>
+        <w:ind w:left="720"/>
+      </w:pPr>
+      <w:r>
+        <w:t xml:space="preserve">                                "Dados"</w:t>
+      </w:r>
+    </w:p>
+    <w:p>
+      <w:pPr>
+        <w:ind w:left="720"/>
+      </w:pPr>
+      <w:r>
+        <w:t xml:space="preserve">                            ),</w:t>
+      </w:r>
+    </w:p>
+    <w:p>
+      <w:pPr>
+        <w:ind w:left="720"/>
+      </w:pPr>
+      <w:r>
+        <w:t xml:space="preserve">                            "Dados",</w:t>
+      </w:r>
+    </w:p>
+    <w:p>
+      <w:pPr>
+        <w:ind w:left="720"/>
+      </w:pPr>
+      <w:r>
+        <w:t xml:space="preserve">                            {"id", "nome", "</w:t>
+      </w:r>
+      <w:proofErr w:type="spellStart"/>
+      <w:r>
+        <w:t>email</w:t>
+      </w:r>
+      <w:proofErr w:type="spellEnd"/>
+      <w:r>
+        <w:t xml:space="preserve">", "crm", "especialidade"}, </w:t>
+      </w:r>
+    </w:p>
+    <w:p>
+      <w:pPr>
+        <w:ind w:left="720"/>
+      </w:pPr>
+      <w:r>
+        <w:t xml:space="preserve">                            {"id", "Nome", "</w:t>
+      </w:r>
+      <w:proofErr w:type="spellStart"/>
+      <w:r>
+        <w:t>email</w:t>
+      </w:r>
+      <w:proofErr w:type="spellEnd"/>
+      <w:r>
+        <w:t>", "crm", "especialidade"}</w:t>
+      </w:r>
+    </w:p>
+    <w:p>
+      <w:pPr>
+        <w:ind w:left="720"/>
+      </w:pPr>
+      <w:r>
+        <w:t xml:space="preserve">                        ),</w:t>
+      </w:r>
+    </w:p>
+    <w:p>
+      <w:pPr>
+        <w:ind w:left="720"/>
+      </w:pPr>
+      <w:r>
+        <w:lastRenderedPageBreak/>
+        <w:t xml:space="preserve">                        { // lista da transformação</w:t>
+      </w:r>
+    </w:p>
+    <w:p>
+      <w:pPr>
+        <w:ind w:left="720"/>
+      </w:pPr>
+      <w:r>
+        <w:t xml:space="preserve">                            "Nome", // nome da coluna</w:t>
+      </w:r>
+    </w:p>
+    <w:p>
+      <w:pPr>
+        <w:ind w:left="720"/>
+      </w:pPr>
+      <w:r>
+        <w:t xml:space="preserve">                            </w:t>
+      </w:r>
+      <w:proofErr w:type="spellStart"/>
+      <w:r>
+        <w:t>each</w:t>
+      </w:r>
+      <w:proofErr w:type="spellEnd"/>
+      <w:r>
+        <w:t xml:space="preserve"> </w:t>
+      </w:r>
+      <w:proofErr w:type="spellStart"/>
+      <w:r>
+        <w:t>Text.FromBinary</w:t>
+      </w:r>
+      <w:proofErr w:type="spellEnd"/>
+      <w:r>
+        <w:t>(</w:t>
+      </w:r>
+    </w:p>
+    <w:p>
+      <w:pPr>
+        <w:ind w:left="720"/>
+      </w:pPr>
+      <w:r>
+        <w:t xml:space="preserve">                </w:t>
+      </w:r>
+      <w:proofErr w:type="spellStart"/>
+      <w:r>
+        <w:t>Text.ToBinary</w:t>
+      </w:r>
+      <w:proofErr w:type="spellEnd"/>
+      <w:r>
+        <w:t>( _ , 1252), // transformação de texto para binário na codificação 1252 em cada linha</w:t>
+      </w:r>
+    </w:p>
+    <w:p>
+      <w:pPr>
+        <w:ind w:left="720"/>
+      </w:pPr>
+      <w:r>
+        <w:t xml:space="preserve">                TextEncoding.Utf8 // transformação de binário para texto na codificação UTF-8 em cada linha</w:t>
+      </w:r>
+    </w:p>
+    <w:p>
+      <w:pPr>
+        <w:ind w:left="720"/>
+      </w:pPr>
+      <w:r>
+        <w:t>)</w:t>
+      </w:r>
+    </w:p>
+    <w:p>
+      <w:pPr>
+        <w:ind w:left="720"/>
+      </w:pPr>
+      <w:r>
+        <w:t xml:space="preserve">                        }</w:t>
+      </w:r>
+    </w:p>
+    <w:p>
+      <w:pPr>
+        <w:ind w:left="720"/>
+      </w:pPr>
+      <w:r>
+        <w:t xml:space="preserve">                ) </w:t>
+      </w:r>
+    </w:p>
+    <w:p>
+      <w:pPr>
+        <w:ind w:left="720"/>
+      </w:pPr>
+      <w:r>
+        <w:t>É um ótimo exercício para fazermos transformações em colunas específicas em vez de transformar toda a tabela. Manipulações como essa fazem total diferença na performance das rotinas de tratamentos criadas.</w:t>
+      </w:r>
+      <w:r>
+        <w:rPr>
+          <w:vanish/>
+        </w:rPr>
         <w:t>Parte inferior do formulário</w:t>
       </w:r>
     </w:p>
     <w:p>
       <w:pPr>
+        <w:ind w:left="720"/>
+        <w:rPr>
+          <w:b/>
+          <w:bCs/>
+        </w:rPr>
+      </w:pPr>
+      <w:r>
+        <w:rPr>
+          <w:b/>
+          <w:bCs/>
+        </w:rPr>
+        <w:t>Nessa aula, você aprendeu a:</w:t>
+      </w:r>
+    </w:p>
+    <w:p>
+      <w:pPr>
+        <w:numPr>
+          <w:ilvl w:val="0"/>
+          <w:numId w:val="40"/>
+        </w:numPr>
+      </w:pPr>
+      <w:r>
+        <w:t>Configurar a API;</w:t>
+      </w:r>
+    </w:p>
+    <w:p>
+      <w:pPr>
+        <w:numPr>
+          <w:ilvl w:val="0"/>
+          <w:numId w:val="40"/>
+        </w:numPr>
+      </w:pPr>
+      <w:r>
+        <w:t>Avaliar os atributos da API;</w:t>
+      </w:r>
+    </w:p>
+    <w:p>
+      <w:pPr>
+        <w:numPr>
+          <w:ilvl w:val="0"/>
+          <w:numId w:val="40"/>
+        </w:numPr>
+      </w:pPr>
+      <w:r>
+        <w:t>Configurar a requisição e consumir os dados de uma página da API;</w:t>
+      </w:r>
+    </w:p>
+    <w:p>
+      <w:pPr>
+        <w:numPr>
+          <w:ilvl w:val="0"/>
+          <w:numId w:val="40"/>
+        </w:numPr>
+      </w:pPr>
+      <w:r>
+        <w:t>Criar uma lista com dados de todas as páginas da API;</w:t>
+      </w:r>
+    </w:p>
+    <w:p>
+      <w:pPr>
+        <w:numPr>
+          <w:ilvl w:val="0"/>
+          <w:numId w:val="40"/>
+        </w:numPr>
+      </w:pPr>
+      <w:r>
+        <w:t>Transformar a lista em tabela com todos os dados requisitados;</w:t>
+      </w:r>
+    </w:p>
+    <w:p>
+      <w:pPr>
+        <w:numPr>
+          <w:ilvl w:val="0"/>
+          <w:numId w:val="40"/>
+        </w:numPr>
+      </w:pPr>
+      <w:r>
+        <w:t>Encadear etapas para simplificar processos.</w:t>
+      </w:r>
+    </w:p>
+    <w:p>
+      <w:pPr>
+        <w:numPr>
+          <w:ilvl w:val="0"/>
+          <w:numId w:val="40"/>
+        </w:numPr>
+      </w:pPr>
+      <w:r>
+        <w:t>Você está desenvolvendo um projeto do setor de logística de uma empresa e foi solicitado a identificação de entregas em atraso </w:t>
+      </w:r>
+      <w:r>
+        <w:rPr>
+          <w:b/>
+          <w:bCs/>
+        </w:rPr>
+        <w:t>em dias</w:t>
+      </w:r>
+      <w:r>
+        <w:t>. Como amostra da tabela do projeto, temos a seguinte estrutura:</w:t>
+      </w:r>
+    </w:p>
+    <w:tbl>
+      <w:tblPr>
+        <w:tblW w:w="0" w:type="auto"/>
+        <w:tblCellSpacing w:w="15" w:type="dxa"/>
+        <w:tblBorders>
+          <w:top w:val="single" w:sz="6" w:space="0" w:color="DDDDDD"/>
+          <w:left w:val="single" w:sz="6" w:space="0" w:color="DDDDDD"/>
+          <w:bottom w:val="single" w:sz="6" w:space="0" w:color="DDDDDD"/>
+          <w:right w:val="single" w:sz="6" w:space="0" w:color="DDDDDD"/>
+        </w:tblBorders>
+        <w:shd w:val="clear" w:color="auto" w:fill="FFFFFF"/>
+        <w:tblCellMar>
+          <w:left w:w="0" w:type="dxa"/>
+          <w:right w:w="0" w:type="dxa"/>
+        </w:tblCellMar>
+        <w:tblLook w:val="04A0" w:firstRow="1" w:lastRow="0" w:firstColumn="1" w:lastColumn="0" w:noHBand="0" w:noVBand="1"/>
+      </w:tblPr>
+      <w:tblGrid>
+        <w:gridCol w:w="1969"/>
+        <w:gridCol w:w="2339"/>
+        <w:gridCol w:w="2245"/>
+      </w:tblGrid>
+      <w:tr>
+        <w:trPr>
+          <w:tblHeader/>
+          <w:tblCellSpacing w:w="15" w:type="dxa"/>
+        </w:trPr>
+        <w:tc>
+          <w:tcPr>
+            <w:tcW w:w="0" w:type="auto"/>
+            <w:shd w:val="clear" w:color="auto" w:fill="F5F5F5"/>
+            <w:vAlign w:val="center"/>
+            <w:hideMark/>
+          </w:tcPr>
+          <w:p>
+            <w:pPr>
+              <w:numPr>
+                <w:ilvl w:val="0"/>
+                <w:numId w:val="40"/>
+              </w:numPr>
+              <w:rPr>
+                <w:b/>
+                <w:bCs/>
+              </w:rPr>
+            </w:pPr>
+            <w:r>
+              <w:rPr>
+                <w:b/>
+                <w:bCs/>
+              </w:rPr>
+              <w:t>Data envio</w:t>
+            </w:r>
+          </w:p>
+        </w:tc>
+        <w:tc>
+          <w:tcPr>
+            <w:tcW w:w="0" w:type="auto"/>
+            <w:shd w:val="clear" w:color="auto" w:fill="F5F5F5"/>
+            <w:vAlign w:val="center"/>
+            <w:hideMark/>
+          </w:tcPr>
+          <w:p>
+            <w:pPr>
+              <w:numPr>
+                <w:ilvl w:val="0"/>
+                <w:numId w:val="40"/>
+              </w:numPr>
+              <w:rPr>
+                <w:b/>
+                <w:bCs/>
+              </w:rPr>
+            </w:pPr>
+            <w:r>
+              <w:rPr>
+                <w:b/>
+                <w:bCs/>
+              </w:rPr>
+              <w:t>Data estimada</w:t>
+            </w:r>
+          </w:p>
+        </w:tc>
+        <w:tc>
+          <w:tcPr>
+            <w:tcW w:w="0" w:type="auto"/>
+            <w:shd w:val="clear" w:color="auto" w:fill="F5F5F5"/>
+            <w:vAlign w:val="center"/>
+            <w:hideMark/>
+          </w:tcPr>
+          <w:p>
+            <w:pPr>
+              <w:numPr>
+                <w:ilvl w:val="0"/>
+                <w:numId w:val="40"/>
+              </w:numPr>
+              <w:rPr>
+                <w:b/>
+                <w:bCs/>
+              </w:rPr>
+            </w:pPr>
+            <w:r>
+              <w:rPr>
+                <w:b/>
+                <w:bCs/>
+              </w:rPr>
+              <w:t>Data entrega</w:t>
+            </w:r>
+          </w:p>
+        </w:tc>
+      </w:tr>
+      <w:tr>
+        <w:trPr>
+          <w:tblCellSpacing w:w="15" w:type="dxa"/>
+        </w:trPr>
+        <w:tc>
+          <w:tcPr>
+            <w:tcW w:w="0" w:type="auto"/>
+            <w:shd w:val="clear" w:color="auto" w:fill="FFFFFF"/>
+            <w:noWrap/>
+            <w:vAlign w:val="center"/>
+            <w:hideMark/>
+          </w:tcPr>
+          <w:p>
+            <w:pPr>
+              <w:numPr>
+                <w:ilvl w:val="0"/>
+                <w:numId w:val="40"/>
+              </w:numPr>
+            </w:pPr>
+            <w:r>
+              <w:t>01/03/2022</w:t>
+            </w:r>
+          </w:p>
+        </w:tc>
+        <w:tc>
+          <w:tcPr>
+            <w:tcW w:w="0" w:type="auto"/>
+            <w:shd w:val="clear" w:color="auto" w:fill="FFFFFF"/>
+            <w:noWrap/>
+            <w:vAlign w:val="center"/>
+            <w:hideMark/>
+          </w:tcPr>
+          <w:p>
+            <w:pPr>
+              <w:numPr>
+                <w:ilvl w:val="0"/>
+                <w:numId w:val="40"/>
+              </w:numPr>
+            </w:pPr>
+            <w:r>
+              <w:t>14/03/2022</w:t>
+            </w:r>
+          </w:p>
+        </w:tc>
+        <w:tc>
+          <w:tcPr>
+            <w:tcW w:w="0" w:type="auto"/>
+            <w:shd w:val="clear" w:color="auto" w:fill="FFFFFF"/>
+            <w:noWrap/>
+            <w:vAlign w:val="center"/>
+            <w:hideMark/>
+          </w:tcPr>
+          <w:p>
+            <w:pPr>
+              <w:numPr>
+                <w:ilvl w:val="0"/>
+                <w:numId w:val="40"/>
+              </w:numPr>
+            </w:pPr>
+            <w:r>
+              <w:t>07/03/2022</w:t>
+            </w:r>
+          </w:p>
+        </w:tc>
+      </w:tr>
+      <w:tr>
+        <w:trPr>
+          <w:tblCellSpacing w:w="15" w:type="dxa"/>
+        </w:trPr>
+        <w:tc>
+          <w:tcPr>
+            <w:tcW w:w="0" w:type="auto"/>
+            <w:shd w:val="clear" w:color="auto" w:fill="FFFFFF"/>
+            <w:noWrap/>
+            <w:vAlign w:val="center"/>
+            <w:hideMark/>
+          </w:tcPr>
+          <w:p>
+            <w:pPr>
+              <w:numPr>
+                <w:ilvl w:val="0"/>
+                <w:numId w:val="40"/>
+              </w:numPr>
+            </w:pPr>
+            <w:r>
+              <w:t>15/04/2022</w:t>
+            </w:r>
+          </w:p>
+        </w:tc>
+        <w:tc>
+          <w:tcPr>
+            <w:tcW w:w="0" w:type="auto"/>
+            <w:shd w:val="clear" w:color="auto" w:fill="FFFFFF"/>
+            <w:noWrap/>
+            <w:vAlign w:val="center"/>
+            <w:hideMark/>
+          </w:tcPr>
+          <w:p>
+            <w:pPr>
+              <w:numPr>
+                <w:ilvl w:val="0"/>
+                <w:numId w:val="40"/>
+              </w:numPr>
+            </w:pPr>
+            <w:r>
+              <w:t>20/04/2022</w:t>
+            </w:r>
+          </w:p>
+        </w:tc>
+        <w:tc>
+          <w:tcPr>
+            <w:tcW w:w="0" w:type="auto"/>
+            <w:shd w:val="clear" w:color="auto" w:fill="FFFFFF"/>
+            <w:noWrap/>
+            <w:vAlign w:val="center"/>
+            <w:hideMark/>
+          </w:tcPr>
+          <w:p>
+            <w:pPr>
+              <w:numPr>
+                <w:ilvl w:val="0"/>
+                <w:numId w:val="40"/>
+              </w:numPr>
+            </w:pPr>
+            <w:r>
+              <w:t>23/04/2022</w:t>
+            </w:r>
+          </w:p>
+        </w:tc>
+      </w:tr>
+      <w:tr>
+        <w:trPr>
+          <w:tblCellSpacing w:w="15" w:type="dxa"/>
+        </w:trPr>
+        <w:tc>
+          <w:tcPr>
+            <w:tcW w:w="0" w:type="auto"/>
+            <w:shd w:val="clear" w:color="auto" w:fill="FFFFFF"/>
+            <w:noWrap/>
+            <w:vAlign w:val="center"/>
+            <w:hideMark/>
+          </w:tcPr>
+          <w:p>
+            <w:pPr>
+              <w:numPr>
+                <w:ilvl w:val="0"/>
+                <w:numId w:val="40"/>
+              </w:numPr>
+            </w:pPr>
+            <w:r>
+              <w:t>16/07/2022</w:t>
+            </w:r>
+          </w:p>
+        </w:tc>
+        <w:tc>
+          <w:tcPr>
+            <w:tcW w:w="0" w:type="auto"/>
+            <w:shd w:val="clear" w:color="auto" w:fill="FFFFFF"/>
+            <w:noWrap/>
+            <w:vAlign w:val="center"/>
+            <w:hideMark/>
+          </w:tcPr>
+          <w:p>
+            <w:pPr>
+              <w:numPr>
+                <w:ilvl w:val="0"/>
+                <w:numId w:val="40"/>
+              </w:numPr>
+            </w:pPr>
+            <w:r>
+              <w:t>30/07/2022</w:t>
+            </w:r>
+          </w:p>
+        </w:tc>
+        <w:tc>
+          <w:tcPr>
+            <w:tcW w:w="0" w:type="auto"/>
+            <w:shd w:val="clear" w:color="auto" w:fill="FFFFFF"/>
+            <w:noWrap/>
+            <w:vAlign w:val="center"/>
+            <w:hideMark/>
+          </w:tcPr>
+          <w:p>
+            <w:pPr>
+              <w:numPr>
+                <w:ilvl w:val="0"/>
+                <w:numId w:val="40"/>
+              </w:numPr>
+            </w:pPr>
+            <w:r>
+              <w:t>21/07/2022</w:t>
+            </w:r>
+          </w:p>
+        </w:tc>
+      </w:tr>
+      <w:tr>
+        <w:trPr>
+          <w:tblCellSpacing w:w="15" w:type="dxa"/>
+        </w:trPr>
+        <w:tc>
+          <w:tcPr>
+            <w:tcW w:w="0" w:type="auto"/>
+            <w:shd w:val="clear" w:color="auto" w:fill="FFFFFF"/>
+            <w:noWrap/>
+            <w:vAlign w:val="center"/>
+            <w:hideMark/>
+          </w:tcPr>
+          <w:p>
+            <w:pPr>
+              <w:numPr>
+                <w:ilvl w:val="0"/>
+                <w:numId w:val="40"/>
+              </w:numPr>
+            </w:pPr>
+            <w:r>
+              <w:t>18/09/2022</w:t>
+            </w:r>
+          </w:p>
+        </w:tc>
+        <w:tc>
+          <w:tcPr>
+            <w:tcW w:w="0" w:type="auto"/>
+            <w:shd w:val="clear" w:color="auto" w:fill="FFFFFF"/>
+            <w:noWrap/>
+            <w:vAlign w:val="center"/>
+            <w:hideMark/>
+          </w:tcPr>
+          <w:p>
+            <w:pPr>
+              <w:numPr>
+                <w:ilvl w:val="0"/>
+                <w:numId w:val="40"/>
+              </w:numPr>
+            </w:pPr>
+            <w:r>
+              <w:t>25/09/2022</w:t>
+            </w:r>
+          </w:p>
+        </w:tc>
+        <w:tc>
+          <w:tcPr>
+            <w:tcW w:w="0" w:type="auto"/>
+            <w:shd w:val="clear" w:color="auto" w:fill="FFFFFF"/>
+            <w:noWrap/>
+            <w:vAlign w:val="center"/>
+            <w:hideMark/>
+          </w:tcPr>
+          <w:p>
+            <w:pPr>
+              <w:numPr>
+                <w:ilvl w:val="0"/>
+                <w:numId w:val="40"/>
+              </w:numPr>
+            </w:pPr>
+            <w:r>
+              <w:t>Em transporte</w:t>
+            </w:r>
+          </w:p>
+        </w:tc>
+      </w:tr>
+    </w:tbl>
+    <w:p>
+      <w:pPr>
+        <w:numPr>
+          <w:ilvl w:val="0"/>
+          <w:numId w:val="40"/>
+        </w:numPr>
+      </w:pPr>
+      <w:r>
+        <w:lastRenderedPageBreak/>
+        <w:t>Como podemos estruturar o código, adicionando uma coluna personalizada, para obter a diferença em dias da data de entrega e a data de envio?</w:t>
+      </w:r>
+    </w:p>
+    <w:p>
+      <w:pPr>
+        <w:numPr>
+          <w:ilvl w:val="0"/>
+          <w:numId w:val="40"/>
+        </w:numPr>
+      </w:pPr>
+      <w:r>
+        <w:t>O resultado precisa ser dessa forma:</w:t>
+      </w:r>
+    </w:p>
+    <w:tbl>
+      <w:tblPr>
+        <w:tblW w:w="0" w:type="auto"/>
+        <w:tblCellSpacing w:w="15" w:type="dxa"/>
+        <w:tblBorders>
+          <w:top w:val="single" w:sz="6" w:space="0" w:color="DDDDDD"/>
+          <w:left w:val="single" w:sz="6" w:space="0" w:color="DDDDDD"/>
+          <w:bottom w:val="single" w:sz="6" w:space="0" w:color="DDDDDD"/>
+          <w:right w:val="single" w:sz="6" w:space="0" w:color="DDDDDD"/>
+        </w:tblBorders>
+        <w:shd w:val="clear" w:color="auto" w:fill="FFFFFF"/>
+        <w:tblCellMar>
+          <w:left w:w="0" w:type="dxa"/>
+          <w:right w:w="0" w:type="dxa"/>
+        </w:tblCellMar>
+        <w:tblLook w:val="04A0" w:firstRow="1" w:lastRow="0" w:firstColumn="1" w:lastColumn="0" w:noHBand="0" w:noVBand="1"/>
+      </w:tblPr>
+      <w:tblGrid>
+        <w:gridCol w:w="1519"/>
+      </w:tblGrid>
+      <w:tr>
+        <w:trPr>
+          <w:tblHeader/>
+          <w:tblCellSpacing w:w="15" w:type="dxa"/>
+        </w:trPr>
+        <w:tc>
+          <w:tcPr>
+            <w:tcW w:w="0" w:type="auto"/>
+            <w:shd w:val="clear" w:color="auto" w:fill="F5F5F5"/>
+            <w:vAlign w:val="center"/>
+            <w:hideMark/>
+          </w:tcPr>
+          <w:p>
+            <w:pPr>
+              <w:numPr>
+                <w:ilvl w:val="0"/>
+                <w:numId w:val="40"/>
+              </w:numPr>
+              <w:rPr>
+                <w:b/>
+                <w:bCs/>
+              </w:rPr>
+            </w:pPr>
+            <w:r>
+              <w:rPr>
+                <w:b/>
+                <w:bCs/>
+              </w:rPr>
+              <w:t>Status</w:t>
+            </w:r>
+          </w:p>
+        </w:tc>
+      </w:tr>
+      <w:tr>
+        <w:trPr>
+          <w:tblCellSpacing w:w="15" w:type="dxa"/>
+        </w:trPr>
+        <w:tc>
+          <w:tcPr>
+            <w:tcW w:w="0" w:type="auto"/>
+            <w:shd w:val="clear" w:color="auto" w:fill="FFFFFF"/>
+            <w:noWrap/>
+            <w:vAlign w:val="center"/>
+            <w:hideMark/>
+          </w:tcPr>
+          <w:p>
+            <w:pPr>
+              <w:numPr>
+                <w:ilvl w:val="0"/>
+                <w:numId w:val="40"/>
+              </w:numPr>
+            </w:pPr>
+            <w:r>
+              <w:t>6</w:t>
+            </w:r>
+          </w:p>
+        </w:tc>
+      </w:tr>
+      <w:tr>
+        <w:trPr>
+          <w:tblCellSpacing w:w="15" w:type="dxa"/>
+        </w:trPr>
+        <w:tc>
+          <w:tcPr>
+            <w:tcW w:w="0" w:type="auto"/>
+            <w:shd w:val="clear" w:color="auto" w:fill="FFFFFF"/>
+            <w:noWrap/>
+            <w:vAlign w:val="center"/>
+            <w:hideMark/>
+          </w:tcPr>
+          <w:p>
+            <w:pPr>
+              <w:numPr>
+                <w:ilvl w:val="0"/>
+                <w:numId w:val="40"/>
+              </w:numPr>
+            </w:pPr>
+            <w:r>
+              <w:t>8</w:t>
+            </w:r>
+          </w:p>
+        </w:tc>
+      </w:tr>
+      <w:tr>
+        <w:trPr>
+          <w:tblCellSpacing w:w="15" w:type="dxa"/>
+        </w:trPr>
+        <w:tc>
+          <w:tcPr>
+            <w:tcW w:w="0" w:type="auto"/>
+            <w:shd w:val="clear" w:color="auto" w:fill="FFFFFF"/>
+            <w:noWrap/>
+            <w:vAlign w:val="center"/>
+            <w:hideMark/>
+          </w:tcPr>
+          <w:p>
+            <w:pPr>
+              <w:numPr>
+                <w:ilvl w:val="0"/>
+                <w:numId w:val="40"/>
+              </w:numPr>
+            </w:pPr>
+            <w:r>
+              <w:t>5</w:t>
+            </w:r>
+          </w:p>
+        </w:tc>
+      </w:tr>
+      <w:tr>
+        <w:trPr>
+          <w:tblCellSpacing w:w="15" w:type="dxa"/>
+        </w:trPr>
+        <w:tc>
+          <w:tcPr>
+            <w:tcW w:w="0" w:type="auto"/>
+            <w:shd w:val="clear" w:color="auto" w:fill="FFFFFF"/>
+            <w:noWrap/>
+            <w:vAlign w:val="center"/>
+            <w:hideMark/>
+          </w:tcPr>
+          <w:p>
+            <w:pPr>
+              <w:numPr>
+                <w:ilvl w:val="0"/>
+                <w:numId w:val="40"/>
+              </w:numPr>
+            </w:pPr>
+            <w:proofErr w:type="spellStart"/>
+            <w:r>
+              <w:t>null</w:t>
+            </w:r>
+            <w:proofErr w:type="spellEnd"/>
+          </w:p>
+        </w:tc>
+      </w:tr>
+    </w:tbl>
+    <w:p>
+      <w:pPr>
+        <w:numPr>
+          <w:ilvl w:val="0"/>
+          <w:numId w:val="40"/>
+        </w:numPr>
+      </w:pPr>
+      <w:r>
+        <w:t>Caso você queira realizar testes, segue o código da tabela em M para você inserir em uma consulta nula:</w:t>
+      </w:r>
+    </w:p>
+    <w:p>
+      <w:pPr>
+        <w:numPr>
+          <w:ilvl w:val="0"/>
+          <w:numId w:val="40"/>
+        </w:numPr>
+      </w:pPr>
+      <w:proofErr w:type="spellStart"/>
+      <w:r>
+        <w:t>let</w:t>
+      </w:r>
+      <w:proofErr w:type="spellEnd"/>
+    </w:p>
+    <w:p>
+      <w:pPr>
+        <w:numPr>
+          <w:ilvl w:val="0"/>
+          <w:numId w:val="40"/>
+        </w:numPr>
+      </w:pPr>
+      <w:r>
+        <w:t xml:space="preserve">    Fonte = Table.FromRows(Json.Document(Binary.Decompress(Binary.FromText("i45WMjDUNzDWNzIwMlLSUTI0QeIYmMM5sTrRSoam+gYmMDkjA2SOMZwDVmimD9QKlTM2QOIYGcI5YIUW+gaWcDlTJI5rrkJJUWJecUF+UUmqUmwsAA==", BinaryEncoding.Base64), </w:t>
+      </w:r>
+      <w:proofErr w:type="spellStart"/>
+      <w:r>
+        <w:t>Compression.Deflate</w:t>
+      </w:r>
+      <w:proofErr w:type="spellEnd"/>
+      <w:r>
+        <w:t xml:space="preserve">)), </w:t>
+      </w:r>
+      <w:proofErr w:type="spellStart"/>
+      <w:r>
+        <w:t>let</w:t>
+      </w:r>
+      <w:proofErr w:type="spellEnd"/>
+      <w:r>
+        <w:t xml:space="preserve"> _t = ((</w:t>
+      </w:r>
+      <w:proofErr w:type="spellStart"/>
+      <w:r>
+        <w:t>type</w:t>
+      </w:r>
+      <w:proofErr w:type="spellEnd"/>
+      <w:r>
+        <w:t xml:space="preserve"> </w:t>
+      </w:r>
+      <w:proofErr w:type="spellStart"/>
+      <w:r>
+        <w:t>nullable</w:t>
+      </w:r>
+      <w:proofErr w:type="spellEnd"/>
+      <w:r>
+        <w:t xml:space="preserve"> </w:t>
+      </w:r>
+      <w:proofErr w:type="spellStart"/>
+      <w:r>
+        <w:t>text</w:t>
+      </w:r>
+      <w:proofErr w:type="spellEnd"/>
+      <w:r>
+        <w:t>) meta [</w:t>
+      </w:r>
+      <w:proofErr w:type="spellStart"/>
+      <w:r>
+        <w:t>Serialized.Text</w:t>
+      </w:r>
+      <w:proofErr w:type="spellEnd"/>
+      <w:r>
+        <w:t xml:space="preserve"> = </w:t>
+      </w:r>
+      <w:proofErr w:type="spellStart"/>
+      <w:r>
+        <w:rPr>
+          <w:b/>
+          <w:bCs/>
+        </w:rPr>
+        <w:t>true</w:t>
+      </w:r>
+      <w:proofErr w:type="spellEnd"/>
+      <w:r>
+        <w:t xml:space="preserve">]) </w:t>
+      </w:r>
+      <w:r>
+        <w:rPr>
+          <w:b/>
+          <w:bCs/>
+        </w:rPr>
+        <w:t>in</w:t>
+      </w:r>
+      <w:r>
+        <w:t xml:space="preserve"> </w:t>
+      </w:r>
+      <w:proofErr w:type="spellStart"/>
+      <w:r>
+        <w:t>type</w:t>
+      </w:r>
+      <w:proofErr w:type="spellEnd"/>
+      <w:r>
+        <w:t xml:space="preserve"> </w:t>
+      </w:r>
+      <w:proofErr w:type="spellStart"/>
+      <w:r>
+        <w:t>table</w:t>
+      </w:r>
+      <w:proofErr w:type="spellEnd"/>
+      <w:r>
+        <w:t xml:space="preserve"> [#"Data envio" = _t, #"Data estimada" = _t, #"Data entrega" = _t]),</w:t>
+      </w:r>
+    </w:p>
+    <w:p>
+      <w:pPr>
+        <w:numPr>
+          <w:ilvl w:val="0"/>
+          <w:numId w:val="40"/>
+        </w:numPr>
+      </w:pPr>
+      <w:r>
+        <w:t xml:space="preserve">    #"Tipo Alterado" = </w:t>
+      </w:r>
+      <w:proofErr w:type="spellStart"/>
+      <w:r>
+        <w:t>Table.TransformColumnTypes</w:t>
+      </w:r>
+      <w:proofErr w:type="spellEnd"/>
+      <w:r>
+        <w:t xml:space="preserve">(Fonte,{{"Data envio", </w:t>
+      </w:r>
+      <w:proofErr w:type="spellStart"/>
+      <w:r>
+        <w:t>type</w:t>
+      </w:r>
+      <w:proofErr w:type="spellEnd"/>
+      <w:r>
+        <w:t xml:space="preserve"> date}, {"Data estimada", </w:t>
+      </w:r>
+      <w:proofErr w:type="spellStart"/>
+      <w:r>
+        <w:t>type</w:t>
+      </w:r>
+      <w:proofErr w:type="spellEnd"/>
+      <w:r>
+        <w:t xml:space="preserve"> date}, {"Data entrega", </w:t>
+      </w:r>
+      <w:proofErr w:type="spellStart"/>
+      <w:r>
+        <w:t>type</w:t>
+      </w:r>
+      <w:proofErr w:type="spellEnd"/>
+      <w:r>
+        <w:t xml:space="preserve"> </w:t>
+      </w:r>
+      <w:proofErr w:type="spellStart"/>
+      <w:r>
+        <w:t>text</w:t>
+      </w:r>
+      <w:proofErr w:type="spellEnd"/>
+      <w:r>
+        <w:t>}})</w:t>
+      </w:r>
+    </w:p>
+    <w:p>
+      <w:pPr>
+        <w:numPr>
+          <w:ilvl w:val="0"/>
+          <w:numId w:val="40"/>
+        </w:numPr>
+      </w:pPr>
+      <w:r>
+        <w:rPr>
+          <w:b/>
+          <w:bCs/>
+        </w:rPr>
+        <w:t>in</w:t>
+      </w:r>
+    </w:p>
+    <w:p>
+      <w:pPr>
+        <w:numPr>
+          <w:ilvl w:val="0"/>
+          <w:numId w:val="40"/>
+        </w:numPr>
+      </w:pPr>
+      <w:r>
+        <w:t xml:space="preserve">    #"Tipo </w:t>
+      </w:r>
+      <w:proofErr w:type="spellStart"/>
+      <w:r>
+        <w:t>Alterado"Copiar</w:t>
+      </w:r>
+      <w:proofErr w:type="spellEnd"/>
+      <w:r>
+        <w:t xml:space="preserve"> código</w:t>
+      </w:r>
+    </w:p>
+    <w:p>
+      <w:pPr>
+        <w:numPr>
+          <w:ilvl w:val="0"/>
+          <w:numId w:val="40"/>
+        </w:numPr>
         <w:rPr>
           <w:vanish/>
         </w:rPr>
@@ -12113,7 +14185,416 @@
         <w:rPr>
           <w:vanish/>
         </w:rPr>
+        <w:t>Parte superior do formulário</w:t>
+      </w:r>
+    </w:p>
+    <w:p>
+      <w:pPr>
+        <w:numPr>
+          <w:ilvl w:val="0"/>
+          <w:numId w:val="40"/>
+        </w:numPr>
+      </w:pPr>
+      <w:r>
+        <w:t>Alternativa correta</w:t>
+      </w:r>
+    </w:p>
+    <w:p>
+      <w:pPr>
+        <w:numPr>
+          <w:ilvl w:val="0"/>
+          <w:numId w:val="40"/>
+        </w:numPr>
+      </w:pPr>
+      <w:proofErr w:type="spellStart"/>
+      <w:r>
+        <w:rPr>
+          <w:b/>
+          <w:bCs/>
+        </w:rPr>
+        <w:t>try</w:t>
+      </w:r>
+      <w:proofErr w:type="spellEnd"/>
+      <w:r>
+        <w:t xml:space="preserve"> </w:t>
+      </w:r>
+      <w:proofErr w:type="spellStart"/>
+      <w:r>
+        <w:rPr>
+          <w:b/>
+          <w:bCs/>
+        </w:rPr>
+        <w:t>Date</w:t>
+      </w:r>
+      <w:r>
+        <w:t>.</w:t>
+      </w:r>
+      <w:r>
+        <w:rPr>
+          <w:b/>
+          <w:bCs/>
+        </w:rPr>
+        <w:t>FromText</w:t>
+      </w:r>
+      <w:proofErr w:type="spellEnd"/>
+      <w:r>
+        <w:t>([</w:t>
+      </w:r>
+      <w:r>
+        <w:rPr>
+          <w:b/>
+          <w:bCs/>
+        </w:rPr>
+        <w:t>Data</w:t>
+      </w:r>
+      <w:r>
+        <w:t xml:space="preserve"> entrega])-[</w:t>
+      </w:r>
+      <w:r>
+        <w:rPr>
+          <w:b/>
+          <w:bCs/>
+        </w:rPr>
+        <w:t>Data</w:t>
+      </w:r>
+      <w:r>
+        <w:t xml:space="preserve"> envio] </w:t>
+      </w:r>
+      <w:proofErr w:type="spellStart"/>
+      <w:r>
+        <w:t>otherwise</w:t>
+      </w:r>
+      <w:proofErr w:type="spellEnd"/>
+      <w:r>
+        <w:t xml:space="preserve"> </w:t>
+      </w:r>
+      <w:proofErr w:type="spellStart"/>
+      <w:r>
+        <w:rPr>
+          <w:b/>
+          <w:bCs/>
+        </w:rPr>
+        <w:t>null</w:t>
+      </w:r>
+      <w:proofErr w:type="spellEnd"/>
+    </w:p>
+    <w:p>
+      <w:pPr>
+        <w:numPr>
+          <w:ilvl w:val="0"/>
+          <w:numId w:val="40"/>
+        </w:numPr>
+      </w:pPr>
+      <w:r>
+        <w:t>Alternativa correta</w:t>
+      </w:r>
+    </w:p>
+    <w:p>
+      <w:pPr>
+        <w:numPr>
+          <w:ilvl w:val="0"/>
+          <w:numId w:val="40"/>
+        </w:numPr>
+        <w:rPr>
+          <w:lang w:val="en-US"/>
+        </w:rPr>
+      </w:pPr>
+      <w:r>
+        <w:rPr>
+          <w:b/>
+          <w:bCs/>
+          <w:lang w:val="en-US"/>
+        </w:rPr>
+        <w:t>try</w:t>
+      </w:r>
+      <w:r>
+        <w:rPr>
+          <w:lang w:val="en-US"/>
+        </w:rPr>
+        <w:t xml:space="preserve"> </w:t>
+      </w:r>
+      <w:r>
+        <w:rPr>
+          <w:b/>
+          <w:bCs/>
+          <w:lang w:val="en-US"/>
+        </w:rPr>
+        <w:t>Duration</w:t>
+      </w:r>
+      <w:r>
+        <w:rPr>
+          <w:lang w:val="en-US"/>
+        </w:rPr>
+        <w:t>.</w:t>
+      </w:r>
+      <w:r>
+        <w:rPr>
+          <w:b/>
+          <w:bCs/>
+          <w:lang w:val="en-US"/>
+        </w:rPr>
+        <w:t>Days</w:t>
+      </w:r>
+      <w:r>
+        <w:rPr>
+          <w:lang w:val="en-US"/>
+        </w:rPr>
+        <w:t>(</w:t>
+      </w:r>
+      <w:r>
+        <w:rPr>
+          <w:b/>
+          <w:bCs/>
+          <w:lang w:val="en-US"/>
+        </w:rPr>
+        <w:t>Date</w:t>
+      </w:r>
+      <w:r>
+        <w:rPr>
+          <w:lang w:val="en-US"/>
+        </w:rPr>
+        <w:t>.</w:t>
+      </w:r>
+      <w:r>
+        <w:rPr>
+          <w:b/>
+          <w:bCs/>
+          <w:lang w:val="en-US"/>
+        </w:rPr>
+        <w:t>FromText</w:t>
+      </w:r>
+      <w:r>
+        <w:rPr>
+          <w:lang w:val="en-US"/>
+        </w:rPr>
+        <w:t>([</w:t>
+      </w:r>
+      <w:r>
+        <w:rPr>
+          <w:b/>
+          <w:bCs/>
+          <w:lang w:val="en-US"/>
+        </w:rPr>
+        <w:t>Data</w:t>
+      </w:r>
+      <w:r>
+        <w:rPr>
+          <w:lang w:val="en-US"/>
+        </w:rPr>
+        <w:t xml:space="preserve"> entrega])-[</w:t>
+      </w:r>
+      <w:r>
+        <w:rPr>
+          <w:b/>
+          <w:bCs/>
+          <w:lang w:val="en-US"/>
+        </w:rPr>
+        <w:t>Data</w:t>
+      </w:r>
+      <w:r>
+        <w:rPr>
+          <w:lang w:val="en-US"/>
+        </w:rPr>
+        <w:t xml:space="preserve"> envio]) otherwise </w:t>
+      </w:r>
+      <w:r>
+        <w:rPr>
+          <w:b/>
+          <w:bCs/>
+          <w:lang w:val="en-US"/>
+        </w:rPr>
+        <w:t>null</w:t>
+      </w:r>
+    </w:p>
+    <w:p>
+      <w:pPr>
+        <w:numPr>
+          <w:ilvl w:val="0"/>
+          <w:numId w:val="40"/>
+        </w:numPr>
+      </w:pPr>
+      <w:r>
+        <w:t>Para se obter a diferença entre datas em dias, é preciso usar a função </w:t>
+      </w:r>
+      <w:proofErr w:type="spellStart"/>
+      <w:r>
+        <w:t>Duration.Days</w:t>
+      </w:r>
+      <w:proofErr w:type="spellEnd"/>
+      <w:r>
+        <w:t>(), não esquecendo de transformar a coluna </w:t>
+      </w:r>
+      <w:r>
+        <w:rPr>
+          <w:i/>
+          <w:iCs/>
+        </w:rPr>
+        <w:t>Data entrega</w:t>
+      </w:r>
+      <w:r>
+        <w:t xml:space="preserve"> de texto para data para fazer a subtração. Com essa estrutura, </w:t>
+      </w:r>
+      <w:r>
+        <w:lastRenderedPageBreak/>
+        <w:t xml:space="preserve">podemos utilizar o </w:t>
+      </w:r>
+      <w:proofErr w:type="spellStart"/>
+      <w:r>
+        <w:t>try</w:t>
+      </w:r>
+      <w:proofErr w:type="spellEnd"/>
+      <w:r>
+        <w:t>…</w:t>
+      </w:r>
+      <w:proofErr w:type="spellStart"/>
+      <w:r>
+        <w:t>otherwise</w:t>
+      </w:r>
+      <w:proofErr w:type="spellEnd"/>
+      <w:r>
+        <w:t xml:space="preserve"> para tratar possíveis erros durante a subtração.</w:t>
+      </w:r>
+    </w:p>
+    <w:p>
+      <w:pPr>
+        <w:numPr>
+          <w:ilvl w:val="0"/>
+          <w:numId w:val="40"/>
+        </w:numPr>
+      </w:pPr>
+      <w:r>
+        <w:t>Alternativa correta</w:t>
+      </w:r>
+    </w:p>
+    <w:p>
+      <w:pPr>
+        <w:numPr>
+          <w:ilvl w:val="0"/>
+          <w:numId w:val="40"/>
+        </w:numPr>
+      </w:pPr>
+      <w:proofErr w:type="spellStart"/>
+      <w:r>
+        <w:t>Date.FromText</w:t>
+      </w:r>
+      <w:proofErr w:type="spellEnd"/>
+      <w:r>
+        <w:t>([Data entrega])-[Data envio]</w:t>
+      </w:r>
+    </w:p>
+    <w:p>
+      <w:pPr>
+        <w:numPr>
+          <w:ilvl w:val="0"/>
+          <w:numId w:val="40"/>
+        </w:numPr>
+        <w:rPr>
+          <w:vanish/>
+        </w:rPr>
+      </w:pPr>
+      <w:r>
+        <w:rPr>
+          <w:vanish/>
+        </w:rPr>
         <w:t>Parte inferior do formulário</w:t>
+      </w:r>
+    </w:p>
+    <w:p>
+      <w:pPr>
+        <w:ind w:left="720"/>
+        <w:rPr>
+          <w:vanish/>
+        </w:rPr>
+      </w:pPr>
+    </w:p>
+    <w:p>
+      <w:pPr>
+        <w:rPr>
+          <w:vanish/>
+        </w:rPr>
+      </w:pPr>
+      <w:r>
+        <w:rPr>
+          <w:vanish/>
+        </w:rPr>
+        <w:t>Parte inferior do formulário</w:t>
+      </w:r>
+    </w:p>
+    <w:p>
+      <w:pPr>
+        <w:rPr>
+          <w:vanish/>
+        </w:rPr>
+      </w:pPr>
+      <w:r>
+        <w:rPr>
+          <w:vanish/>
+        </w:rPr>
+        <w:t>Parte inferior do formulário</w:t>
+      </w:r>
+    </w:p>
+    <w:p>
+      <w:r>
+        <w:t>No início da caminhada, entendemos o que é a linguagem M e qual a sua importância, seguindo com o desdobramento dos fundamentos da linguagem, assim possibilitando diversos caminhos de soluções. Por fim, conseguimos aplicar todo esse conhecimento desenvolvendo um projeto que retorna dados de uma API de forma estruturada.</w:t>
+      </w:r>
+    </w:p>
+    <w:p>
+      <w:r>
+        <w:t>Agora que nós temos esses dados, o que podemos fazer com eles?</w:t>
+      </w:r>
+    </w:p>
+    <w:p>
+      <w:r>
+        <w:t>É exatamente a proposta do desafio: que tal desenvolver um dashboard com algumas informações relevantes sobre os dados importados?</w:t>
+      </w:r>
+    </w:p>
+    <w:p>
+      <w:r>
+        <w:t>Para ajudar nesta etapa, deixo algumas perguntas que podem te auxiliar no processo de desenvolvimento:</w:t>
+      </w:r>
+    </w:p>
+    <w:p>
+      <w:pPr>
+        <w:numPr>
+          <w:ilvl w:val="0"/>
+          <w:numId w:val="42"/>
+        </w:numPr>
+      </w:pPr>
+      <w:r>
+        <w:t>Quantas pessoas estão cadastradas na API?</w:t>
+      </w:r>
+    </w:p>
+    <w:p>
+      <w:pPr>
+        <w:numPr>
+          <w:ilvl w:val="0"/>
+          <w:numId w:val="42"/>
+        </w:numPr>
+      </w:pPr>
+      <w:r>
+        <w:t>Quantas pessoas médicas temos em cada uma das especialidades?</w:t>
+      </w:r>
+    </w:p>
+    <w:p>
+      <w:pPr>
+        <w:numPr>
+          <w:ilvl w:val="0"/>
+          <w:numId w:val="42"/>
+        </w:numPr>
+      </w:pPr>
+      <w:r>
+        <w:t>É possível selecionar uma especialidade e retornar pessoas médicas pertencentes?</w:t>
+      </w:r>
+    </w:p>
+    <w:p>
+      <w:pPr>
+        <w:numPr>
+          <w:ilvl w:val="0"/>
+          <w:numId w:val="42"/>
+        </w:numPr>
+      </w:pPr>
+      <w:r>
+        <w:t>Como obtenho as informações sobre a pessoa médica?</w:t>
       </w:r>
     </w:p>
     <w:p/>
@@ -12875,6 +15356,155 @@
     </w:lvl>
   </w:abstractNum>
   <w:abstractNum w:abstractNumId="5" w15:restartNumberingAfterBreak="0">
+    <w:nsid w:val="077965BD"/>
+    <w:multiLevelType w:val="multilevel"/>
+    <w:tmpl w:val="87A43F88"/>
+    <w:lvl w:ilvl="0">
+      <w:start w:val="1"/>
+      <w:numFmt w:val="bullet"/>
+      <w:lvlText w:val=""/>
+      <w:lvlJc w:val="left"/>
+      <w:pPr>
+        <w:tabs>
+          <w:tab w:val="num" w:pos="720"/>
+        </w:tabs>
+        <w:ind w:left="720" w:hanging="360"/>
+      </w:pPr>
+      <w:rPr>
+        <w:rFonts w:ascii="Symbol" w:hAnsi="Symbol" w:hint="default"/>
+        <w:sz w:val="20"/>
+      </w:rPr>
+    </w:lvl>
+    <w:lvl w:ilvl="1" w:tentative="1">
+      <w:start w:val="1"/>
+      <w:numFmt w:val="bullet"/>
+      <w:lvlText w:val="o"/>
+      <w:lvlJc w:val="left"/>
+      <w:pPr>
+        <w:tabs>
+          <w:tab w:val="num" w:pos="1440"/>
+        </w:tabs>
+        <w:ind w:left="1440" w:hanging="360"/>
+      </w:pPr>
+      <w:rPr>
+        <w:rFonts w:ascii="Courier New" w:hAnsi="Courier New" w:hint="default"/>
+        <w:sz w:val="20"/>
+      </w:rPr>
+    </w:lvl>
+    <w:lvl w:ilvl="2" w:tentative="1">
+      <w:start w:val="1"/>
+      <w:numFmt w:val="bullet"/>
+      <w:lvlText w:val=""/>
+      <w:lvlJc w:val="left"/>
+      <w:pPr>
+        <w:tabs>
+          <w:tab w:val="num" w:pos="2160"/>
+        </w:tabs>
+        <w:ind w:left="2160" w:hanging="360"/>
+      </w:pPr>
+      <w:rPr>
+        <w:rFonts w:ascii="Wingdings" w:hAnsi="Wingdings" w:hint="default"/>
+        <w:sz w:val="20"/>
+      </w:rPr>
+    </w:lvl>
+    <w:lvl w:ilvl="3" w:tentative="1">
+      <w:start w:val="1"/>
+      <w:numFmt w:val="bullet"/>
+      <w:lvlText w:val=""/>
+      <w:lvlJc w:val="left"/>
+      <w:pPr>
+        <w:tabs>
+          <w:tab w:val="num" w:pos="2880"/>
+        </w:tabs>
+        <w:ind w:left="2880" w:hanging="360"/>
+      </w:pPr>
+      <w:rPr>
+        <w:rFonts w:ascii="Wingdings" w:hAnsi="Wingdings" w:hint="default"/>
+        <w:sz w:val="20"/>
+      </w:rPr>
+    </w:lvl>
+    <w:lvl w:ilvl="4" w:tentative="1">
+      <w:start w:val="1"/>
+      <w:numFmt w:val="bullet"/>
+      <w:lvlText w:val=""/>
+      <w:lvlJc w:val="left"/>
+      <w:pPr>
+        <w:tabs>
+          <w:tab w:val="num" w:pos="3600"/>
+        </w:tabs>
+        <w:ind w:left="3600" w:hanging="360"/>
+      </w:pPr>
+      <w:rPr>
+        <w:rFonts w:ascii="Wingdings" w:hAnsi="Wingdings" w:hint="default"/>
+        <w:sz w:val="20"/>
+      </w:rPr>
+    </w:lvl>
+    <w:lvl w:ilvl="5" w:tentative="1">
+      <w:start w:val="1"/>
+      <w:numFmt w:val="bullet"/>
+      <w:lvlText w:val=""/>
+      <w:lvlJc w:val="left"/>
+      <w:pPr>
+        <w:tabs>
+          <w:tab w:val="num" w:pos="4320"/>
+        </w:tabs>
+        <w:ind w:left="4320" w:hanging="360"/>
+      </w:pPr>
+      <w:rPr>
+        <w:rFonts w:ascii="Wingdings" w:hAnsi="Wingdings" w:hint="default"/>
+        <w:sz w:val="20"/>
+      </w:rPr>
+    </w:lvl>
+    <w:lvl w:ilvl="6" w:tentative="1">
+      <w:start w:val="1"/>
+      <w:numFmt w:val="bullet"/>
+      <w:lvlText w:val=""/>
+      <w:lvlJc w:val="left"/>
+      <w:pPr>
+        <w:tabs>
+          <w:tab w:val="num" w:pos="5040"/>
+        </w:tabs>
+        <w:ind w:left="5040" w:hanging="360"/>
+      </w:pPr>
+      <w:rPr>
+        <w:rFonts w:ascii="Wingdings" w:hAnsi="Wingdings" w:hint="default"/>
+        <w:sz w:val="20"/>
+      </w:rPr>
+    </w:lvl>
+    <w:lvl w:ilvl="7" w:tentative="1">
+      <w:start w:val="1"/>
+      <w:numFmt w:val="bullet"/>
+      <w:lvlText w:val=""/>
+      <w:lvlJc w:val="left"/>
+      <w:pPr>
+        <w:tabs>
+          <w:tab w:val="num" w:pos="5760"/>
+        </w:tabs>
+        <w:ind w:left="5760" w:hanging="360"/>
+      </w:pPr>
+      <w:rPr>
+        <w:rFonts w:ascii="Wingdings" w:hAnsi="Wingdings" w:hint="default"/>
+        <w:sz w:val="20"/>
+      </w:rPr>
+    </w:lvl>
+    <w:lvl w:ilvl="8" w:tentative="1">
+      <w:start w:val="1"/>
+      <w:numFmt w:val="bullet"/>
+      <w:lvlText w:val=""/>
+      <w:lvlJc w:val="left"/>
+      <w:pPr>
+        <w:tabs>
+          <w:tab w:val="num" w:pos="6480"/>
+        </w:tabs>
+        <w:ind w:left="6480" w:hanging="360"/>
+      </w:pPr>
+      <w:rPr>
+        <w:rFonts w:ascii="Wingdings" w:hAnsi="Wingdings" w:hint="default"/>
+        <w:sz w:val="20"/>
+      </w:rPr>
+    </w:lvl>
+  </w:abstractNum>
+  <w:abstractNum w:abstractNumId="6" w15:restartNumberingAfterBreak="0">
     <w:nsid w:val="0E9B0080"/>
     <w:multiLevelType w:val="multilevel"/>
     <w:tmpl w:val="B57CFF6C"/>
@@ -13023,7 +15653,7 @@
       </w:rPr>
     </w:lvl>
   </w:abstractNum>
-  <w:abstractNum w:abstractNumId="6" w15:restartNumberingAfterBreak="0">
+  <w:abstractNum w:abstractNumId="7" w15:restartNumberingAfterBreak="0">
     <w:nsid w:val="0F54381B"/>
     <w:multiLevelType w:val="multilevel"/>
     <w:tmpl w:val="2CB69EBC"/>
@@ -13172,7 +15802,7 @@
       </w:rPr>
     </w:lvl>
   </w:abstractNum>
-  <w:abstractNum w:abstractNumId="7" w15:restartNumberingAfterBreak="0">
+  <w:abstractNum w:abstractNumId="8" w15:restartNumberingAfterBreak="0">
     <w:nsid w:val="117742F8"/>
     <w:multiLevelType w:val="multilevel"/>
     <w:tmpl w:val="AE6AC1DC"/>
@@ -13321,7 +15951,7 @@
       </w:rPr>
     </w:lvl>
   </w:abstractNum>
-  <w:abstractNum w:abstractNumId="8" w15:restartNumberingAfterBreak="0">
+  <w:abstractNum w:abstractNumId="9" w15:restartNumberingAfterBreak="0">
     <w:nsid w:val="152C7B9B"/>
     <w:multiLevelType w:val="multilevel"/>
     <w:tmpl w:val="6AEC41A6"/>
@@ -13470,7 +16100,7 @@
       </w:rPr>
     </w:lvl>
   </w:abstractNum>
-  <w:abstractNum w:abstractNumId="9" w15:restartNumberingAfterBreak="0">
+  <w:abstractNum w:abstractNumId="10" w15:restartNumberingAfterBreak="0">
     <w:nsid w:val="160C7782"/>
     <w:multiLevelType w:val="multilevel"/>
     <w:tmpl w:val="F2568C08"/>
@@ -13619,7 +16249,7 @@
       </w:rPr>
     </w:lvl>
   </w:abstractNum>
-  <w:abstractNum w:abstractNumId="10" w15:restartNumberingAfterBreak="0">
+  <w:abstractNum w:abstractNumId="11" w15:restartNumberingAfterBreak="0">
     <w:nsid w:val="19254B70"/>
     <w:multiLevelType w:val="multilevel"/>
     <w:tmpl w:val="8654ABCA"/>
@@ -13768,7 +16398,7 @@
       </w:rPr>
     </w:lvl>
   </w:abstractNum>
-  <w:abstractNum w:abstractNumId="11" w15:restartNumberingAfterBreak="0">
+  <w:abstractNum w:abstractNumId="12" w15:restartNumberingAfterBreak="0">
     <w:nsid w:val="1BB7009A"/>
     <w:multiLevelType w:val="multilevel"/>
     <w:tmpl w:val="9E40AC00"/>
@@ -13917,7 +16547,7 @@
       </w:rPr>
     </w:lvl>
   </w:abstractNum>
-  <w:abstractNum w:abstractNumId="12" w15:restartNumberingAfterBreak="0">
+  <w:abstractNum w:abstractNumId="13" w15:restartNumberingAfterBreak="0">
     <w:nsid w:val="1D103897"/>
     <w:multiLevelType w:val="multilevel"/>
     <w:tmpl w:val="4DE018BE"/>
@@ -14066,7 +16696,7 @@
       </w:rPr>
     </w:lvl>
   </w:abstractNum>
-  <w:abstractNum w:abstractNumId="13" w15:restartNumberingAfterBreak="0">
+  <w:abstractNum w:abstractNumId="14" w15:restartNumberingAfterBreak="0">
     <w:nsid w:val="1E974088"/>
     <w:multiLevelType w:val="multilevel"/>
     <w:tmpl w:val="AC8298A4"/>
@@ -14215,7 +16845,7 @@
       </w:rPr>
     </w:lvl>
   </w:abstractNum>
-  <w:abstractNum w:abstractNumId="14" w15:restartNumberingAfterBreak="0">
+  <w:abstractNum w:abstractNumId="15" w15:restartNumberingAfterBreak="0">
     <w:nsid w:val="1FFE1534"/>
     <w:multiLevelType w:val="multilevel"/>
     <w:tmpl w:val="3C4EEAFC"/>
@@ -14364,7 +16994,7 @@
       </w:rPr>
     </w:lvl>
   </w:abstractNum>
-  <w:abstractNum w:abstractNumId="15" w15:restartNumberingAfterBreak="0">
+  <w:abstractNum w:abstractNumId="16" w15:restartNumberingAfterBreak="0">
     <w:nsid w:val="209401CD"/>
     <w:multiLevelType w:val="multilevel"/>
     <w:tmpl w:val="A24CB162"/>
@@ -14513,7 +17143,7 @@
       </w:rPr>
     </w:lvl>
   </w:abstractNum>
-  <w:abstractNum w:abstractNumId="16" w15:restartNumberingAfterBreak="0">
+  <w:abstractNum w:abstractNumId="17" w15:restartNumberingAfterBreak="0">
     <w:nsid w:val="210E4FAB"/>
     <w:multiLevelType w:val="multilevel"/>
     <w:tmpl w:val="316A1152"/>
@@ -14662,7 +17292,7 @@
       </w:rPr>
     </w:lvl>
   </w:abstractNum>
-  <w:abstractNum w:abstractNumId="17" w15:restartNumberingAfterBreak="0">
+  <w:abstractNum w:abstractNumId="18" w15:restartNumberingAfterBreak="0">
     <w:nsid w:val="2268280E"/>
     <w:multiLevelType w:val="multilevel"/>
     <w:tmpl w:val="C86C7BF8"/>
@@ -14811,7 +17441,156 @@
       </w:rPr>
     </w:lvl>
   </w:abstractNum>
-  <w:abstractNum w:abstractNumId="18" w15:restartNumberingAfterBreak="0">
+  <w:abstractNum w:abstractNumId="19" w15:restartNumberingAfterBreak="0">
+    <w:nsid w:val="22FB234E"/>
+    <w:multiLevelType w:val="multilevel"/>
+    <w:tmpl w:val="3A320486"/>
+    <w:lvl w:ilvl="0">
+      <w:start w:val="1"/>
+      <w:numFmt w:val="bullet"/>
+      <w:lvlText w:val=""/>
+      <w:lvlJc w:val="left"/>
+      <w:pPr>
+        <w:tabs>
+          <w:tab w:val="num" w:pos="720"/>
+        </w:tabs>
+        <w:ind w:left="720" w:hanging="360"/>
+      </w:pPr>
+      <w:rPr>
+        <w:rFonts w:ascii="Symbol" w:hAnsi="Symbol" w:hint="default"/>
+        <w:sz w:val="20"/>
+      </w:rPr>
+    </w:lvl>
+    <w:lvl w:ilvl="1" w:tentative="1">
+      <w:start w:val="1"/>
+      <w:numFmt w:val="bullet"/>
+      <w:lvlText w:val="o"/>
+      <w:lvlJc w:val="left"/>
+      <w:pPr>
+        <w:tabs>
+          <w:tab w:val="num" w:pos="1440"/>
+        </w:tabs>
+        <w:ind w:left="1440" w:hanging="360"/>
+      </w:pPr>
+      <w:rPr>
+        <w:rFonts w:ascii="Courier New" w:hAnsi="Courier New" w:hint="default"/>
+        <w:sz w:val="20"/>
+      </w:rPr>
+    </w:lvl>
+    <w:lvl w:ilvl="2" w:tentative="1">
+      <w:start w:val="1"/>
+      <w:numFmt w:val="bullet"/>
+      <w:lvlText w:val=""/>
+      <w:lvlJc w:val="left"/>
+      <w:pPr>
+        <w:tabs>
+          <w:tab w:val="num" w:pos="2160"/>
+        </w:tabs>
+        <w:ind w:left="2160" w:hanging="360"/>
+      </w:pPr>
+      <w:rPr>
+        <w:rFonts w:ascii="Wingdings" w:hAnsi="Wingdings" w:hint="default"/>
+        <w:sz w:val="20"/>
+      </w:rPr>
+    </w:lvl>
+    <w:lvl w:ilvl="3" w:tentative="1">
+      <w:start w:val="1"/>
+      <w:numFmt w:val="bullet"/>
+      <w:lvlText w:val=""/>
+      <w:lvlJc w:val="left"/>
+      <w:pPr>
+        <w:tabs>
+          <w:tab w:val="num" w:pos="2880"/>
+        </w:tabs>
+        <w:ind w:left="2880" w:hanging="360"/>
+      </w:pPr>
+      <w:rPr>
+        <w:rFonts w:ascii="Wingdings" w:hAnsi="Wingdings" w:hint="default"/>
+        <w:sz w:val="20"/>
+      </w:rPr>
+    </w:lvl>
+    <w:lvl w:ilvl="4" w:tentative="1">
+      <w:start w:val="1"/>
+      <w:numFmt w:val="bullet"/>
+      <w:lvlText w:val=""/>
+      <w:lvlJc w:val="left"/>
+      <w:pPr>
+        <w:tabs>
+          <w:tab w:val="num" w:pos="3600"/>
+        </w:tabs>
+        <w:ind w:left="3600" w:hanging="360"/>
+      </w:pPr>
+      <w:rPr>
+        <w:rFonts w:ascii="Wingdings" w:hAnsi="Wingdings" w:hint="default"/>
+        <w:sz w:val="20"/>
+      </w:rPr>
+    </w:lvl>
+    <w:lvl w:ilvl="5" w:tentative="1">
+      <w:start w:val="1"/>
+      <w:numFmt w:val="bullet"/>
+      <w:lvlText w:val=""/>
+      <w:lvlJc w:val="left"/>
+      <w:pPr>
+        <w:tabs>
+          <w:tab w:val="num" w:pos="4320"/>
+        </w:tabs>
+        <w:ind w:left="4320" w:hanging="360"/>
+      </w:pPr>
+      <w:rPr>
+        <w:rFonts w:ascii="Wingdings" w:hAnsi="Wingdings" w:hint="default"/>
+        <w:sz w:val="20"/>
+      </w:rPr>
+    </w:lvl>
+    <w:lvl w:ilvl="6" w:tentative="1">
+      <w:start w:val="1"/>
+      <w:numFmt w:val="bullet"/>
+      <w:lvlText w:val=""/>
+      <w:lvlJc w:val="left"/>
+      <w:pPr>
+        <w:tabs>
+          <w:tab w:val="num" w:pos="5040"/>
+        </w:tabs>
+        <w:ind w:left="5040" w:hanging="360"/>
+      </w:pPr>
+      <w:rPr>
+        <w:rFonts w:ascii="Wingdings" w:hAnsi="Wingdings" w:hint="default"/>
+        <w:sz w:val="20"/>
+      </w:rPr>
+    </w:lvl>
+    <w:lvl w:ilvl="7" w:tentative="1">
+      <w:start w:val="1"/>
+      <w:numFmt w:val="bullet"/>
+      <w:lvlText w:val=""/>
+      <w:lvlJc w:val="left"/>
+      <w:pPr>
+        <w:tabs>
+          <w:tab w:val="num" w:pos="5760"/>
+        </w:tabs>
+        <w:ind w:left="5760" w:hanging="360"/>
+      </w:pPr>
+      <w:rPr>
+        <w:rFonts w:ascii="Wingdings" w:hAnsi="Wingdings" w:hint="default"/>
+        <w:sz w:val="20"/>
+      </w:rPr>
+    </w:lvl>
+    <w:lvl w:ilvl="8" w:tentative="1">
+      <w:start w:val="1"/>
+      <w:numFmt w:val="bullet"/>
+      <w:lvlText w:val=""/>
+      <w:lvlJc w:val="left"/>
+      <w:pPr>
+        <w:tabs>
+          <w:tab w:val="num" w:pos="6480"/>
+        </w:tabs>
+        <w:ind w:left="6480" w:hanging="360"/>
+      </w:pPr>
+      <w:rPr>
+        <w:rFonts w:ascii="Wingdings" w:hAnsi="Wingdings" w:hint="default"/>
+        <w:sz w:val="20"/>
+      </w:rPr>
+    </w:lvl>
+  </w:abstractNum>
+  <w:abstractNum w:abstractNumId="20" w15:restartNumberingAfterBreak="0">
     <w:nsid w:val="23E8472E"/>
     <w:multiLevelType w:val="multilevel"/>
     <w:tmpl w:val="D47E6894"/>
@@ -14960,7 +17739,7 @@
       </w:rPr>
     </w:lvl>
   </w:abstractNum>
-  <w:abstractNum w:abstractNumId="19" w15:restartNumberingAfterBreak="0">
+  <w:abstractNum w:abstractNumId="21" w15:restartNumberingAfterBreak="0">
     <w:nsid w:val="2A3746E9"/>
     <w:multiLevelType w:val="multilevel"/>
     <w:tmpl w:val="2A488F2C"/>
@@ -15109,7 +17888,7 @@
       </w:rPr>
     </w:lvl>
   </w:abstractNum>
-  <w:abstractNum w:abstractNumId="20" w15:restartNumberingAfterBreak="0">
+  <w:abstractNum w:abstractNumId="22" w15:restartNumberingAfterBreak="0">
     <w:nsid w:val="2BD65E0D"/>
     <w:multiLevelType w:val="multilevel"/>
     <w:tmpl w:val="DFF6A488"/>
@@ -15258,7 +18037,7 @@
       </w:rPr>
     </w:lvl>
   </w:abstractNum>
-  <w:abstractNum w:abstractNumId="21" w15:restartNumberingAfterBreak="0">
+  <w:abstractNum w:abstractNumId="23" w15:restartNumberingAfterBreak="0">
     <w:nsid w:val="2F4411AB"/>
     <w:multiLevelType w:val="multilevel"/>
     <w:tmpl w:val="0938F92C"/>
@@ -15407,7 +18186,7 @@
       </w:rPr>
     </w:lvl>
   </w:abstractNum>
-  <w:abstractNum w:abstractNumId="22" w15:restartNumberingAfterBreak="0">
+  <w:abstractNum w:abstractNumId="24" w15:restartNumberingAfterBreak="0">
     <w:nsid w:val="32BB002F"/>
     <w:multiLevelType w:val="multilevel"/>
     <w:tmpl w:val="600ADF90"/>
@@ -15556,7 +18335,156 @@
       </w:rPr>
     </w:lvl>
   </w:abstractNum>
-  <w:abstractNum w:abstractNumId="23" w15:restartNumberingAfterBreak="0">
+  <w:abstractNum w:abstractNumId="25" w15:restartNumberingAfterBreak="0">
+    <w:nsid w:val="35F527AA"/>
+    <w:multiLevelType w:val="multilevel"/>
+    <w:tmpl w:val="B44C59E2"/>
+    <w:lvl w:ilvl="0">
+      <w:start w:val="1"/>
+      <w:numFmt w:val="bullet"/>
+      <w:lvlText w:val=""/>
+      <w:lvlJc w:val="left"/>
+      <w:pPr>
+        <w:tabs>
+          <w:tab w:val="num" w:pos="720"/>
+        </w:tabs>
+        <w:ind w:left="720" w:hanging="360"/>
+      </w:pPr>
+      <w:rPr>
+        <w:rFonts w:ascii="Symbol" w:hAnsi="Symbol" w:hint="default"/>
+        <w:sz w:val="20"/>
+      </w:rPr>
+    </w:lvl>
+    <w:lvl w:ilvl="1" w:tentative="1">
+      <w:start w:val="1"/>
+      <w:numFmt w:val="bullet"/>
+      <w:lvlText w:val="o"/>
+      <w:lvlJc w:val="left"/>
+      <w:pPr>
+        <w:tabs>
+          <w:tab w:val="num" w:pos="1440"/>
+        </w:tabs>
+        <w:ind w:left="1440" w:hanging="360"/>
+      </w:pPr>
+      <w:rPr>
+        <w:rFonts w:ascii="Courier New" w:hAnsi="Courier New" w:hint="default"/>
+        <w:sz w:val="20"/>
+      </w:rPr>
+    </w:lvl>
+    <w:lvl w:ilvl="2" w:tentative="1">
+      <w:start w:val="1"/>
+      <w:numFmt w:val="bullet"/>
+      <w:lvlText w:val=""/>
+      <w:lvlJc w:val="left"/>
+      <w:pPr>
+        <w:tabs>
+          <w:tab w:val="num" w:pos="2160"/>
+        </w:tabs>
+        <w:ind w:left="2160" w:hanging="360"/>
+      </w:pPr>
+      <w:rPr>
+        <w:rFonts w:ascii="Wingdings" w:hAnsi="Wingdings" w:hint="default"/>
+        <w:sz w:val="20"/>
+      </w:rPr>
+    </w:lvl>
+    <w:lvl w:ilvl="3" w:tentative="1">
+      <w:start w:val="1"/>
+      <w:numFmt w:val="bullet"/>
+      <w:lvlText w:val=""/>
+      <w:lvlJc w:val="left"/>
+      <w:pPr>
+        <w:tabs>
+          <w:tab w:val="num" w:pos="2880"/>
+        </w:tabs>
+        <w:ind w:left="2880" w:hanging="360"/>
+      </w:pPr>
+      <w:rPr>
+        <w:rFonts w:ascii="Wingdings" w:hAnsi="Wingdings" w:hint="default"/>
+        <w:sz w:val="20"/>
+      </w:rPr>
+    </w:lvl>
+    <w:lvl w:ilvl="4" w:tentative="1">
+      <w:start w:val="1"/>
+      <w:numFmt w:val="bullet"/>
+      <w:lvlText w:val=""/>
+      <w:lvlJc w:val="left"/>
+      <w:pPr>
+        <w:tabs>
+          <w:tab w:val="num" w:pos="3600"/>
+        </w:tabs>
+        <w:ind w:left="3600" w:hanging="360"/>
+      </w:pPr>
+      <w:rPr>
+        <w:rFonts w:ascii="Wingdings" w:hAnsi="Wingdings" w:hint="default"/>
+        <w:sz w:val="20"/>
+      </w:rPr>
+    </w:lvl>
+    <w:lvl w:ilvl="5" w:tentative="1">
+      <w:start w:val="1"/>
+      <w:numFmt w:val="bullet"/>
+      <w:lvlText w:val=""/>
+      <w:lvlJc w:val="left"/>
+      <w:pPr>
+        <w:tabs>
+          <w:tab w:val="num" w:pos="4320"/>
+        </w:tabs>
+        <w:ind w:left="4320" w:hanging="360"/>
+      </w:pPr>
+      <w:rPr>
+        <w:rFonts w:ascii="Wingdings" w:hAnsi="Wingdings" w:hint="default"/>
+        <w:sz w:val="20"/>
+      </w:rPr>
+    </w:lvl>
+    <w:lvl w:ilvl="6" w:tentative="1">
+      <w:start w:val="1"/>
+      <w:numFmt w:val="bullet"/>
+      <w:lvlText w:val=""/>
+      <w:lvlJc w:val="left"/>
+      <w:pPr>
+        <w:tabs>
+          <w:tab w:val="num" w:pos="5040"/>
+        </w:tabs>
+        <w:ind w:left="5040" w:hanging="360"/>
+      </w:pPr>
+      <w:rPr>
+        <w:rFonts w:ascii="Wingdings" w:hAnsi="Wingdings" w:hint="default"/>
+        <w:sz w:val="20"/>
+      </w:rPr>
+    </w:lvl>
+    <w:lvl w:ilvl="7" w:tentative="1">
+      <w:start w:val="1"/>
+      <w:numFmt w:val="bullet"/>
+      <w:lvlText w:val=""/>
+      <w:lvlJc w:val="left"/>
+      <w:pPr>
+        <w:tabs>
+          <w:tab w:val="num" w:pos="5760"/>
+        </w:tabs>
+        <w:ind w:left="5760" w:hanging="360"/>
+      </w:pPr>
+      <w:rPr>
+        <w:rFonts w:ascii="Wingdings" w:hAnsi="Wingdings" w:hint="default"/>
+        <w:sz w:val="20"/>
+      </w:rPr>
+    </w:lvl>
+    <w:lvl w:ilvl="8" w:tentative="1">
+      <w:start w:val="1"/>
+      <w:numFmt w:val="bullet"/>
+      <w:lvlText w:val=""/>
+      <w:lvlJc w:val="left"/>
+      <w:pPr>
+        <w:tabs>
+          <w:tab w:val="num" w:pos="6480"/>
+        </w:tabs>
+        <w:ind w:left="6480" w:hanging="360"/>
+      </w:pPr>
+      <w:rPr>
+        <w:rFonts w:ascii="Wingdings" w:hAnsi="Wingdings" w:hint="default"/>
+        <w:sz w:val="20"/>
+      </w:rPr>
+    </w:lvl>
+  </w:abstractNum>
+  <w:abstractNum w:abstractNumId="26" w15:restartNumberingAfterBreak="0">
     <w:nsid w:val="3AF93231"/>
     <w:multiLevelType w:val="multilevel"/>
     <w:tmpl w:val="612C42CA"/>
@@ -15705,7 +18633,7 @@
       </w:rPr>
     </w:lvl>
   </w:abstractNum>
-  <w:abstractNum w:abstractNumId="24" w15:restartNumberingAfterBreak="0">
+  <w:abstractNum w:abstractNumId="27" w15:restartNumberingAfterBreak="0">
     <w:nsid w:val="4E31728E"/>
     <w:multiLevelType w:val="multilevel"/>
     <w:tmpl w:val="0C2647F2"/>
@@ -15854,7 +18782,7 @@
       </w:rPr>
     </w:lvl>
   </w:abstractNum>
-  <w:abstractNum w:abstractNumId="25" w15:restartNumberingAfterBreak="0">
+  <w:abstractNum w:abstractNumId="28" w15:restartNumberingAfterBreak="0">
     <w:nsid w:val="53885571"/>
     <w:multiLevelType w:val="multilevel"/>
     <w:tmpl w:val="312496AC"/>
@@ -16003,7 +18931,156 @@
       </w:rPr>
     </w:lvl>
   </w:abstractNum>
-  <w:abstractNum w:abstractNumId="26" w15:restartNumberingAfterBreak="0">
+  <w:abstractNum w:abstractNumId="29" w15:restartNumberingAfterBreak="0">
+    <w:nsid w:val="58102DB2"/>
+    <w:multiLevelType w:val="multilevel"/>
+    <w:tmpl w:val="905C891A"/>
+    <w:lvl w:ilvl="0">
+      <w:start w:val="1"/>
+      <w:numFmt w:val="bullet"/>
+      <w:lvlText w:val=""/>
+      <w:lvlJc w:val="left"/>
+      <w:pPr>
+        <w:tabs>
+          <w:tab w:val="num" w:pos="720"/>
+        </w:tabs>
+        <w:ind w:left="720" w:hanging="360"/>
+      </w:pPr>
+      <w:rPr>
+        <w:rFonts w:ascii="Symbol" w:hAnsi="Symbol" w:hint="default"/>
+        <w:sz w:val="20"/>
+      </w:rPr>
+    </w:lvl>
+    <w:lvl w:ilvl="1" w:tentative="1">
+      <w:start w:val="1"/>
+      <w:numFmt w:val="bullet"/>
+      <w:lvlText w:val="o"/>
+      <w:lvlJc w:val="left"/>
+      <w:pPr>
+        <w:tabs>
+          <w:tab w:val="num" w:pos="1440"/>
+        </w:tabs>
+        <w:ind w:left="1440" w:hanging="360"/>
+      </w:pPr>
+      <w:rPr>
+        <w:rFonts w:ascii="Courier New" w:hAnsi="Courier New" w:hint="default"/>
+        <w:sz w:val="20"/>
+      </w:rPr>
+    </w:lvl>
+    <w:lvl w:ilvl="2" w:tentative="1">
+      <w:start w:val="1"/>
+      <w:numFmt w:val="bullet"/>
+      <w:lvlText w:val=""/>
+      <w:lvlJc w:val="left"/>
+      <w:pPr>
+        <w:tabs>
+          <w:tab w:val="num" w:pos="2160"/>
+        </w:tabs>
+        <w:ind w:left="2160" w:hanging="360"/>
+      </w:pPr>
+      <w:rPr>
+        <w:rFonts w:ascii="Wingdings" w:hAnsi="Wingdings" w:hint="default"/>
+        <w:sz w:val="20"/>
+      </w:rPr>
+    </w:lvl>
+    <w:lvl w:ilvl="3" w:tentative="1">
+      <w:start w:val="1"/>
+      <w:numFmt w:val="bullet"/>
+      <w:lvlText w:val=""/>
+      <w:lvlJc w:val="left"/>
+      <w:pPr>
+        <w:tabs>
+          <w:tab w:val="num" w:pos="2880"/>
+        </w:tabs>
+        <w:ind w:left="2880" w:hanging="360"/>
+      </w:pPr>
+      <w:rPr>
+        <w:rFonts w:ascii="Wingdings" w:hAnsi="Wingdings" w:hint="default"/>
+        <w:sz w:val="20"/>
+      </w:rPr>
+    </w:lvl>
+    <w:lvl w:ilvl="4" w:tentative="1">
+      <w:start w:val="1"/>
+      <w:numFmt w:val="bullet"/>
+      <w:lvlText w:val=""/>
+      <w:lvlJc w:val="left"/>
+      <w:pPr>
+        <w:tabs>
+          <w:tab w:val="num" w:pos="3600"/>
+        </w:tabs>
+        <w:ind w:left="3600" w:hanging="360"/>
+      </w:pPr>
+      <w:rPr>
+        <w:rFonts w:ascii="Wingdings" w:hAnsi="Wingdings" w:hint="default"/>
+        <w:sz w:val="20"/>
+      </w:rPr>
+    </w:lvl>
+    <w:lvl w:ilvl="5" w:tentative="1">
+      <w:start w:val="1"/>
+      <w:numFmt w:val="bullet"/>
+      <w:lvlText w:val=""/>
+      <w:lvlJc w:val="left"/>
+      <w:pPr>
+        <w:tabs>
+          <w:tab w:val="num" w:pos="4320"/>
+        </w:tabs>
+        <w:ind w:left="4320" w:hanging="360"/>
+      </w:pPr>
+      <w:rPr>
+        <w:rFonts w:ascii="Wingdings" w:hAnsi="Wingdings" w:hint="default"/>
+        <w:sz w:val="20"/>
+      </w:rPr>
+    </w:lvl>
+    <w:lvl w:ilvl="6" w:tentative="1">
+      <w:start w:val="1"/>
+      <w:numFmt w:val="bullet"/>
+      <w:lvlText w:val=""/>
+      <w:lvlJc w:val="left"/>
+      <w:pPr>
+        <w:tabs>
+          <w:tab w:val="num" w:pos="5040"/>
+        </w:tabs>
+        <w:ind w:left="5040" w:hanging="360"/>
+      </w:pPr>
+      <w:rPr>
+        <w:rFonts w:ascii="Wingdings" w:hAnsi="Wingdings" w:hint="default"/>
+        <w:sz w:val="20"/>
+      </w:rPr>
+    </w:lvl>
+    <w:lvl w:ilvl="7" w:tentative="1">
+      <w:start w:val="1"/>
+      <w:numFmt w:val="bullet"/>
+      <w:lvlText w:val=""/>
+      <w:lvlJc w:val="left"/>
+      <w:pPr>
+        <w:tabs>
+          <w:tab w:val="num" w:pos="5760"/>
+        </w:tabs>
+        <w:ind w:left="5760" w:hanging="360"/>
+      </w:pPr>
+      <w:rPr>
+        <w:rFonts w:ascii="Wingdings" w:hAnsi="Wingdings" w:hint="default"/>
+        <w:sz w:val="20"/>
+      </w:rPr>
+    </w:lvl>
+    <w:lvl w:ilvl="8" w:tentative="1">
+      <w:start w:val="1"/>
+      <w:numFmt w:val="bullet"/>
+      <w:lvlText w:val=""/>
+      <w:lvlJc w:val="left"/>
+      <w:pPr>
+        <w:tabs>
+          <w:tab w:val="num" w:pos="6480"/>
+        </w:tabs>
+        <w:ind w:left="6480" w:hanging="360"/>
+      </w:pPr>
+      <w:rPr>
+        <w:rFonts w:ascii="Wingdings" w:hAnsi="Wingdings" w:hint="default"/>
+        <w:sz w:val="20"/>
+      </w:rPr>
+    </w:lvl>
+  </w:abstractNum>
+  <w:abstractNum w:abstractNumId="30" w15:restartNumberingAfterBreak="0">
     <w:nsid w:val="59624F10"/>
     <w:multiLevelType w:val="multilevel"/>
     <w:tmpl w:val="C8ACE9C4"/>
@@ -16152,7 +19229,7 @@
       </w:rPr>
     </w:lvl>
   </w:abstractNum>
-  <w:abstractNum w:abstractNumId="27" w15:restartNumberingAfterBreak="0">
+  <w:abstractNum w:abstractNumId="31" w15:restartNumberingAfterBreak="0">
     <w:nsid w:val="5B1A2EC3"/>
     <w:multiLevelType w:val="multilevel"/>
     <w:tmpl w:val="45484B64"/>
@@ -16301,7 +19378,156 @@
       </w:rPr>
     </w:lvl>
   </w:abstractNum>
-  <w:abstractNum w:abstractNumId="28" w15:restartNumberingAfterBreak="0">
+  <w:abstractNum w:abstractNumId="32" w15:restartNumberingAfterBreak="0">
+    <w:nsid w:val="655D003D"/>
+    <w:multiLevelType w:val="multilevel"/>
+    <w:tmpl w:val="A8460994"/>
+    <w:lvl w:ilvl="0">
+      <w:start w:val="1"/>
+      <w:numFmt w:val="bullet"/>
+      <w:lvlText w:val=""/>
+      <w:lvlJc w:val="left"/>
+      <w:pPr>
+        <w:tabs>
+          <w:tab w:val="num" w:pos="720"/>
+        </w:tabs>
+        <w:ind w:left="720" w:hanging="360"/>
+      </w:pPr>
+      <w:rPr>
+        <w:rFonts w:ascii="Symbol" w:hAnsi="Symbol" w:hint="default"/>
+        <w:sz w:val="20"/>
+      </w:rPr>
+    </w:lvl>
+    <w:lvl w:ilvl="1" w:tentative="1">
+      <w:start w:val="1"/>
+      <w:numFmt w:val="bullet"/>
+      <w:lvlText w:val="o"/>
+      <w:lvlJc w:val="left"/>
+      <w:pPr>
+        <w:tabs>
+          <w:tab w:val="num" w:pos="1440"/>
+        </w:tabs>
+        <w:ind w:left="1440" w:hanging="360"/>
+      </w:pPr>
+      <w:rPr>
+        <w:rFonts w:ascii="Courier New" w:hAnsi="Courier New" w:hint="default"/>
+        <w:sz w:val="20"/>
+      </w:rPr>
+    </w:lvl>
+    <w:lvl w:ilvl="2" w:tentative="1">
+      <w:start w:val="1"/>
+      <w:numFmt w:val="bullet"/>
+      <w:lvlText w:val=""/>
+      <w:lvlJc w:val="left"/>
+      <w:pPr>
+        <w:tabs>
+          <w:tab w:val="num" w:pos="2160"/>
+        </w:tabs>
+        <w:ind w:left="2160" w:hanging="360"/>
+      </w:pPr>
+      <w:rPr>
+        <w:rFonts w:ascii="Wingdings" w:hAnsi="Wingdings" w:hint="default"/>
+        <w:sz w:val="20"/>
+      </w:rPr>
+    </w:lvl>
+    <w:lvl w:ilvl="3" w:tentative="1">
+      <w:start w:val="1"/>
+      <w:numFmt w:val="bullet"/>
+      <w:lvlText w:val=""/>
+      <w:lvlJc w:val="left"/>
+      <w:pPr>
+        <w:tabs>
+          <w:tab w:val="num" w:pos="2880"/>
+        </w:tabs>
+        <w:ind w:left="2880" w:hanging="360"/>
+      </w:pPr>
+      <w:rPr>
+        <w:rFonts w:ascii="Wingdings" w:hAnsi="Wingdings" w:hint="default"/>
+        <w:sz w:val="20"/>
+      </w:rPr>
+    </w:lvl>
+    <w:lvl w:ilvl="4" w:tentative="1">
+      <w:start w:val="1"/>
+      <w:numFmt w:val="bullet"/>
+      <w:lvlText w:val=""/>
+      <w:lvlJc w:val="left"/>
+      <w:pPr>
+        <w:tabs>
+          <w:tab w:val="num" w:pos="3600"/>
+        </w:tabs>
+        <w:ind w:left="3600" w:hanging="360"/>
+      </w:pPr>
+      <w:rPr>
+        <w:rFonts w:ascii="Wingdings" w:hAnsi="Wingdings" w:hint="default"/>
+        <w:sz w:val="20"/>
+      </w:rPr>
+    </w:lvl>
+    <w:lvl w:ilvl="5" w:tentative="1">
+      <w:start w:val="1"/>
+      <w:numFmt w:val="bullet"/>
+      <w:lvlText w:val=""/>
+      <w:lvlJc w:val="left"/>
+      <w:pPr>
+        <w:tabs>
+          <w:tab w:val="num" w:pos="4320"/>
+        </w:tabs>
+        <w:ind w:left="4320" w:hanging="360"/>
+      </w:pPr>
+      <w:rPr>
+        <w:rFonts w:ascii="Wingdings" w:hAnsi="Wingdings" w:hint="default"/>
+        <w:sz w:val="20"/>
+      </w:rPr>
+    </w:lvl>
+    <w:lvl w:ilvl="6" w:tentative="1">
+      <w:start w:val="1"/>
+      <w:numFmt w:val="bullet"/>
+      <w:lvlText w:val=""/>
+      <w:lvlJc w:val="left"/>
+      <w:pPr>
+        <w:tabs>
+          <w:tab w:val="num" w:pos="5040"/>
+        </w:tabs>
+        <w:ind w:left="5040" w:hanging="360"/>
+      </w:pPr>
+      <w:rPr>
+        <w:rFonts w:ascii="Wingdings" w:hAnsi="Wingdings" w:hint="default"/>
+        <w:sz w:val="20"/>
+      </w:rPr>
+    </w:lvl>
+    <w:lvl w:ilvl="7" w:tentative="1">
+      <w:start w:val="1"/>
+      <w:numFmt w:val="bullet"/>
+      <w:lvlText w:val=""/>
+      <w:lvlJc w:val="left"/>
+      <w:pPr>
+        <w:tabs>
+          <w:tab w:val="num" w:pos="5760"/>
+        </w:tabs>
+        <w:ind w:left="5760" w:hanging="360"/>
+      </w:pPr>
+      <w:rPr>
+        <w:rFonts w:ascii="Wingdings" w:hAnsi="Wingdings" w:hint="default"/>
+        <w:sz w:val="20"/>
+      </w:rPr>
+    </w:lvl>
+    <w:lvl w:ilvl="8" w:tentative="1">
+      <w:start w:val="1"/>
+      <w:numFmt w:val="bullet"/>
+      <w:lvlText w:val=""/>
+      <w:lvlJc w:val="left"/>
+      <w:pPr>
+        <w:tabs>
+          <w:tab w:val="num" w:pos="6480"/>
+        </w:tabs>
+        <w:ind w:left="6480" w:hanging="360"/>
+      </w:pPr>
+      <w:rPr>
+        <w:rFonts w:ascii="Wingdings" w:hAnsi="Wingdings" w:hint="default"/>
+        <w:sz w:val="20"/>
+      </w:rPr>
+    </w:lvl>
+  </w:abstractNum>
+  <w:abstractNum w:abstractNumId="33" w15:restartNumberingAfterBreak="0">
     <w:nsid w:val="6C3E50EF"/>
     <w:multiLevelType w:val="multilevel"/>
     <w:tmpl w:val="415CD54A"/>
@@ -16450,7 +19676,7 @@
       </w:rPr>
     </w:lvl>
   </w:abstractNum>
-  <w:abstractNum w:abstractNumId="29" w15:restartNumberingAfterBreak="0">
+  <w:abstractNum w:abstractNumId="34" w15:restartNumberingAfterBreak="0">
     <w:nsid w:val="6CEE3E7D"/>
     <w:multiLevelType w:val="multilevel"/>
     <w:tmpl w:val="15ACB996"/>
@@ -16599,7 +19825,7 @@
       </w:rPr>
     </w:lvl>
   </w:abstractNum>
-  <w:abstractNum w:abstractNumId="30" w15:restartNumberingAfterBreak="0">
+  <w:abstractNum w:abstractNumId="35" w15:restartNumberingAfterBreak="0">
     <w:nsid w:val="6F612386"/>
     <w:multiLevelType w:val="multilevel"/>
     <w:tmpl w:val="FF38C946"/>
@@ -16748,7 +19974,7 @@
       </w:rPr>
     </w:lvl>
   </w:abstractNum>
-  <w:abstractNum w:abstractNumId="31" w15:restartNumberingAfterBreak="0">
+  <w:abstractNum w:abstractNumId="36" w15:restartNumberingAfterBreak="0">
     <w:nsid w:val="736F49DD"/>
     <w:multiLevelType w:val="multilevel"/>
     <w:tmpl w:val="E978319A"/>
@@ -16897,7 +20123,7 @@
       </w:rPr>
     </w:lvl>
   </w:abstractNum>
-  <w:abstractNum w:abstractNumId="32" w15:restartNumberingAfterBreak="0">
+  <w:abstractNum w:abstractNumId="37" w15:restartNumberingAfterBreak="0">
     <w:nsid w:val="753F5014"/>
     <w:multiLevelType w:val="multilevel"/>
     <w:tmpl w:val="ADCC06DE"/>
@@ -17046,7 +20272,7 @@
       </w:rPr>
     </w:lvl>
   </w:abstractNum>
-  <w:abstractNum w:abstractNumId="33" w15:restartNumberingAfterBreak="0">
+  <w:abstractNum w:abstractNumId="38" w15:restartNumberingAfterBreak="0">
     <w:nsid w:val="755D3721"/>
     <w:multiLevelType w:val="multilevel"/>
     <w:tmpl w:val="50E26368"/>
@@ -17195,7 +20421,7 @@
       </w:rPr>
     </w:lvl>
   </w:abstractNum>
-  <w:abstractNum w:abstractNumId="34" w15:restartNumberingAfterBreak="0">
+  <w:abstractNum w:abstractNumId="39" w15:restartNumberingAfterBreak="0">
     <w:nsid w:val="797A0739"/>
     <w:multiLevelType w:val="multilevel"/>
     <w:tmpl w:val="A600F5FE"/>
@@ -17344,7 +20570,7 @@
       </w:rPr>
     </w:lvl>
   </w:abstractNum>
-  <w:abstractNum w:abstractNumId="35" w15:restartNumberingAfterBreak="0">
+  <w:abstractNum w:abstractNumId="40" w15:restartNumberingAfterBreak="0">
     <w:nsid w:val="7C994BA9"/>
     <w:multiLevelType w:val="multilevel"/>
     <w:tmpl w:val="9BCC5EB0"/>
@@ -17493,7 +20719,7 @@
       </w:rPr>
     </w:lvl>
   </w:abstractNum>
-  <w:abstractNum w:abstractNumId="36" w15:restartNumberingAfterBreak="0">
+  <w:abstractNum w:abstractNumId="41" w15:restartNumberingAfterBreak="0">
     <w:nsid w:val="7E277970"/>
     <w:multiLevelType w:val="multilevel"/>
     <w:tmpl w:val="2E04C4B4"/>
@@ -17646,85 +20872,85 @@
     <w:abstractNumId w:val="4"/>
   </w:num>
   <w:num w:numId="2" w16cid:durableId="1541360567">
-    <w:abstractNumId w:val="16"/>
+    <w:abstractNumId w:val="17"/>
   </w:num>
   <w:num w:numId="3" w16cid:durableId="169410617">
-    <w:abstractNumId w:val="33"/>
+    <w:abstractNumId w:val="38"/>
   </w:num>
   <w:num w:numId="4" w16cid:durableId="1763992707">
-    <w:abstractNumId w:val="32"/>
+    <w:abstractNumId w:val="37"/>
   </w:num>
   <w:num w:numId="5" w16cid:durableId="796333125">
     <w:abstractNumId w:val="3"/>
   </w:num>
   <w:num w:numId="6" w16cid:durableId="1478377202">
-    <w:abstractNumId w:val="12"/>
+    <w:abstractNumId w:val="13"/>
   </w:num>
   <w:num w:numId="7" w16cid:durableId="1552577469">
-    <w:abstractNumId w:val="21"/>
+    <w:abstractNumId w:val="23"/>
   </w:num>
   <w:num w:numId="8" w16cid:durableId="924656939">
-    <w:abstractNumId w:val="18"/>
+    <w:abstractNumId w:val="20"/>
   </w:num>
   <w:num w:numId="9" w16cid:durableId="424545816">
-    <w:abstractNumId w:val="6"/>
+    <w:abstractNumId w:val="7"/>
   </w:num>
   <w:num w:numId="10" w16cid:durableId="1044791646">
-    <w:abstractNumId w:val="15"/>
+    <w:abstractNumId w:val="16"/>
   </w:num>
   <w:num w:numId="11" w16cid:durableId="899633472">
-    <w:abstractNumId w:val="5"/>
+    <w:abstractNumId w:val="6"/>
   </w:num>
   <w:num w:numId="12" w16cid:durableId="1002928013">
     <w:abstractNumId w:val="0"/>
   </w:num>
   <w:num w:numId="13" w16cid:durableId="722410911">
-    <w:abstractNumId w:val="13"/>
+    <w:abstractNumId w:val="14"/>
   </w:num>
   <w:num w:numId="14" w16cid:durableId="1248886714">
+    <w:abstractNumId w:val="30"/>
+  </w:num>
+  <w:num w:numId="15" w16cid:durableId="1472286876">
     <w:abstractNumId w:val="26"/>
   </w:num>
-  <w:num w:numId="15" w16cid:durableId="1472286876">
-    <w:abstractNumId w:val="23"/>
+  <w:num w:numId="16" w16cid:durableId="1857843534">
+    <w:abstractNumId w:val="40"/>
   </w:num>
-  <w:num w:numId="16" w16cid:durableId="1857843534">
+  <w:num w:numId="17" w16cid:durableId="2143111938">
+    <w:abstractNumId w:val="9"/>
+  </w:num>
+  <w:num w:numId="18" w16cid:durableId="1659918386">
+    <w:abstractNumId w:val="28"/>
+  </w:num>
+  <w:num w:numId="19" w16cid:durableId="121577458">
+    <w:abstractNumId w:val="33"/>
+  </w:num>
+  <w:num w:numId="20" w16cid:durableId="583997274">
+    <w:abstractNumId w:val="36"/>
+  </w:num>
+  <w:num w:numId="21" w16cid:durableId="1368990998">
+    <w:abstractNumId w:val="31"/>
+  </w:num>
+  <w:num w:numId="22" w16cid:durableId="383872113">
+    <w:abstractNumId w:val="24"/>
+  </w:num>
+  <w:num w:numId="23" w16cid:durableId="618537660">
+    <w:abstractNumId w:val="18"/>
+  </w:num>
+  <w:num w:numId="24" w16cid:durableId="206793581">
+    <w:abstractNumId w:val="11"/>
+  </w:num>
+  <w:num w:numId="25" w16cid:durableId="432167381">
     <w:abstractNumId w:val="35"/>
   </w:num>
-  <w:num w:numId="17" w16cid:durableId="2143111938">
-    <w:abstractNumId w:val="8"/>
-  </w:num>
-  <w:num w:numId="18" w16cid:durableId="1659918386">
-    <w:abstractNumId w:val="25"/>
-  </w:num>
-  <w:num w:numId="19" w16cid:durableId="121577458">
-    <w:abstractNumId w:val="28"/>
-  </w:num>
-  <w:num w:numId="20" w16cid:durableId="583997274">
-    <w:abstractNumId w:val="31"/>
-  </w:num>
-  <w:num w:numId="21" w16cid:durableId="1368990998">
-    <w:abstractNumId w:val="27"/>
-  </w:num>
-  <w:num w:numId="22" w16cid:durableId="383872113">
-    <w:abstractNumId w:val="22"/>
-  </w:num>
-  <w:num w:numId="23" w16cid:durableId="618537660">
-    <w:abstractNumId w:val="17"/>
-  </w:num>
-  <w:num w:numId="24" w16cid:durableId="206793581">
-    <w:abstractNumId w:val="10"/>
-  </w:num>
-  <w:num w:numId="25" w16cid:durableId="432167381">
-    <w:abstractNumId w:val="30"/>
-  </w:num>
   <w:num w:numId="26" w16cid:durableId="46298458">
-    <w:abstractNumId w:val="11"/>
+    <w:abstractNumId w:val="12"/>
   </w:num>
   <w:num w:numId="27" w16cid:durableId="1548419807">
-    <w:abstractNumId w:val="34"/>
+    <w:abstractNumId w:val="39"/>
   </w:num>
   <w:num w:numId="28" w16cid:durableId="460533991">
-    <w:abstractNumId w:val="19"/>
+    <w:abstractNumId w:val="21"/>
   </w:num>
   <w:num w:numId="29" w16cid:durableId="1334147725">
     <w:abstractNumId w:val="1"/>
@@ -17733,25 +20959,40 @@
     <w:abstractNumId w:val="2"/>
   </w:num>
   <w:num w:numId="31" w16cid:durableId="1864978803">
-    <w:abstractNumId w:val="36"/>
+    <w:abstractNumId w:val="41"/>
   </w:num>
   <w:num w:numId="32" w16cid:durableId="1133524913">
-    <w:abstractNumId w:val="24"/>
+    <w:abstractNumId w:val="27"/>
   </w:num>
   <w:num w:numId="33" w16cid:durableId="672415094">
-    <w:abstractNumId w:val="14"/>
+    <w:abstractNumId w:val="15"/>
   </w:num>
   <w:num w:numId="34" w16cid:durableId="1347100950">
-    <w:abstractNumId w:val="20"/>
+    <w:abstractNumId w:val="22"/>
   </w:num>
   <w:num w:numId="35" w16cid:durableId="1093284375">
-    <w:abstractNumId w:val="9"/>
+    <w:abstractNumId w:val="10"/>
   </w:num>
   <w:num w:numId="36" w16cid:durableId="722220535">
-    <w:abstractNumId w:val="29"/>
+    <w:abstractNumId w:val="34"/>
   </w:num>
   <w:num w:numId="37" w16cid:durableId="1523206746">
-    <w:abstractNumId w:val="7"/>
+    <w:abstractNumId w:val="8"/>
+  </w:num>
+  <w:num w:numId="38" w16cid:durableId="1141776810">
+    <w:abstractNumId w:val="25"/>
+  </w:num>
+  <w:num w:numId="39" w16cid:durableId="1593051066">
+    <w:abstractNumId w:val="5"/>
+  </w:num>
+  <w:num w:numId="40" w16cid:durableId="1910144128">
+    <w:abstractNumId w:val="19"/>
+  </w:num>
+  <w:num w:numId="41" w16cid:durableId="1786727142">
+    <w:abstractNumId w:val="32"/>
+  </w:num>
+  <w:num w:numId="42" w16cid:durableId="516042199">
+    <w:abstractNumId w:val="29"/>
   </w:num>
 </w:numbering>
 </file>

</xml_diff>

<commit_message>
Atulização com projeto final
</commit_message>
<xml_diff>
--- a/Para saber mais.docx
+++ b/Para saber mais.docx
@@ -2487,6 +2487,7 @@
         <w:t xml:space="preserve">, </w:t>
       </w:r>
       <w:proofErr w:type="spellStart"/>
+      <w:proofErr w:type="gramStart"/>
       <w:r>
         <w:t>number</w:t>
       </w:r>
@@ -2499,6 +2500,7 @@
         <w:t>etc</w:t>
       </w:r>
       <w:proofErr w:type="spellEnd"/>
+      <w:proofErr w:type="gramEnd"/>
       <w:r>
         <w:t xml:space="preserve">, como também valores abstratos como: </w:t>
       </w:r>
@@ -2722,7 +2724,15 @@
     </w:p>
     <w:p>
       <w:r>
-        <w:t>#"Lista dos Médicos"{Médicos}{“Dra. Maria”}</w:t>
+        <w:t>#"Lista dos Médicos"{Médicos</w:t>
+      </w:r>
+      <w:proofErr w:type="gramStart"/>
+      <w:r>
+        <w:t>}{</w:t>
+      </w:r>
+      <w:proofErr w:type="gramEnd"/>
+      <w:r>
+        <w:t>“Dra. Maria”}</w:t>
       </w:r>
     </w:p>
     <w:p>
@@ -2743,7 +2753,15 @@
     </w:p>
     <w:p>
       <w:r>
-        <w:t>#"Lista dos Médicos"{1}{“Dra. Maria”}</w:t>
+        <w:t>#"Lista dos Médicos"{</w:t>
+      </w:r>
+      <w:proofErr w:type="gramStart"/>
+      <w:r>
+        <w:t>1}{</w:t>
+      </w:r>
+      <w:proofErr w:type="gramEnd"/>
+      <w:r>
+        <w:t>“Dra. Maria”}</w:t>
       </w:r>
     </w:p>
     <w:p>
@@ -14597,6 +14615,1134 @@
         <w:t>Como obtenho as informações sobre a pessoa médica?</w:t>
       </w:r>
     </w:p>
+    <w:p>
+      <w:pPr>
+        <w:rPr>
+          <w:b/>
+          <w:bCs/>
+        </w:rPr>
+      </w:pPr>
+      <w:r>
+        <w:rPr>
+          <w:b/>
+          <w:bCs/>
+        </w:rPr>
+        <w:t>Opinião do instrutor</w:t>
+      </w:r>
+    </w:p>
+    <w:p>
+      <w:pPr>
+        <w:numPr>
+          <w:ilvl w:val="0"/>
+          <w:numId w:val="43"/>
+        </w:numPr>
+        <w:rPr>
+          <w:b/>
+          <w:bCs/>
+        </w:rPr>
+      </w:pPr>
+    </w:p>
+    <w:p>
+      <w:pPr>
+        <w:numPr>
+          <w:ilvl w:val="0"/>
+          <w:numId w:val="43"/>
+        </w:numPr>
+        <w:rPr>
+          <w:b/>
+          <w:bCs/>
+        </w:rPr>
+      </w:pPr>
+    </w:p>
+    <w:p>
+      <w:pPr>
+        <w:rPr>
+          <w:b/>
+          <w:bCs/>
+        </w:rPr>
+      </w:pPr>
+      <w:r>
+        <w:rPr>
+          <w:b/>
+          <w:bCs/>
+        </w:rPr>
+        <w:t>Indo além</w:t>
+      </w:r>
+    </w:p>
+    <w:p>
+      <w:r>
+        <w:t>Caso você queira exercitar mais os seus conhecimentos, deixo como indicação APIs que são usadas para estudo:</w:t>
+      </w:r>
+    </w:p>
+    <w:p>
+      <w:pPr>
+        <w:numPr>
+          <w:ilvl w:val="0"/>
+          <w:numId w:val="44"/>
+        </w:numPr>
+      </w:pPr>
+      <w:hyperlink r:id="rId70" w:tgtFrame="_blank" w:history="1">
+        <w:proofErr w:type="spellStart"/>
+        <w:r>
+          <w:rPr>
+            <w:rStyle w:val="Hyperlink"/>
+          </w:rPr>
+          <w:t>PokeAPI</w:t>
+        </w:r>
+        <w:proofErr w:type="spellEnd"/>
+      </w:hyperlink>
+      <w:r>
+        <w:t xml:space="preserve"> - API sobre </w:t>
+      </w:r>
+      <w:proofErr w:type="spellStart"/>
+      <w:r>
+        <w:t>Pokemons</w:t>
+      </w:r>
+      <w:proofErr w:type="spellEnd"/>
+      <w:r>
+        <w:t>. Não deixe de explorar este </w:t>
+      </w:r>
+      <w:proofErr w:type="spellStart"/>
+      <w:r>
+        <w:fldChar w:fldCharType="begin"/>
+      </w:r>
+      <w:r>
+        <w:instrText>HYPERLINK "https://cursos.alura.com.br/extra/alura-mais/power-bi-dinamizando-parametros-da-requisicao-c1636"</w:instrText>
+      </w:r>
+      <w:r>
+        <w:fldChar w:fldCharType="separate"/>
+      </w:r>
+      <w:r>
+        <w:rPr>
+          <w:rStyle w:val="Hyperlink"/>
+        </w:rPr>
+        <w:t>Alura</w:t>
+      </w:r>
+      <w:proofErr w:type="spellEnd"/>
+      <w:r>
+        <w:rPr>
+          <w:rStyle w:val="Hyperlink"/>
+        </w:rPr>
+        <w:t>+</w:t>
+      </w:r>
+      <w:r>
+        <w:fldChar w:fldCharType="end"/>
+      </w:r>
+      <w:r>
+        <w:t xml:space="preserve">, que oferece uma abordagem alternativa na utilização de listas para realizar requisições a </w:t>
+      </w:r>
+      <w:proofErr w:type="spellStart"/>
+      <w:r>
+        <w:t>PokeAPI</w:t>
+      </w:r>
+      <w:proofErr w:type="spellEnd"/>
+      <w:r>
+        <w:t>.</w:t>
+      </w:r>
+    </w:p>
+    <w:p>
+      <w:pPr>
+        <w:numPr>
+          <w:ilvl w:val="0"/>
+          <w:numId w:val="44"/>
+        </w:numPr>
+      </w:pPr>
+      <w:hyperlink r:id="rId71" w:tgtFrame="_blank" w:history="1">
+        <w:r>
+          <w:rPr>
+            <w:rStyle w:val="Hyperlink"/>
+          </w:rPr>
+          <w:t>Chuck Norris API</w:t>
+        </w:r>
+      </w:hyperlink>
+      <w:r>
+        <w:t> - API que retorna frases sobre os feitos do Chuck Norris</w:t>
+      </w:r>
+    </w:p>
+    <w:p>
+      <w:pPr>
+        <w:numPr>
+          <w:ilvl w:val="0"/>
+          <w:numId w:val="44"/>
+        </w:numPr>
+      </w:pPr>
+      <w:hyperlink r:id="rId72" w:tgtFrame="_blank" w:history="1">
+        <w:proofErr w:type="spellStart"/>
+        <w:r>
+          <w:rPr>
+            <w:rStyle w:val="Hyperlink"/>
+          </w:rPr>
+          <w:t>Trello</w:t>
+        </w:r>
+        <w:proofErr w:type="spellEnd"/>
+        <w:r>
+          <w:rPr>
+            <w:rStyle w:val="Hyperlink"/>
+          </w:rPr>
+          <w:t xml:space="preserve"> API</w:t>
+        </w:r>
+      </w:hyperlink>
+      <w:r>
+        <w:t xml:space="preserve"> - API do </w:t>
+      </w:r>
+      <w:proofErr w:type="spellStart"/>
+      <w:r>
+        <w:t>Trello</w:t>
+      </w:r>
+      <w:proofErr w:type="spellEnd"/>
+      <w:r>
+        <w:t xml:space="preserve"> onde se obtêm informações gerais de quadros.</w:t>
+      </w:r>
+    </w:p>
+    <w:p>
+      <w:r>
+        <w:t>A </w:t>
+      </w:r>
+      <w:proofErr w:type="spellStart"/>
+      <w:r>
+        <w:rPr>
+          <w:b/>
+          <w:bCs/>
+        </w:rPr>
+        <w:t>Trello</w:t>
+      </w:r>
+      <w:proofErr w:type="spellEnd"/>
+      <w:r>
+        <w:rPr>
+          <w:b/>
+          <w:bCs/>
+        </w:rPr>
+        <w:t xml:space="preserve"> API</w:t>
+      </w:r>
+      <w:r>
+        <w:t> é uma ótima oportunidade para você desenvolver um projeto com </w:t>
+      </w:r>
+      <w:r>
+        <w:rPr>
+          <w:b/>
+          <w:bCs/>
+        </w:rPr>
+        <w:t>autenticação</w:t>
+      </w:r>
+      <w:r>
+        <w:t>. Neste </w:t>
+      </w:r>
+      <w:hyperlink r:id="rId73" w:tgtFrame="_blank" w:history="1">
+        <w:r>
+          <w:rPr>
+            <w:rStyle w:val="Hyperlink"/>
+          </w:rPr>
+          <w:t>artigo</w:t>
+        </w:r>
+      </w:hyperlink>
+      <w:r>
+        <w:t xml:space="preserve"> mostro uma forma diferente de conexão à API </w:t>
+      </w:r>
+      <w:r>
+        <w:lastRenderedPageBreak/>
+        <w:t>com o Power BI, que te ajudará no entendimento da API e como configurar o código na linguagem M.</w:t>
+      </w:r>
+    </w:p>
+    <w:p>
+      <w:r>
+        <w:t>Bons estudos e desafios!</w:t>
+      </w:r>
+    </w:p>
+    <w:p>
+      <w:r>
+        <w:t>Agora chegou o momento de colocar em prática todos os conhecimentos absorvidos para refatorar o código e lidar com os erros presentes na realização da carga dos dados. Vamos lá?</w:t>
+      </w:r>
+    </w:p>
+    <w:p>
+      <w:hyperlink r:id="rId74" w:tgtFrame="_blank" w:history="1">
+        <w:r>
+          <w:rPr>
+            <w:rStyle w:val="Hyperlink"/>
+            <w:b/>
+            <w:bCs/>
+          </w:rPr>
+          <w:t> Discutir no Fórum</w:t>
+        </w:r>
+      </w:hyperlink>
+    </w:p>
+    <w:p>
+      <w:r>
+        <w:t>Agora chegou o momento de colocar em prática todos os conhecimentos absorvidos para refatorar o código e lidar com os erros presentes na realização da carga dos dados. Vamos lá?</w:t>
+      </w:r>
+    </w:p>
+    <w:p>
+      <w:r>
+        <w:t>Ver opinião do instrutor</w:t>
+      </w:r>
+    </w:p>
+    <w:p>
+      <w:pPr>
+        <w:rPr>
+          <w:b/>
+          <w:bCs/>
+        </w:rPr>
+      </w:pPr>
+      <w:r>
+        <w:rPr>
+          <w:b/>
+          <w:bCs/>
+        </w:rPr>
+        <w:t>Opinião do instrutor</w:t>
+      </w:r>
+    </w:p>
+    <w:p>
+      <w:pPr>
+        <w:numPr>
+          <w:ilvl w:val="0"/>
+          <w:numId w:val="45"/>
+        </w:numPr>
+        <w:rPr>
+          <w:b/>
+          <w:bCs/>
+        </w:rPr>
+      </w:pPr>
+    </w:p>
+    <w:p>
+      <w:pPr>
+        <w:numPr>
+          <w:ilvl w:val="0"/>
+          <w:numId w:val="45"/>
+        </w:numPr>
+        <w:rPr>
+          <w:b/>
+          <w:bCs/>
+        </w:rPr>
+      </w:pPr>
+    </w:p>
+    <w:p>
+      <w:r>
+        <w:t>Para começar a organização, vamos remover o atributo [</w:t>
+      </w:r>
+      <w:proofErr w:type="spellStart"/>
+      <w:r>
+        <w:t>content</w:t>
+      </w:r>
+      <w:proofErr w:type="spellEnd"/>
+      <w:r>
+        <w:t>] da variável #"Requisição" para que ela seja reutilizada em outras partes do código:</w:t>
+      </w:r>
+    </w:p>
+    <w:p>
+      <w:r>
+        <w:t xml:space="preserve">#"Requisição" = </w:t>
+      </w:r>
+    </w:p>
+    <w:p>
+      <w:r>
+        <w:t xml:space="preserve">        (</w:t>
+      </w:r>
+      <w:proofErr w:type="spellStart"/>
+      <w:r>
+        <w:t>numeroPagina</w:t>
+      </w:r>
+      <w:proofErr w:type="spellEnd"/>
+      <w:r>
+        <w:t>) =&gt;</w:t>
+      </w:r>
+    </w:p>
+    <w:p>
+      <w:r>
+        <w:t xml:space="preserve">                </w:t>
+      </w:r>
+      <w:proofErr w:type="spellStart"/>
+      <w:r>
+        <w:t>Json.Document</w:t>
+      </w:r>
+      <w:proofErr w:type="spellEnd"/>
+      <w:r>
+        <w:t xml:space="preserve">(    </w:t>
+      </w:r>
+    </w:p>
+    <w:p>
+      <w:r>
+        <w:t xml:space="preserve">                    </w:t>
+      </w:r>
+      <w:proofErr w:type="spellStart"/>
+      <w:r>
+        <w:t>Web.Contents</w:t>
+      </w:r>
+      <w:proofErr w:type="spellEnd"/>
+      <w:r>
+        <w:t>("http://localhost:8080",</w:t>
+      </w:r>
+    </w:p>
+    <w:p>
+      <w:r>
+        <w:t xml:space="preserve">                        [</w:t>
+      </w:r>
+    </w:p>
+    <w:p>
+      <w:r>
+        <w:t xml:space="preserve">                            </w:t>
+      </w:r>
+      <w:proofErr w:type="spellStart"/>
+      <w:r>
+        <w:t>RelativePath</w:t>
+      </w:r>
+      <w:proofErr w:type="spellEnd"/>
+      <w:r>
+        <w:t xml:space="preserve"> = "/</w:t>
+      </w:r>
+      <w:proofErr w:type="spellStart"/>
+      <w:r>
+        <w:t>medicos</w:t>
+      </w:r>
+      <w:proofErr w:type="spellEnd"/>
+      <w:r>
+        <w:t>",</w:t>
+      </w:r>
+    </w:p>
+    <w:p>
+      <w:r>
+        <w:t xml:space="preserve">                            </w:t>
+      </w:r>
+      <w:r>
+        <w:rPr>
+          <w:b/>
+          <w:bCs/>
+        </w:rPr>
+        <w:t>Query</w:t>
+      </w:r>
+      <w:r>
+        <w:t xml:space="preserve"> = [</w:t>
+      </w:r>
+    </w:p>
+    <w:p>
+      <w:r>
+        <w:t xml:space="preserve">                                </w:t>
+      </w:r>
+      <w:proofErr w:type="spellStart"/>
+      <w:r>
+        <w:t>page</w:t>
+      </w:r>
+      <w:proofErr w:type="spellEnd"/>
+      <w:r>
+        <w:t xml:space="preserve"> = </w:t>
+      </w:r>
+      <w:proofErr w:type="spellStart"/>
+      <w:r>
+        <w:t>Number.ToText</w:t>
+      </w:r>
+      <w:proofErr w:type="spellEnd"/>
+      <w:r>
+        <w:t>(</w:t>
+      </w:r>
+      <w:proofErr w:type="spellStart"/>
+      <w:r>
+        <w:t>numeroPagina</w:t>
+      </w:r>
+      <w:proofErr w:type="spellEnd"/>
+      <w:r>
+        <w:t>)</w:t>
+      </w:r>
+    </w:p>
+    <w:p>
+      <w:r>
+        <w:t xml:space="preserve">                            ] </w:t>
+      </w:r>
+    </w:p>
+    <w:p>
+      <w:r>
+        <w:t xml:space="preserve">                        ]</w:t>
+      </w:r>
+    </w:p>
+    <w:p>
+      <w:r>
+        <w:t xml:space="preserve">                    )</w:t>
+      </w:r>
+    </w:p>
+    <w:p>
+      <w:r>
+        <w:t xml:space="preserve">                ),Copiar código</w:t>
+      </w:r>
+    </w:p>
+    <w:p>
+      <w:r>
+        <w:t>Agora, vamos remover o código utilizado na variável #"Total Paginas":</w:t>
+      </w:r>
+    </w:p>
+    <w:p>
+      <w:r>
+        <w:t xml:space="preserve">#"Total Paginas" = </w:t>
+      </w:r>
+    </w:p>
+    <w:p>
+      <w:r>
+        <w:lastRenderedPageBreak/>
+        <w:t xml:space="preserve">                        </w:t>
+      </w:r>
+      <w:proofErr w:type="spellStart"/>
+      <w:r>
+        <w:t>Json.Document</w:t>
+      </w:r>
+      <w:proofErr w:type="spellEnd"/>
+      <w:r>
+        <w:t xml:space="preserve">(    </w:t>
+      </w:r>
+    </w:p>
+    <w:p>
+      <w:r>
+        <w:t xml:space="preserve">                                </w:t>
+      </w:r>
+      <w:proofErr w:type="spellStart"/>
+      <w:r>
+        <w:t>Web.Contents</w:t>
+      </w:r>
+      <w:proofErr w:type="spellEnd"/>
+      <w:r>
+        <w:t>("http://localhost:8080",</w:t>
+      </w:r>
+    </w:p>
+    <w:p>
+      <w:r>
+        <w:t xml:space="preserve">                                    [</w:t>
+      </w:r>
+    </w:p>
+    <w:p>
+      <w:r>
+        <w:t xml:space="preserve">                                        </w:t>
+      </w:r>
+      <w:proofErr w:type="spellStart"/>
+      <w:r>
+        <w:t>RelativePath</w:t>
+      </w:r>
+      <w:proofErr w:type="spellEnd"/>
+      <w:r>
+        <w:t xml:space="preserve"> = "/</w:t>
+      </w:r>
+      <w:proofErr w:type="spellStart"/>
+      <w:r>
+        <w:t>medicos</w:t>
+      </w:r>
+      <w:proofErr w:type="spellEnd"/>
+      <w:r>
+        <w:t>",</w:t>
+      </w:r>
+    </w:p>
+    <w:p>
+      <w:r>
+        <w:t xml:space="preserve">                                        </w:t>
+      </w:r>
+      <w:r>
+        <w:rPr>
+          <w:b/>
+          <w:bCs/>
+        </w:rPr>
+        <w:t>Query</w:t>
+      </w:r>
+      <w:r>
+        <w:t xml:space="preserve"> = [</w:t>
+      </w:r>
+    </w:p>
+    <w:p>
+      <w:r>
+        <w:t xml:space="preserve">                                            </w:t>
+      </w:r>
+      <w:proofErr w:type="spellStart"/>
+      <w:r>
+        <w:t>page</w:t>
+      </w:r>
+      <w:proofErr w:type="spellEnd"/>
+      <w:r>
+        <w:t xml:space="preserve"> = "1"</w:t>
+      </w:r>
+    </w:p>
+    <w:p>
+      <w:r>
+        <w:t xml:space="preserve">                                        ] </w:t>
+      </w:r>
+    </w:p>
+    <w:p>
+      <w:r>
+        <w:t xml:space="preserve">                                    ]</w:t>
+      </w:r>
+    </w:p>
+    <w:p>
+      <w:r>
+        <w:t xml:space="preserve">                                )</w:t>
+      </w:r>
+    </w:p>
+    <w:p>
+      <w:r>
+        <w:t xml:space="preserve">                            )[</w:t>
+      </w:r>
+      <w:proofErr w:type="spellStart"/>
+      <w:r>
+        <w:t>totalPages</w:t>
+      </w:r>
+      <w:proofErr w:type="spellEnd"/>
+      <w:r>
+        <w:t>],</w:t>
+      </w:r>
+    </w:p>
+    <w:p>
+      <w:r>
+        <w:t>Copiar código</w:t>
+      </w:r>
+    </w:p>
+    <w:p>
+      <w:r>
+        <w:t>Em seguida, vamos adicionar em #"Total Paginas" um código que utiliza a variável #"Requisição" acessando o atributo [</w:t>
+      </w:r>
+      <w:proofErr w:type="spellStart"/>
+      <w:r>
+        <w:t>totalPages</w:t>
+      </w:r>
+      <w:proofErr w:type="spellEnd"/>
+      <w:r>
+        <w:t>]:</w:t>
+      </w:r>
+    </w:p>
+    <w:p>
+      <w:r>
+        <w:t>#"Total Paginas" = #"Requisição"(1)[totalPages],Copiar código</w:t>
+      </w:r>
+    </w:p>
+    <w:p>
+      <w:r>
+        <w:t>Agora, vamos simplificar a criação da variável removendo o código abaixo do script:</w:t>
+      </w:r>
+    </w:p>
+    <w:p>
+      <w:r>
+        <w:t>#"Lista Paginas" = {0 .. #"Total Paginas"-1},</w:t>
+      </w:r>
+    </w:p>
+    <w:p/>
+    <w:p>
+      <w:r>
+        <w:t xml:space="preserve">    #"Lista Dados" = </w:t>
+      </w:r>
+      <w:proofErr w:type="spellStart"/>
+      <w:r>
+        <w:t>List.Transform</w:t>
+      </w:r>
+      <w:proofErr w:type="spellEnd"/>
+      <w:r>
+        <w:t>(</w:t>
+      </w:r>
+    </w:p>
+    <w:p>
+      <w:r>
+        <w:t xml:space="preserve">                    #"Lista Paginas",</w:t>
+      </w:r>
+    </w:p>
+    <w:p>
+      <w:r>
+        <w:t xml:space="preserve">                    </w:t>
+      </w:r>
+      <w:proofErr w:type="spellStart"/>
+      <w:r>
+        <w:t>each</w:t>
+      </w:r>
+      <w:proofErr w:type="spellEnd"/>
+      <w:r>
+        <w:t xml:space="preserve"> {_, #"Requisição"(_)}</w:t>
+      </w:r>
+    </w:p>
+    <w:p>
+      <w:r>
+        <w:t xml:space="preserve">                    ),Copiar código</w:t>
+      </w:r>
+    </w:p>
+    <w:p>
+      <w:r>
+        <w:t>Com isso, atribuímos à variável #"Lista Dados" uma lista de dados com a função </w:t>
+      </w:r>
+      <w:proofErr w:type="spellStart"/>
+      <w:r>
+        <w:t>List.Generate</w:t>
+      </w:r>
+      <w:proofErr w:type="spellEnd"/>
+      <w:r>
+        <w:t>(), fazendo a requisição à API acessando o atributo [</w:t>
+      </w:r>
+      <w:proofErr w:type="spellStart"/>
+      <w:r>
+        <w:t>content</w:t>
+      </w:r>
+      <w:proofErr w:type="spellEnd"/>
+      <w:r>
+        <w:t>]:</w:t>
+      </w:r>
+    </w:p>
+    <w:p>
+      <w:r>
+        <w:t xml:space="preserve">#"Lista Dados" = </w:t>
+      </w:r>
+      <w:proofErr w:type="spellStart"/>
+      <w:r>
+        <w:t>List.Generate</w:t>
+      </w:r>
+      <w:proofErr w:type="spellEnd"/>
+      <w:r>
+        <w:t>(</w:t>
+      </w:r>
+    </w:p>
+    <w:p>
+      <w:r>
+        <w:t xml:space="preserve">                            ()=&gt; [ Pagina = 0, Consulta = #"Requisição"(0)[content]],</w:t>
+      </w:r>
+    </w:p>
+    <w:p>
+      <w:r>
+        <w:t xml:space="preserve">                            </w:t>
+      </w:r>
+      <w:proofErr w:type="spellStart"/>
+      <w:r>
+        <w:rPr>
+          <w:b/>
+          <w:bCs/>
+        </w:rPr>
+        <w:t>each</w:t>
+      </w:r>
+      <w:proofErr w:type="spellEnd"/>
+      <w:r>
+        <w:t xml:space="preserve"> [Pagina] &lt; #"Total Paginas",</w:t>
+      </w:r>
+    </w:p>
+    <w:p>
+      <w:r>
+        <w:t xml:space="preserve">                            </w:t>
+      </w:r>
+      <w:proofErr w:type="spellStart"/>
+      <w:r>
+        <w:rPr>
+          <w:b/>
+          <w:bCs/>
+        </w:rPr>
+        <w:t>each</w:t>
+      </w:r>
+      <w:proofErr w:type="spellEnd"/>
+      <w:r>
+        <w:t xml:space="preserve"> [Consulta = #"Requisição"([Pagina]+1)[content], Pagina = [Pagina]+1],</w:t>
+      </w:r>
+    </w:p>
+    <w:p>
+      <w:r>
+        <w:lastRenderedPageBreak/>
+        <w:t xml:space="preserve">                            </w:t>
+      </w:r>
+      <w:proofErr w:type="spellStart"/>
+      <w:r>
+        <w:rPr>
+          <w:b/>
+          <w:bCs/>
+        </w:rPr>
+        <w:t>each</w:t>
+      </w:r>
+      <w:proofErr w:type="spellEnd"/>
+      <w:r>
+        <w:t xml:space="preserve"> [Consulta]</w:t>
+      </w:r>
+    </w:p>
+    <w:p>
+      <w:r>
+        <w:t xml:space="preserve">                    ),</w:t>
+      </w:r>
+    </w:p>
+    <w:p>
+      <w:r>
+        <w:t>Copiar código</w:t>
+      </w:r>
+    </w:p>
+    <w:p>
+      <w:r>
+        <w:t>Por questões de erro na carga dos dados, vamos incluir o </w:t>
+      </w:r>
+      <w:proofErr w:type="spellStart"/>
+      <w:r>
+        <w:t>try</w:t>
+      </w:r>
+      <w:proofErr w:type="spellEnd"/>
+      <w:r>
+        <w:t xml:space="preserve"> … </w:t>
+      </w:r>
+      <w:proofErr w:type="spellStart"/>
+      <w:r>
+        <w:t>otherwise</w:t>
+      </w:r>
+      <w:proofErr w:type="spellEnd"/>
+      <w:r>
+        <w:t> no momento da requisição para lidar os erros apresentados:</w:t>
+      </w:r>
+    </w:p>
+    <w:p>
+      <w:r>
+        <w:t xml:space="preserve">#"Lista Dados" = </w:t>
+      </w:r>
+      <w:proofErr w:type="spellStart"/>
+      <w:r>
+        <w:t>List.Generate</w:t>
+      </w:r>
+      <w:proofErr w:type="spellEnd"/>
+      <w:r>
+        <w:t>(</w:t>
+      </w:r>
+    </w:p>
+    <w:p>
+      <w:r>
+        <w:t xml:space="preserve">                            ()=&gt; [ Pagina = 0, Consulta = </w:t>
+      </w:r>
+      <w:proofErr w:type="spellStart"/>
+      <w:r>
+        <w:t>try</w:t>
+      </w:r>
+      <w:proofErr w:type="spellEnd"/>
+      <w:r>
+        <w:t xml:space="preserve"> #"Requisição"(0)[content] </w:t>
+      </w:r>
+      <w:proofErr w:type="spellStart"/>
+      <w:r>
+        <w:t>otherwise</w:t>
+      </w:r>
+      <w:proofErr w:type="spellEnd"/>
+      <w:r>
+        <w:t xml:space="preserve"> </w:t>
+      </w:r>
+      <w:proofErr w:type="spellStart"/>
+      <w:r>
+        <w:rPr>
+          <w:b/>
+          <w:bCs/>
+        </w:rPr>
+        <w:t>null</w:t>
+      </w:r>
+      <w:proofErr w:type="spellEnd"/>
+      <w:r>
+        <w:t>],</w:t>
+      </w:r>
+    </w:p>
+    <w:p>
+      <w:r>
+        <w:t xml:space="preserve">                            </w:t>
+      </w:r>
+      <w:proofErr w:type="spellStart"/>
+      <w:r>
+        <w:rPr>
+          <w:b/>
+          <w:bCs/>
+        </w:rPr>
+        <w:t>each</w:t>
+      </w:r>
+      <w:proofErr w:type="spellEnd"/>
+      <w:r>
+        <w:t xml:space="preserve"> [Pagina] &lt; #"Total Paginas",</w:t>
+      </w:r>
+    </w:p>
+    <w:p>
+      <w:r>
+        <w:t xml:space="preserve">                            </w:t>
+      </w:r>
+      <w:proofErr w:type="spellStart"/>
+      <w:r>
+        <w:rPr>
+          <w:b/>
+          <w:bCs/>
+        </w:rPr>
+        <w:t>each</w:t>
+      </w:r>
+      <w:proofErr w:type="spellEnd"/>
+      <w:r>
+        <w:t xml:space="preserve"> [Consulta = </w:t>
+      </w:r>
+      <w:proofErr w:type="spellStart"/>
+      <w:r>
+        <w:t>try</w:t>
+      </w:r>
+      <w:proofErr w:type="spellEnd"/>
+      <w:r>
+        <w:t xml:space="preserve"> #"Requisição"([Pagina]+1)[content] </w:t>
+      </w:r>
+      <w:proofErr w:type="spellStart"/>
+      <w:r>
+        <w:t>otherwise</w:t>
+      </w:r>
+      <w:proofErr w:type="spellEnd"/>
+      <w:r>
+        <w:t xml:space="preserve"> </w:t>
+      </w:r>
+      <w:proofErr w:type="spellStart"/>
+      <w:r>
+        <w:rPr>
+          <w:b/>
+          <w:bCs/>
+        </w:rPr>
+        <w:t>null</w:t>
+      </w:r>
+      <w:proofErr w:type="spellEnd"/>
+      <w:r>
+        <w:t>, Pagina = [Pagina]+1],</w:t>
+      </w:r>
+    </w:p>
+    <w:p>
+      <w:r>
+        <w:t xml:space="preserve">                            </w:t>
+      </w:r>
+      <w:proofErr w:type="spellStart"/>
+      <w:r>
+        <w:rPr>
+          <w:b/>
+          <w:bCs/>
+        </w:rPr>
+        <w:t>each</w:t>
+      </w:r>
+      <w:proofErr w:type="spellEnd"/>
+      <w:r>
+        <w:t xml:space="preserve"> [Consulta]</w:t>
+      </w:r>
+    </w:p>
+    <w:p>
+      <w:r>
+        <w:t xml:space="preserve">                    ),</w:t>
+      </w:r>
+    </w:p>
+    <w:p>
+      <w:r>
+        <w:t>Copiar código</w:t>
+      </w:r>
+    </w:p>
+    <w:p>
+      <w:r>
+        <w:t>Dado que a lista obtida tem um formato diferente do formato anterior, vamos remover a criação da tabela na variável #"Tabela":</w:t>
+      </w:r>
+    </w:p>
+    <w:p>
+      <w:pPr>
+        <w:rPr>
+          <w:lang w:val="en-US"/>
+        </w:rPr>
+      </w:pPr>
+      <w:r>
+        <w:rPr>
+          <w:lang w:val="en-US"/>
+        </w:rPr>
+        <w:t>Table.ExpandListColumn(</w:t>
+      </w:r>
+    </w:p>
+    <w:p>
+      <w:pPr>
+        <w:rPr>
+          <w:lang w:val="en-US"/>
+        </w:rPr>
+      </w:pPr>
+      <w:r>
+        <w:rPr>
+          <w:lang w:val="en-US"/>
+        </w:rPr>
+        <w:t xml:space="preserve">                                #table(</w:t>
+      </w:r>
+    </w:p>
+    <w:p>
+      <w:pPr>
+        <w:rPr>
+          <w:lang w:val="en-US"/>
+        </w:rPr>
+      </w:pPr>
+      <w:r>
+        <w:rPr>
+          <w:lang w:val="en-US"/>
+        </w:rPr>
+        <w:t xml:space="preserve">                                    type table</w:t>
+      </w:r>
+    </w:p>
+    <w:p>
+      <w:pPr>
+        <w:rPr>
+          <w:lang w:val="en-US"/>
+        </w:rPr>
+      </w:pPr>
+      <w:r>
+        <w:rPr>
+          <w:lang w:val="en-US"/>
+        </w:rPr>
+        <w:t xml:space="preserve">                                    [ Pagina=text, Dados=list],</w:t>
+      </w:r>
+    </w:p>
+    <w:p>
+      <w:r>
+        <w:rPr>
+          <w:lang w:val="en-US"/>
+        </w:rPr>
+        <w:t xml:space="preserve">                                    </w:t>
+      </w:r>
+      <w:r>
+        <w:t>#"Lista Dados"</w:t>
+      </w:r>
+    </w:p>
+    <w:p>
+      <w:r>
+        <w:t xml:space="preserve">                                ),</w:t>
+      </w:r>
+    </w:p>
+    <w:p>
+      <w:r>
+        <w:t xml:space="preserve">                                "Dados"</w:t>
+      </w:r>
+    </w:p>
+    <w:p>
+      <w:r>
+        <w:t xml:space="preserve">                    ),</w:t>
+      </w:r>
+    </w:p>
+    <w:p>
+      <w:r>
+        <w:t xml:space="preserve">            ”Dados”</w:t>
+      </w:r>
+    </w:p>
+    <w:p>
+      <w:r>
+        <w:t xml:space="preserve">            //resto </w:t>
+      </w:r>
+      <w:r>
+        <w:rPr>
+          <w:b/>
+          <w:bCs/>
+        </w:rPr>
+        <w:t>do</w:t>
+      </w:r>
+      <w:r>
+        <w:t xml:space="preserve"> </w:t>
+      </w:r>
+      <w:proofErr w:type="spellStart"/>
+      <w:r>
+        <w:t>códigoCopiar</w:t>
+      </w:r>
+      <w:proofErr w:type="spellEnd"/>
+      <w:r>
+        <w:t xml:space="preserve"> código</w:t>
+      </w:r>
+    </w:p>
+    <w:p>
+      <w:r>
+        <w:t>Dentro da função </w:t>
+      </w:r>
+      <w:proofErr w:type="spellStart"/>
+      <w:r>
+        <w:t>Table.ExpandListColumn</w:t>
+      </w:r>
+      <w:proofErr w:type="spellEnd"/>
+      <w:r>
+        <w:t>() vamos adicionar a conversão da variável #"Lista Dados" em tabela, obtendo o resultado desejado:</w:t>
+      </w:r>
+    </w:p>
+    <w:p>
+      <w:pPr>
+        <w:rPr>
+          <w:lang w:val="en-US"/>
+        </w:rPr>
+      </w:pPr>
+      <w:r>
+        <w:rPr>
+          <w:lang w:val="en-US"/>
+        </w:rPr>
+        <w:t>Table.ExpandListColumn(</w:t>
+      </w:r>
+    </w:p>
+    <w:p>
+      <w:pPr>
+        <w:rPr>
+          <w:lang w:val="en-US"/>
+        </w:rPr>
+      </w:pPr>
+      <w:r>
+        <w:rPr>
+          <w:lang w:val="en-US"/>
+        </w:rPr>
+        <w:t xml:space="preserve">                                Table.FromList(</w:t>
+      </w:r>
+    </w:p>
+    <w:p>
+      <w:pPr>
+        <w:rPr>
+          <w:lang w:val="en-US"/>
+        </w:rPr>
+      </w:pPr>
+      <w:r>
+        <w:rPr>
+          <w:lang w:val="en-US"/>
+        </w:rPr>
+        <w:lastRenderedPageBreak/>
+        <w:t xml:space="preserve">                                    #"Lista Dados", </w:t>
+      </w:r>
+    </w:p>
+    <w:p>
+      <w:pPr>
+        <w:rPr>
+          <w:lang w:val="en-US"/>
+        </w:rPr>
+      </w:pPr>
+      <w:r>
+        <w:rPr>
+          <w:lang w:val="en-US"/>
+        </w:rPr>
+        <w:t xml:space="preserve">                                    Splitter.SplitByNothing(), </w:t>
+      </w:r>
+      <w:r>
+        <w:rPr>
+          <w:b/>
+          <w:bCs/>
+          <w:lang w:val="en-US"/>
+        </w:rPr>
+        <w:t>null</w:t>
+      </w:r>
+      <w:r>
+        <w:rPr>
+          <w:lang w:val="en-US"/>
+        </w:rPr>
+        <w:t xml:space="preserve">, </w:t>
+      </w:r>
+      <w:r>
+        <w:rPr>
+          <w:b/>
+          <w:bCs/>
+          <w:lang w:val="en-US"/>
+        </w:rPr>
+        <w:t>null</w:t>
+      </w:r>
+      <w:r>
+        <w:rPr>
+          <w:lang w:val="en-US"/>
+        </w:rPr>
+        <w:t>, ExtraValues.Error</w:t>
+      </w:r>
+    </w:p>
+    <w:p>
+      <w:r>
+        <w:rPr>
+          <w:lang w:val="en-US"/>
+        </w:rPr>
+        <w:t xml:space="preserve">                                </w:t>
+      </w:r>
+      <w:r>
+        <w:t>),</w:t>
+      </w:r>
+    </w:p>
+    <w:p>
+      <w:r>
+        <w:t xml:space="preserve">                                "Column1"</w:t>
+      </w:r>
+    </w:p>
+    <w:p>
+      <w:r>
+        <w:t xml:space="preserve">                    ),</w:t>
+      </w:r>
+    </w:p>
+    <w:p>
+      <w:r>
+        <w:t xml:space="preserve">            "Column1",</w:t>
+      </w:r>
+    </w:p>
+    <w:p>
+      <w:r>
+        <w:t xml:space="preserve">            //resto do código</w:t>
+      </w:r>
+    </w:p>
     <w:p/>
     <w:sectPr>
       <w:pgSz w:w="11906" w:h="16838"/>
@@ -17293,6 +18439,155 @@
     </w:lvl>
   </w:abstractNum>
   <w:abstractNum w:abstractNumId="18" w15:restartNumberingAfterBreak="0">
+    <w:nsid w:val="214A4FD2"/>
+    <w:multiLevelType w:val="multilevel"/>
+    <w:tmpl w:val="C7F0FE8C"/>
+    <w:lvl w:ilvl="0">
+      <w:start w:val="1"/>
+      <w:numFmt w:val="bullet"/>
+      <w:lvlText w:val=""/>
+      <w:lvlJc w:val="left"/>
+      <w:pPr>
+        <w:tabs>
+          <w:tab w:val="num" w:pos="720"/>
+        </w:tabs>
+        <w:ind w:left="720" w:hanging="360"/>
+      </w:pPr>
+      <w:rPr>
+        <w:rFonts w:ascii="Symbol" w:hAnsi="Symbol" w:hint="default"/>
+        <w:sz w:val="20"/>
+      </w:rPr>
+    </w:lvl>
+    <w:lvl w:ilvl="1" w:tentative="1">
+      <w:start w:val="1"/>
+      <w:numFmt w:val="bullet"/>
+      <w:lvlText w:val="o"/>
+      <w:lvlJc w:val="left"/>
+      <w:pPr>
+        <w:tabs>
+          <w:tab w:val="num" w:pos="1440"/>
+        </w:tabs>
+        <w:ind w:left="1440" w:hanging="360"/>
+      </w:pPr>
+      <w:rPr>
+        <w:rFonts w:ascii="Courier New" w:hAnsi="Courier New" w:hint="default"/>
+        <w:sz w:val="20"/>
+      </w:rPr>
+    </w:lvl>
+    <w:lvl w:ilvl="2" w:tentative="1">
+      <w:start w:val="1"/>
+      <w:numFmt w:val="bullet"/>
+      <w:lvlText w:val=""/>
+      <w:lvlJc w:val="left"/>
+      <w:pPr>
+        <w:tabs>
+          <w:tab w:val="num" w:pos="2160"/>
+        </w:tabs>
+        <w:ind w:left="2160" w:hanging="360"/>
+      </w:pPr>
+      <w:rPr>
+        <w:rFonts w:ascii="Wingdings" w:hAnsi="Wingdings" w:hint="default"/>
+        <w:sz w:val="20"/>
+      </w:rPr>
+    </w:lvl>
+    <w:lvl w:ilvl="3" w:tentative="1">
+      <w:start w:val="1"/>
+      <w:numFmt w:val="bullet"/>
+      <w:lvlText w:val=""/>
+      <w:lvlJc w:val="left"/>
+      <w:pPr>
+        <w:tabs>
+          <w:tab w:val="num" w:pos="2880"/>
+        </w:tabs>
+        <w:ind w:left="2880" w:hanging="360"/>
+      </w:pPr>
+      <w:rPr>
+        <w:rFonts w:ascii="Wingdings" w:hAnsi="Wingdings" w:hint="default"/>
+        <w:sz w:val="20"/>
+      </w:rPr>
+    </w:lvl>
+    <w:lvl w:ilvl="4" w:tentative="1">
+      <w:start w:val="1"/>
+      <w:numFmt w:val="bullet"/>
+      <w:lvlText w:val=""/>
+      <w:lvlJc w:val="left"/>
+      <w:pPr>
+        <w:tabs>
+          <w:tab w:val="num" w:pos="3600"/>
+        </w:tabs>
+        <w:ind w:left="3600" w:hanging="360"/>
+      </w:pPr>
+      <w:rPr>
+        <w:rFonts w:ascii="Wingdings" w:hAnsi="Wingdings" w:hint="default"/>
+        <w:sz w:val="20"/>
+      </w:rPr>
+    </w:lvl>
+    <w:lvl w:ilvl="5" w:tentative="1">
+      <w:start w:val="1"/>
+      <w:numFmt w:val="bullet"/>
+      <w:lvlText w:val=""/>
+      <w:lvlJc w:val="left"/>
+      <w:pPr>
+        <w:tabs>
+          <w:tab w:val="num" w:pos="4320"/>
+        </w:tabs>
+        <w:ind w:left="4320" w:hanging="360"/>
+      </w:pPr>
+      <w:rPr>
+        <w:rFonts w:ascii="Wingdings" w:hAnsi="Wingdings" w:hint="default"/>
+        <w:sz w:val="20"/>
+      </w:rPr>
+    </w:lvl>
+    <w:lvl w:ilvl="6" w:tentative="1">
+      <w:start w:val="1"/>
+      <w:numFmt w:val="bullet"/>
+      <w:lvlText w:val=""/>
+      <w:lvlJc w:val="left"/>
+      <w:pPr>
+        <w:tabs>
+          <w:tab w:val="num" w:pos="5040"/>
+        </w:tabs>
+        <w:ind w:left="5040" w:hanging="360"/>
+      </w:pPr>
+      <w:rPr>
+        <w:rFonts w:ascii="Wingdings" w:hAnsi="Wingdings" w:hint="default"/>
+        <w:sz w:val="20"/>
+      </w:rPr>
+    </w:lvl>
+    <w:lvl w:ilvl="7" w:tentative="1">
+      <w:start w:val="1"/>
+      <w:numFmt w:val="bullet"/>
+      <w:lvlText w:val=""/>
+      <w:lvlJc w:val="left"/>
+      <w:pPr>
+        <w:tabs>
+          <w:tab w:val="num" w:pos="5760"/>
+        </w:tabs>
+        <w:ind w:left="5760" w:hanging="360"/>
+      </w:pPr>
+      <w:rPr>
+        <w:rFonts w:ascii="Wingdings" w:hAnsi="Wingdings" w:hint="default"/>
+        <w:sz w:val="20"/>
+      </w:rPr>
+    </w:lvl>
+    <w:lvl w:ilvl="8" w:tentative="1">
+      <w:start w:val="1"/>
+      <w:numFmt w:val="bullet"/>
+      <w:lvlText w:val=""/>
+      <w:lvlJc w:val="left"/>
+      <w:pPr>
+        <w:tabs>
+          <w:tab w:val="num" w:pos="6480"/>
+        </w:tabs>
+        <w:ind w:left="6480" w:hanging="360"/>
+      </w:pPr>
+      <w:rPr>
+        <w:rFonts w:ascii="Wingdings" w:hAnsi="Wingdings" w:hint="default"/>
+        <w:sz w:val="20"/>
+      </w:rPr>
+    </w:lvl>
+  </w:abstractNum>
+  <w:abstractNum w:abstractNumId="19" w15:restartNumberingAfterBreak="0">
     <w:nsid w:val="2268280E"/>
     <w:multiLevelType w:val="multilevel"/>
     <w:tmpl w:val="C86C7BF8"/>
@@ -17441,7 +18736,7 @@
       </w:rPr>
     </w:lvl>
   </w:abstractNum>
-  <w:abstractNum w:abstractNumId="19" w15:restartNumberingAfterBreak="0">
+  <w:abstractNum w:abstractNumId="20" w15:restartNumberingAfterBreak="0">
     <w:nsid w:val="22FB234E"/>
     <w:multiLevelType w:val="multilevel"/>
     <w:tmpl w:val="3A320486"/>
@@ -17590,7 +18885,7 @@
       </w:rPr>
     </w:lvl>
   </w:abstractNum>
-  <w:abstractNum w:abstractNumId="20" w15:restartNumberingAfterBreak="0">
+  <w:abstractNum w:abstractNumId="21" w15:restartNumberingAfterBreak="0">
     <w:nsid w:val="23E8472E"/>
     <w:multiLevelType w:val="multilevel"/>
     <w:tmpl w:val="D47E6894"/>
@@ -17739,7 +19034,7 @@
       </w:rPr>
     </w:lvl>
   </w:abstractNum>
-  <w:abstractNum w:abstractNumId="21" w15:restartNumberingAfterBreak="0">
+  <w:abstractNum w:abstractNumId="22" w15:restartNumberingAfterBreak="0">
     <w:nsid w:val="2A3746E9"/>
     <w:multiLevelType w:val="multilevel"/>
     <w:tmpl w:val="2A488F2C"/>
@@ -17888,7 +19183,7 @@
       </w:rPr>
     </w:lvl>
   </w:abstractNum>
-  <w:abstractNum w:abstractNumId="22" w15:restartNumberingAfterBreak="0">
+  <w:abstractNum w:abstractNumId="23" w15:restartNumberingAfterBreak="0">
     <w:nsid w:val="2BD65E0D"/>
     <w:multiLevelType w:val="multilevel"/>
     <w:tmpl w:val="DFF6A488"/>
@@ -18037,7 +19332,7 @@
       </w:rPr>
     </w:lvl>
   </w:abstractNum>
-  <w:abstractNum w:abstractNumId="23" w15:restartNumberingAfterBreak="0">
+  <w:abstractNum w:abstractNumId="24" w15:restartNumberingAfterBreak="0">
     <w:nsid w:val="2F4411AB"/>
     <w:multiLevelType w:val="multilevel"/>
     <w:tmpl w:val="0938F92C"/>
@@ -18186,7 +19481,7 @@
       </w:rPr>
     </w:lvl>
   </w:abstractNum>
-  <w:abstractNum w:abstractNumId="24" w15:restartNumberingAfterBreak="0">
+  <w:abstractNum w:abstractNumId="25" w15:restartNumberingAfterBreak="0">
     <w:nsid w:val="32BB002F"/>
     <w:multiLevelType w:val="multilevel"/>
     <w:tmpl w:val="600ADF90"/>
@@ -18335,7 +19630,7 @@
       </w:rPr>
     </w:lvl>
   </w:abstractNum>
-  <w:abstractNum w:abstractNumId="25" w15:restartNumberingAfterBreak="0">
+  <w:abstractNum w:abstractNumId="26" w15:restartNumberingAfterBreak="0">
     <w:nsid w:val="35F527AA"/>
     <w:multiLevelType w:val="multilevel"/>
     <w:tmpl w:val="B44C59E2"/>
@@ -18484,7 +19779,7 @@
       </w:rPr>
     </w:lvl>
   </w:abstractNum>
-  <w:abstractNum w:abstractNumId="26" w15:restartNumberingAfterBreak="0">
+  <w:abstractNum w:abstractNumId="27" w15:restartNumberingAfterBreak="0">
     <w:nsid w:val="3AF93231"/>
     <w:multiLevelType w:val="multilevel"/>
     <w:tmpl w:val="612C42CA"/>
@@ -18633,7 +19928,7 @@
       </w:rPr>
     </w:lvl>
   </w:abstractNum>
-  <w:abstractNum w:abstractNumId="27" w15:restartNumberingAfterBreak="0">
+  <w:abstractNum w:abstractNumId="28" w15:restartNumberingAfterBreak="0">
     <w:nsid w:val="4E31728E"/>
     <w:multiLevelType w:val="multilevel"/>
     <w:tmpl w:val="0C2647F2"/>
@@ -18782,7 +20077,7 @@
       </w:rPr>
     </w:lvl>
   </w:abstractNum>
-  <w:abstractNum w:abstractNumId="28" w15:restartNumberingAfterBreak="0">
+  <w:abstractNum w:abstractNumId="29" w15:restartNumberingAfterBreak="0">
     <w:nsid w:val="53885571"/>
     <w:multiLevelType w:val="multilevel"/>
     <w:tmpl w:val="312496AC"/>
@@ -18931,7 +20226,7 @@
       </w:rPr>
     </w:lvl>
   </w:abstractNum>
-  <w:abstractNum w:abstractNumId="29" w15:restartNumberingAfterBreak="0">
+  <w:abstractNum w:abstractNumId="30" w15:restartNumberingAfterBreak="0">
     <w:nsid w:val="58102DB2"/>
     <w:multiLevelType w:val="multilevel"/>
     <w:tmpl w:val="905C891A"/>
@@ -19080,7 +20375,7 @@
       </w:rPr>
     </w:lvl>
   </w:abstractNum>
-  <w:abstractNum w:abstractNumId="30" w15:restartNumberingAfterBreak="0">
+  <w:abstractNum w:abstractNumId="31" w15:restartNumberingAfterBreak="0">
     <w:nsid w:val="59624F10"/>
     <w:multiLevelType w:val="multilevel"/>
     <w:tmpl w:val="C8ACE9C4"/>
@@ -19229,7 +20524,7 @@
       </w:rPr>
     </w:lvl>
   </w:abstractNum>
-  <w:abstractNum w:abstractNumId="31" w15:restartNumberingAfterBreak="0">
+  <w:abstractNum w:abstractNumId="32" w15:restartNumberingAfterBreak="0">
     <w:nsid w:val="5B1A2EC3"/>
     <w:multiLevelType w:val="multilevel"/>
     <w:tmpl w:val="45484B64"/>
@@ -19378,7 +20673,156 @@
       </w:rPr>
     </w:lvl>
   </w:abstractNum>
-  <w:abstractNum w:abstractNumId="32" w15:restartNumberingAfterBreak="0">
+  <w:abstractNum w:abstractNumId="33" w15:restartNumberingAfterBreak="0">
+    <w:nsid w:val="5B952EA9"/>
+    <w:multiLevelType w:val="multilevel"/>
+    <w:tmpl w:val="AF9211B6"/>
+    <w:lvl w:ilvl="0">
+      <w:start w:val="1"/>
+      <w:numFmt w:val="bullet"/>
+      <w:lvlText w:val=""/>
+      <w:lvlJc w:val="left"/>
+      <w:pPr>
+        <w:tabs>
+          <w:tab w:val="num" w:pos="720"/>
+        </w:tabs>
+        <w:ind w:left="720" w:hanging="360"/>
+      </w:pPr>
+      <w:rPr>
+        <w:rFonts w:ascii="Symbol" w:hAnsi="Symbol" w:hint="default"/>
+        <w:sz w:val="20"/>
+      </w:rPr>
+    </w:lvl>
+    <w:lvl w:ilvl="1" w:tentative="1">
+      <w:start w:val="1"/>
+      <w:numFmt w:val="bullet"/>
+      <w:lvlText w:val="o"/>
+      <w:lvlJc w:val="left"/>
+      <w:pPr>
+        <w:tabs>
+          <w:tab w:val="num" w:pos="1440"/>
+        </w:tabs>
+        <w:ind w:left="1440" w:hanging="360"/>
+      </w:pPr>
+      <w:rPr>
+        <w:rFonts w:ascii="Courier New" w:hAnsi="Courier New" w:hint="default"/>
+        <w:sz w:val="20"/>
+      </w:rPr>
+    </w:lvl>
+    <w:lvl w:ilvl="2" w:tentative="1">
+      <w:start w:val="1"/>
+      <w:numFmt w:val="bullet"/>
+      <w:lvlText w:val=""/>
+      <w:lvlJc w:val="left"/>
+      <w:pPr>
+        <w:tabs>
+          <w:tab w:val="num" w:pos="2160"/>
+        </w:tabs>
+        <w:ind w:left="2160" w:hanging="360"/>
+      </w:pPr>
+      <w:rPr>
+        <w:rFonts w:ascii="Wingdings" w:hAnsi="Wingdings" w:hint="default"/>
+        <w:sz w:val="20"/>
+      </w:rPr>
+    </w:lvl>
+    <w:lvl w:ilvl="3" w:tentative="1">
+      <w:start w:val="1"/>
+      <w:numFmt w:val="bullet"/>
+      <w:lvlText w:val=""/>
+      <w:lvlJc w:val="left"/>
+      <w:pPr>
+        <w:tabs>
+          <w:tab w:val="num" w:pos="2880"/>
+        </w:tabs>
+        <w:ind w:left="2880" w:hanging="360"/>
+      </w:pPr>
+      <w:rPr>
+        <w:rFonts w:ascii="Wingdings" w:hAnsi="Wingdings" w:hint="default"/>
+        <w:sz w:val="20"/>
+      </w:rPr>
+    </w:lvl>
+    <w:lvl w:ilvl="4" w:tentative="1">
+      <w:start w:val="1"/>
+      <w:numFmt w:val="bullet"/>
+      <w:lvlText w:val=""/>
+      <w:lvlJc w:val="left"/>
+      <w:pPr>
+        <w:tabs>
+          <w:tab w:val="num" w:pos="3600"/>
+        </w:tabs>
+        <w:ind w:left="3600" w:hanging="360"/>
+      </w:pPr>
+      <w:rPr>
+        <w:rFonts w:ascii="Wingdings" w:hAnsi="Wingdings" w:hint="default"/>
+        <w:sz w:val="20"/>
+      </w:rPr>
+    </w:lvl>
+    <w:lvl w:ilvl="5" w:tentative="1">
+      <w:start w:val="1"/>
+      <w:numFmt w:val="bullet"/>
+      <w:lvlText w:val=""/>
+      <w:lvlJc w:val="left"/>
+      <w:pPr>
+        <w:tabs>
+          <w:tab w:val="num" w:pos="4320"/>
+        </w:tabs>
+        <w:ind w:left="4320" w:hanging="360"/>
+      </w:pPr>
+      <w:rPr>
+        <w:rFonts w:ascii="Wingdings" w:hAnsi="Wingdings" w:hint="default"/>
+        <w:sz w:val="20"/>
+      </w:rPr>
+    </w:lvl>
+    <w:lvl w:ilvl="6" w:tentative="1">
+      <w:start w:val="1"/>
+      <w:numFmt w:val="bullet"/>
+      <w:lvlText w:val=""/>
+      <w:lvlJc w:val="left"/>
+      <w:pPr>
+        <w:tabs>
+          <w:tab w:val="num" w:pos="5040"/>
+        </w:tabs>
+        <w:ind w:left="5040" w:hanging="360"/>
+      </w:pPr>
+      <w:rPr>
+        <w:rFonts w:ascii="Wingdings" w:hAnsi="Wingdings" w:hint="default"/>
+        <w:sz w:val="20"/>
+      </w:rPr>
+    </w:lvl>
+    <w:lvl w:ilvl="7" w:tentative="1">
+      <w:start w:val="1"/>
+      <w:numFmt w:val="bullet"/>
+      <w:lvlText w:val=""/>
+      <w:lvlJc w:val="left"/>
+      <w:pPr>
+        <w:tabs>
+          <w:tab w:val="num" w:pos="5760"/>
+        </w:tabs>
+        <w:ind w:left="5760" w:hanging="360"/>
+      </w:pPr>
+      <w:rPr>
+        <w:rFonts w:ascii="Wingdings" w:hAnsi="Wingdings" w:hint="default"/>
+        <w:sz w:val="20"/>
+      </w:rPr>
+    </w:lvl>
+    <w:lvl w:ilvl="8" w:tentative="1">
+      <w:start w:val="1"/>
+      <w:numFmt w:val="bullet"/>
+      <w:lvlText w:val=""/>
+      <w:lvlJc w:val="left"/>
+      <w:pPr>
+        <w:tabs>
+          <w:tab w:val="num" w:pos="6480"/>
+        </w:tabs>
+        <w:ind w:left="6480" w:hanging="360"/>
+      </w:pPr>
+      <w:rPr>
+        <w:rFonts w:ascii="Wingdings" w:hAnsi="Wingdings" w:hint="default"/>
+        <w:sz w:val="20"/>
+      </w:rPr>
+    </w:lvl>
+  </w:abstractNum>
+  <w:abstractNum w:abstractNumId="34" w15:restartNumberingAfterBreak="0">
     <w:nsid w:val="655D003D"/>
     <w:multiLevelType w:val="multilevel"/>
     <w:tmpl w:val="A8460994"/>
@@ -19527,7 +20971,156 @@
       </w:rPr>
     </w:lvl>
   </w:abstractNum>
-  <w:abstractNum w:abstractNumId="33" w15:restartNumberingAfterBreak="0">
+  <w:abstractNum w:abstractNumId="35" w15:restartNumberingAfterBreak="0">
+    <w:nsid w:val="67E635C7"/>
+    <w:multiLevelType w:val="multilevel"/>
+    <w:tmpl w:val="8D8489A8"/>
+    <w:lvl w:ilvl="0">
+      <w:start w:val="1"/>
+      <w:numFmt w:val="bullet"/>
+      <w:lvlText w:val=""/>
+      <w:lvlJc w:val="left"/>
+      <w:pPr>
+        <w:tabs>
+          <w:tab w:val="num" w:pos="720"/>
+        </w:tabs>
+        <w:ind w:left="720" w:hanging="360"/>
+      </w:pPr>
+      <w:rPr>
+        <w:rFonts w:ascii="Symbol" w:hAnsi="Symbol" w:hint="default"/>
+        <w:sz w:val="20"/>
+      </w:rPr>
+    </w:lvl>
+    <w:lvl w:ilvl="1" w:tentative="1">
+      <w:start w:val="1"/>
+      <w:numFmt w:val="bullet"/>
+      <w:lvlText w:val="o"/>
+      <w:lvlJc w:val="left"/>
+      <w:pPr>
+        <w:tabs>
+          <w:tab w:val="num" w:pos="1440"/>
+        </w:tabs>
+        <w:ind w:left="1440" w:hanging="360"/>
+      </w:pPr>
+      <w:rPr>
+        <w:rFonts w:ascii="Courier New" w:hAnsi="Courier New" w:hint="default"/>
+        <w:sz w:val="20"/>
+      </w:rPr>
+    </w:lvl>
+    <w:lvl w:ilvl="2" w:tentative="1">
+      <w:start w:val="1"/>
+      <w:numFmt w:val="bullet"/>
+      <w:lvlText w:val=""/>
+      <w:lvlJc w:val="left"/>
+      <w:pPr>
+        <w:tabs>
+          <w:tab w:val="num" w:pos="2160"/>
+        </w:tabs>
+        <w:ind w:left="2160" w:hanging="360"/>
+      </w:pPr>
+      <w:rPr>
+        <w:rFonts w:ascii="Wingdings" w:hAnsi="Wingdings" w:hint="default"/>
+        <w:sz w:val="20"/>
+      </w:rPr>
+    </w:lvl>
+    <w:lvl w:ilvl="3" w:tentative="1">
+      <w:start w:val="1"/>
+      <w:numFmt w:val="bullet"/>
+      <w:lvlText w:val=""/>
+      <w:lvlJc w:val="left"/>
+      <w:pPr>
+        <w:tabs>
+          <w:tab w:val="num" w:pos="2880"/>
+        </w:tabs>
+        <w:ind w:left="2880" w:hanging="360"/>
+      </w:pPr>
+      <w:rPr>
+        <w:rFonts w:ascii="Wingdings" w:hAnsi="Wingdings" w:hint="default"/>
+        <w:sz w:val="20"/>
+      </w:rPr>
+    </w:lvl>
+    <w:lvl w:ilvl="4" w:tentative="1">
+      <w:start w:val="1"/>
+      <w:numFmt w:val="bullet"/>
+      <w:lvlText w:val=""/>
+      <w:lvlJc w:val="left"/>
+      <w:pPr>
+        <w:tabs>
+          <w:tab w:val="num" w:pos="3600"/>
+        </w:tabs>
+        <w:ind w:left="3600" w:hanging="360"/>
+      </w:pPr>
+      <w:rPr>
+        <w:rFonts w:ascii="Wingdings" w:hAnsi="Wingdings" w:hint="default"/>
+        <w:sz w:val="20"/>
+      </w:rPr>
+    </w:lvl>
+    <w:lvl w:ilvl="5" w:tentative="1">
+      <w:start w:val="1"/>
+      <w:numFmt w:val="bullet"/>
+      <w:lvlText w:val=""/>
+      <w:lvlJc w:val="left"/>
+      <w:pPr>
+        <w:tabs>
+          <w:tab w:val="num" w:pos="4320"/>
+        </w:tabs>
+        <w:ind w:left="4320" w:hanging="360"/>
+      </w:pPr>
+      <w:rPr>
+        <w:rFonts w:ascii="Wingdings" w:hAnsi="Wingdings" w:hint="default"/>
+        <w:sz w:val="20"/>
+      </w:rPr>
+    </w:lvl>
+    <w:lvl w:ilvl="6" w:tentative="1">
+      <w:start w:val="1"/>
+      <w:numFmt w:val="bullet"/>
+      <w:lvlText w:val=""/>
+      <w:lvlJc w:val="left"/>
+      <w:pPr>
+        <w:tabs>
+          <w:tab w:val="num" w:pos="5040"/>
+        </w:tabs>
+        <w:ind w:left="5040" w:hanging="360"/>
+      </w:pPr>
+      <w:rPr>
+        <w:rFonts w:ascii="Wingdings" w:hAnsi="Wingdings" w:hint="default"/>
+        <w:sz w:val="20"/>
+      </w:rPr>
+    </w:lvl>
+    <w:lvl w:ilvl="7" w:tentative="1">
+      <w:start w:val="1"/>
+      <w:numFmt w:val="bullet"/>
+      <w:lvlText w:val=""/>
+      <w:lvlJc w:val="left"/>
+      <w:pPr>
+        <w:tabs>
+          <w:tab w:val="num" w:pos="5760"/>
+        </w:tabs>
+        <w:ind w:left="5760" w:hanging="360"/>
+      </w:pPr>
+      <w:rPr>
+        <w:rFonts w:ascii="Wingdings" w:hAnsi="Wingdings" w:hint="default"/>
+        <w:sz w:val="20"/>
+      </w:rPr>
+    </w:lvl>
+    <w:lvl w:ilvl="8" w:tentative="1">
+      <w:start w:val="1"/>
+      <w:numFmt w:val="bullet"/>
+      <w:lvlText w:val=""/>
+      <w:lvlJc w:val="left"/>
+      <w:pPr>
+        <w:tabs>
+          <w:tab w:val="num" w:pos="6480"/>
+        </w:tabs>
+        <w:ind w:left="6480" w:hanging="360"/>
+      </w:pPr>
+      <w:rPr>
+        <w:rFonts w:ascii="Wingdings" w:hAnsi="Wingdings" w:hint="default"/>
+        <w:sz w:val="20"/>
+      </w:rPr>
+    </w:lvl>
+  </w:abstractNum>
+  <w:abstractNum w:abstractNumId="36" w15:restartNumberingAfterBreak="0">
     <w:nsid w:val="6C3E50EF"/>
     <w:multiLevelType w:val="multilevel"/>
     <w:tmpl w:val="415CD54A"/>
@@ -19676,7 +21269,7 @@
       </w:rPr>
     </w:lvl>
   </w:abstractNum>
-  <w:abstractNum w:abstractNumId="34" w15:restartNumberingAfterBreak="0">
+  <w:abstractNum w:abstractNumId="37" w15:restartNumberingAfterBreak="0">
     <w:nsid w:val="6CEE3E7D"/>
     <w:multiLevelType w:val="multilevel"/>
     <w:tmpl w:val="15ACB996"/>
@@ -19825,7 +21418,7 @@
       </w:rPr>
     </w:lvl>
   </w:abstractNum>
-  <w:abstractNum w:abstractNumId="35" w15:restartNumberingAfterBreak="0">
+  <w:abstractNum w:abstractNumId="38" w15:restartNumberingAfterBreak="0">
     <w:nsid w:val="6F612386"/>
     <w:multiLevelType w:val="multilevel"/>
     <w:tmpl w:val="FF38C946"/>
@@ -19974,7 +21567,7 @@
       </w:rPr>
     </w:lvl>
   </w:abstractNum>
-  <w:abstractNum w:abstractNumId="36" w15:restartNumberingAfterBreak="0">
+  <w:abstractNum w:abstractNumId="39" w15:restartNumberingAfterBreak="0">
     <w:nsid w:val="736F49DD"/>
     <w:multiLevelType w:val="multilevel"/>
     <w:tmpl w:val="E978319A"/>
@@ -20123,7 +21716,7 @@
       </w:rPr>
     </w:lvl>
   </w:abstractNum>
-  <w:abstractNum w:abstractNumId="37" w15:restartNumberingAfterBreak="0">
+  <w:abstractNum w:abstractNumId="40" w15:restartNumberingAfterBreak="0">
     <w:nsid w:val="753F5014"/>
     <w:multiLevelType w:val="multilevel"/>
     <w:tmpl w:val="ADCC06DE"/>
@@ -20272,7 +21865,7 @@
       </w:rPr>
     </w:lvl>
   </w:abstractNum>
-  <w:abstractNum w:abstractNumId="38" w15:restartNumberingAfterBreak="0">
+  <w:abstractNum w:abstractNumId="41" w15:restartNumberingAfterBreak="0">
     <w:nsid w:val="755D3721"/>
     <w:multiLevelType w:val="multilevel"/>
     <w:tmpl w:val="50E26368"/>
@@ -20421,7 +22014,7 @@
       </w:rPr>
     </w:lvl>
   </w:abstractNum>
-  <w:abstractNum w:abstractNumId="39" w15:restartNumberingAfterBreak="0">
+  <w:abstractNum w:abstractNumId="42" w15:restartNumberingAfterBreak="0">
     <w:nsid w:val="797A0739"/>
     <w:multiLevelType w:val="multilevel"/>
     <w:tmpl w:val="A600F5FE"/>
@@ -20570,7 +22163,7 @@
       </w:rPr>
     </w:lvl>
   </w:abstractNum>
-  <w:abstractNum w:abstractNumId="40" w15:restartNumberingAfterBreak="0">
+  <w:abstractNum w:abstractNumId="43" w15:restartNumberingAfterBreak="0">
     <w:nsid w:val="7C994BA9"/>
     <w:multiLevelType w:val="multilevel"/>
     <w:tmpl w:val="9BCC5EB0"/>
@@ -20719,7 +22312,7 @@
       </w:rPr>
     </w:lvl>
   </w:abstractNum>
-  <w:abstractNum w:abstractNumId="41" w15:restartNumberingAfterBreak="0">
+  <w:abstractNum w:abstractNumId="44" w15:restartNumberingAfterBreak="0">
     <w:nsid w:val="7E277970"/>
     <w:multiLevelType w:val="multilevel"/>
     <w:tmpl w:val="2E04C4B4"/>
@@ -20875,10 +22468,10 @@
     <w:abstractNumId w:val="17"/>
   </w:num>
   <w:num w:numId="3" w16cid:durableId="169410617">
-    <w:abstractNumId w:val="38"/>
+    <w:abstractNumId w:val="41"/>
   </w:num>
   <w:num w:numId="4" w16cid:durableId="1763992707">
-    <w:abstractNumId w:val="37"/>
+    <w:abstractNumId w:val="40"/>
   </w:num>
   <w:num w:numId="5" w16cid:durableId="796333125">
     <w:abstractNumId w:val="3"/>
@@ -20887,10 +22480,10 @@
     <w:abstractNumId w:val="13"/>
   </w:num>
   <w:num w:numId="7" w16cid:durableId="1552577469">
-    <w:abstractNumId w:val="23"/>
+    <w:abstractNumId w:val="24"/>
   </w:num>
   <w:num w:numId="8" w16cid:durableId="924656939">
-    <w:abstractNumId w:val="20"/>
+    <w:abstractNumId w:val="21"/>
   </w:num>
   <w:num w:numId="9" w16cid:durableId="424545816">
     <w:abstractNumId w:val="7"/>
@@ -20908,49 +22501,49 @@
     <w:abstractNumId w:val="14"/>
   </w:num>
   <w:num w:numId="14" w16cid:durableId="1248886714">
-    <w:abstractNumId w:val="30"/>
+    <w:abstractNumId w:val="31"/>
   </w:num>
   <w:num w:numId="15" w16cid:durableId="1472286876">
-    <w:abstractNumId w:val="26"/>
+    <w:abstractNumId w:val="27"/>
   </w:num>
   <w:num w:numId="16" w16cid:durableId="1857843534">
-    <w:abstractNumId w:val="40"/>
+    <w:abstractNumId w:val="43"/>
   </w:num>
   <w:num w:numId="17" w16cid:durableId="2143111938">
     <w:abstractNumId w:val="9"/>
   </w:num>
   <w:num w:numId="18" w16cid:durableId="1659918386">
-    <w:abstractNumId w:val="28"/>
+    <w:abstractNumId w:val="29"/>
   </w:num>
   <w:num w:numId="19" w16cid:durableId="121577458">
-    <w:abstractNumId w:val="33"/>
+    <w:abstractNumId w:val="36"/>
   </w:num>
   <w:num w:numId="20" w16cid:durableId="583997274">
-    <w:abstractNumId w:val="36"/>
+    <w:abstractNumId w:val="39"/>
   </w:num>
   <w:num w:numId="21" w16cid:durableId="1368990998">
-    <w:abstractNumId w:val="31"/>
+    <w:abstractNumId w:val="32"/>
   </w:num>
   <w:num w:numId="22" w16cid:durableId="383872113">
-    <w:abstractNumId w:val="24"/>
+    <w:abstractNumId w:val="25"/>
   </w:num>
   <w:num w:numId="23" w16cid:durableId="618537660">
-    <w:abstractNumId w:val="18"/>
+    <w:abstractNumId w:val="19"/>
   </w:num>
   <w:num w:numId="24" w16cid:durableId="206793581">
     <w:abstractNumId w:val="11"/>
   </w:num>
   <w:num w:numId="25" w16cid:durableId="432167381">
-    <w:abstractNumId w:val="35"/>
+    <w:abstractNumId w:val="38"/>
   </w:num>
   <w:num w:numId="26" w16cid:durableId="46298458">
     <w:abstractNumId w:val="12"/>
   </w:num>
   <w:num w:numId="27" w16cid:durableId="1548419807">
-    <w:abstractNumId w:val="39"/>
+    <w:abstractNumId w:val="42"/>
   </w:num>
   <w:num w:numId="28" w16cid:durableId="460533991">
-    <w:abstractNumId w:val="21"/>
+    <w:abstractNumId w:val="22"/>
   </w:num>
   <w:num w:numId="29" w16cid:durableId="1334147725">
     <w:abstractNumId w:val="1"/>
@@ -20959,40 +22552,49 @@
     <w:abstractNumId w:val="2"/>
   </w:num>
   <w:num w:numId="31" w16cid:durableId="1864978803">
-    <w:abstractNumId w:val="41"/>
+    <w:abstractNumId w:val="44"/>
   </w:num>
   <w:num w:numId="32" w16cid:durableId="1133524913">
-    <w:abstractNumId w:val="27"/>
+    <w:abstractNumId w:val="28"/>
   </w:num>
   <w:num w:numId="33" w16cid:durableId="672415094">
     <w:abstractNumId w:val="15"/>
   </w:num>
   <w:num w:numId="34" w16cid:durableId="1347100950">
-    <w:abstractNumId w:val="22"/>
+    <w:abstractNumId w:val="23"/>
   </w:num>
   <w:num w:numId="35" w16cid:durableId="1093284375">
     <w:abstractNumId w:val="10"/>
   </w:num>
   <w:num w:numId="36" w16cid:durableId="722220535">
-    <w:abstractNumId w:val="34"/>
+    <w:abstractNumId w:val="37"/>
   </w:num>
   <w:num w:numId="37" w16cid:durableId="1523206746">
     <w:abstractNumId w:val="8"/>
   </w:num>
   <w:num w:numId="38" w16cid:durableId="1141776810">
-    <w:abstractNumId w:val="25"/>
+    <w:abstractNumId w:val="26"/>
   </w:num>
   <w:num w:numId="39" w16cid:durableId="1593051066">
     <w:abstractNumId w:val="5"/>
   </w:num>
   <w:num w:numId="40" w16cid:durableId="1910144128">
-    <w:abstractNumId w:val="19"/>
+    <w:abstractNumId w:val="20"/>
   </w:num>
   <w:num w:numId="41" w16cid:durableId="1786727142">
-    <w:abstractNumId w:val="32"/>
+    <w:abstractNumId w:val="34"/>
   </w:num>
   <w:num w:numId="42" w16cid:durableId="516042199">
-    <w:abstractNumId w:val="29"/>
+    <w:abstractNumId w:val="30"/>
+  </w:num>
+  <w:num w:numId="43" w16cid:durableId="841159810">
+    <w:abstractNumId w:val="35"/>
+  </w:num>
+  <w:num w:numId="44" w16cid:durableId="2080054968">
+    <w:abstractNumId w:val="33"/>
+  </w:num>
+  <w:num w:numId="45" w16cid:durableId="2071347461">
+    <w:abstractNumId w:val="18"/>
   </w:num>
 </w:numbering>
 </file>

</xml_diff>